<commit_message>
feat: Integración de contexto MUSEMS-PU y expansión profunda en reportes de mayo 2026
</commit_message>
<xml_diff>
--- a/04-Abril-Mayo/Entregables/2026-05/02-Informe_Optimizacion_Rendimiento_BD_2026-05.docx
+++ b/04-Abril-Mayo/Entregables/2026-05/02-Informe_Optimizacion_Rendimiento_BD_2026-05.docx
@@ -13,7 +13,7 @@
         <w:rPr>
           <w:rFonts w:ascii="Calibri" w:eastAsia="Times New Roman" w:hAnsi="Calibri" w:cs="Calibri"/>
         </w:rPr>
-        <w:t>Informe de Optimización y Rendimiento de Bases de Datos</w:t>
+        <w:t>Informe Mensual de Optimización y Rendimiento de Bases de Datos</w:t>
       </w:r>
     </w:p>
     <w:p>
@@ -111,7 +111,7 @@
           <w:sz w:val="22"/>
           <w:szCs w:val="22"/>
         </w:rPr>
-        <w:pict>
+        <w:pict w14:anchorId="0673D827">
           <v:rect id="_x0000_i1025" style="width:0;height:1.5pt" o:hralign="center" o:hrstd="t" o:hr="t" fillcolor="#a0a0a0" stroked="f"/>
         </w:pict>
       </w:r>
@@ -145,7 +145,7 @@
           <w:sz w:val="22"/>
           <w:szCs w:val="22"/>
         </w:rPr>
-        <w:t xml:space="preserve">Detallar las estrategias, scripts y mejores prácticas aplicadas durante el mes de mayo sobre las arquitecturas de bases de datos del ecosistema de la Secretaría (incluyendo los repositorios y esquemas gestionados en </w:t>
+        <w:t>Presentar el avance mensual correspondiente a mayo de 2026 sobre las estrategias, auditorías, scripts y mejores prácticas aplicadas sobre las arquitecturas de bases de datos del ecosistema de la Secretaría. Este informe documenta los cambios estructurales e instrumentación real aplicados tanto en los repositorios institucionales en Oracle 19c (</w:t>
       </w:r>
       <w:r>
         <w:rPr>
@@ -159,7 +159,7 @@
           <w:sz w:val="22"/>
           <w:szCs w:val="22"/>
         </w:rPr>
-        <w:t xml:space="preserve"> con Oracle 19c, así como la persistencia en PostgreSQL de Vida Saludable). Se prioriza la mitigación de cuellos de botella mediante instrumentación real.</w:t>
+        <w:t>) como en el ecosistema modernizado de la Fase 2 del proyecto Vida Saludable en PostgreSQL 14.</w:t>
       </w:r>
     </w:p>
     <w:p>
@@ -173,7 +173,7 @@
         <w:rPr>
           <w:rFonts w:ascii="Calibri" w:eastAsia="Times New Roman" w:hAnsi="Calibri" w:cs="Calibri"/>
         </w:rPr>
-        <w:t>2. Estandarización de Mejores Prácticas en Oracle (MUSEMS-PU)</w:t>
+        <w:t>2. Alcance del Avance de Mayo</w:t>
       </w:r>
     </w:p>
     <w:p>
@@ -191,49 +191,25 @@
           <w:sz w:val="22"/>
           <w:szCs w:val="22"/>
         </w:rPr>
-        <w:t xml:space="preserve">Durante mayo, la consolidación de los scripts analíticos de </w:t>
-      </w:r>
-      <w:r>
-        <w:rPr>
-          <w:rStyle w:val="CdigoHTML"/>
-        </w:rPr>
-        <w:t>SEP_MUSEMS_PU</w:t>
-      </w:r>
-      <w:r>
-        <w:rPr>
-          <w:rFonts w:ascii="Calibri" w:hAnsi="Calibri" w:cs="Calibri"/>
-          <w:sz w:val="22"/>
-          <w:szCs w:val="22"/>
-        </w:rPr>
-        <w:t xml:space="preserve"> condujo a la definición formal de una guía de mejores prácticas (</w:t>
-      </w:r>
-      <w:r>
-        <w:rPr>
-          <w:rStyle w:val="CdigoHTML"/>
-        </w:rPr>
-        <w:t>BEST_PRACTICES_DB_SCRIPTS.md</w:t>
-      </w:r>
-      <w:r>
-        <w:rPr>
-          <w:rFonts w:ascii="Calibri" w:hAnsi="Calibri" w:cs="Calibri"/>
-          <w:sz w:val="22"/>
-          <w:szCs w:val="22"/>
-        </w:rPr>
-        <w:t>), que estandarizó la ejecución en ambientes DBeaver/Oracle:</w:t>
-      </w:r>
-    </w:p>
-    <w:p>
-      <w:pPr>
-        <w:pStyle w:val="Ttulo3"/>
-        <w:rPr>
-          <w:rFonts w:ascii="Calibri" w:eastAsia="Times New Roman" w:hAnsi="Calibri" w:cs="Calibri"/>
-        </w:rPr>
-      </w:pPr>
-      <w:r>
-        <w:rPr>
-          <w:rFonts w:ascii="Calibri" w:eastAsia="Times New Roman" w:hAnsi="Calibri" w:cs="Calibri"/>
-        </w:rPr>
-        <w:t>2.1 Reglas de Compatibilidad y Enmascaramiento (PII)</w:t>
+        <w:t>A diferencia de abril, donde se estableció la línea base teórica de rendimiento, durante mayo se ejecutaron validaciones y correcciones directamente sobre los entornos de desarrollo bajo condiciones de carga masiva real (por ejemplo, validaciones de *layouts* con más de 128,112 registros).</w:t>
+      </w:r>
+    </w:p>
+    <w:p>
+      <w:pPr>
+        <w:pStyle w:val="NormalWeb"/>
+        <w:rPr>
+          <w:rFonts w:ascii="Calibri" w:hAnsi="Calibri" w:cs="Calibri"/>
+          <w:sz w:val="22"/>
+          <w:szCs w:val="22"/>
+        </w:rPr>
+      </w:pPr>
+      <w:r>
+        <w:rPr>
+          <w:rFonts w:ascii="Calibri" w:hAnsi="Calibri" w:cs="Calibri"/>
+          <w:sz w:val="22"/>
+          <w:szCs w:val="22"/>
+        </w:rPr>
+        <w:t>El alcance de este mes incluyó:</w:t>
       </w:r>
     </w:p>
     <w:p>
@@ -255,21 +231,7 @@
           <w:sz w:val="22"/>
           <w:szCs w:val="22"/>
         </w:rPr>
-        <w:t xml:space="preserve">Se prohibió el uso de comandos </w:t>
-      </w:r>
-      <w:r>
-        <w:rPr>
-          <w:rStyle w:val="CdigoHTML"/>
-        </w:rPr>
-        <w:t>SET SERVEROUTPUT ON</w:t>
-      </w:r>
-      <w:r>
-        <w:rPr>
-          <w:rFonts w:ascii="Calibri" w:eastAsia="Times New Roman" w:hAnsi="Calibri" w:cs="Calibri"/>
-          <w:sz w:val="22"/>
-          <w:szCs w:val="22"/>
-        </w:rPr>
-        <w:t xml:space="preserve"> que rompían la ejecución remota de scripts en DBeaver.</w:t>
+        <w:t>La instrumentación de métricas de desempeño sobre consultas de extracción críticas.</w:t>
       </w:r>
     </w:p>
     <w:p>
@@ -287,76 +249,129 @@
       </w:pPr>
       <w:r>
         <w:rPr>
-          <w:rStyle w:val="Fuerte"/>
-          <w:rFonts w:ascii="Calibri" w:eastAsia="Times New Roman" w:hAnsi="Calibri" w:cs="Calibri"/>
-          <w:sz w:val="22"/>
-          <w:szCs w:val="22"/>
-        </w:rPr>
-        <w:t>Enmascaramiento Criptográfico (PII):</w:t>
-      </w:r>
-      <w:r>
-        <w:rPr>
-          <w:rFonts w:ascii="Calibri" w:eastAsia="Times New Roman" w:hAnsi="Calibri" w:cs="Calibri"/>
-          <w:sz w:val="22"/>
-          <w:szCs w:val="22"/>
-        </w:rPr>
-        <w:t xml:space="preserve"> Se instrumentó una regla obligatoria e irrevocable para todo campo de identidad (como CURP). Se implementó el uso del estándar </w:t>
+          <w:rFonts w:ascii="Calibri" w:eastAsia="Times New Roman" w:hAnsi="Calibri" w:cs="Calibri"/>
+          <w:sz w:val="22"/>
+          <w:szCs w:val="22"/>
+        </w:rPr>
+        <w:t>El hallazgo y remediación de vulnerabilidades relacionadas con consultas de base de datos (inyecciones SQL y exposición de datos PII).</w:t>
+      </w:r>
+    </w:p>
+    <w:p>
+      <w:pPr>
+        <w:numPr>
+          <w:ilvl w:val="0"/>
+          <w:numId w:val="1"/>
+        </w:numPr>
+        <w:spacing w:before="100" w:beforeAutospacing="1" w:after="100" w:afterAutospacing="1"/>
+        <w:rPr>
+          <w:rFonts w:ascii="Calibri" w:eastAsia="Times New Roman" w:hAnsi="Calibri" w:cs="Calibri"/>
+          <w:sz w:val="22"/>
+          <w:szCs w:val="22"/>
+        </w:rPr>
+      </w:pPr>
+      <w:r>
+        <w:rPr>
+          <w:rFonts w:ascii="Calibri" w:eastAsia="Times New Roman" w:hAnsi="Calibri" w:cs="Calibri"/>
+          <w:sz w:val="22"/>
+          <w:szCs w:val="22"/>
+        </w:rPr>
+        <w:t>La identificación de cuellos de botella por ausencia de índices en bitácoras de alto volumen.</w:t>
+      </w:r>
+    </w:p>
+    <w:p>
+      <w:pPr>
+        <w:numPr>
+          <w:ilvl w:val="0"/>
+          <w:numId w:val="1"/>
+        </w:numPr>
+        <w:spacing w:before="100" w:beforeAutospacing="1" w:after="100" w:afterAutospacing="1"/>
+        <w:rPr>
+          <w:rFonts w:ascii="Calibri" w:eastAsia="Times New Roman" w:hAnsi="Calibri" w:cs="Calibri"/>
+          <w:sz w:val="22"/>
+          <w:szCs w:val="22"/>
+        </w:rPr>
+      </w:pPr>
+      <w:r>
+        <w:rPr>
+          <w:rFonts w:ascii="Calibri" w:eastAsia="Times New Roman" w:hAnsi="Calibri" w:cs="Calibri"/>
+          <w:sz w:val="22"/>
+          <w:szCs w:val="22"/>
+        </w:rPr>
+        <w:t xml:space="preserve">La estandarización de scripts en el repositorio Oracle </w:t>
       </w:r>
       <w:r>
         <w:rPr>
           <w:rStyle w:val="CdigoHTML"/>
         </w:rPr>
-        <w:t>LOWER(RAWTOHEX(STANDARD_HASH(P.CURP || 'MUSEMS_SALT_2026', 'MD5')))</w:t>
-      </w:r>
-      <w:r>
-        <w:rPr>
-          <w:rFonts w:ascii="Calibri" w:eastAsia="Times New Roman" w:hAnsi="Calibri" w:cs="Calibri"/>
-          <w:sz w:val="22"/>
-          <w:szCs w:val="22"/>
-        </w:rPr>
-        <w:t xml:space="preserve"> en lugar de ofuscaciones parciales (</w:t>
+        <w:t>SEP_MUSEMS_PU</w:t>
+      </w:r>
+      <w:r>
+        <w:rPr>
+          <w:rFonts w:ascii="Calibri" w:eastAsia="Times New Roman" w:hAnsi="Calibri" w:cs="Calibri"/>
+          <w:sz w:val="22"/>
+          <w:szCs w:val="22"/>
+        </w:rPr>
+        <w:t xml:space="preserve"> para garantizar ejecuciones sin bloqueos (deadlocks) e integridad de datos personales.</w:t>
+      </w:r>
+    </w:p>
+    <w:p>
+      <w:pPr>
+        <w:pStyle w:val="Ttulo2"/>
+        <w:rPr>
+          <w:rFonts w:ascii="Calibri" w:eastAsia="Times New Roman" w:hAnsi="Calibri" w:cs="Calibri"/>
+        </w:rPr>
+      </w:pPr>
+      <w:r>
+        <w:rPr>
+          <w:rFonts w:ascii="Calibri" w:eastAsia="Times New Roman" w:hAnsi="Calibri" w:cs="Calibri"/>
+        </w:rPr>
+        <w:t>3. Estandarización de Mejores Prácticas en Oracle (MUSEMS-PU)</w:t>
+      </w:r>
+    </w:p>
+    <w:p>
+      <w:pPr>
+        <w:pStyle w:val="NormalWeb"/>
+        <w:rPr>
+          <w:rFonts w:ascii="Calibri" w:hAnsi="Calibri" w:cs="Calibri"/>
+          <w:sz w:val="22"/>
+          <w:szCs w:val="22"/>
+        </w:rPr>
+      </w:pPr>
+      <w:r>
+        <w:rPr>
+          <w:rFonts w:ascii="Calibri" w:hAnsi="Calibri" w:cs="Calibri"/>
+          <w:sz w:val="22"/>
+          <w:szCs w:val="22"/>
+        </w:rPr>
+        <w:t xml:space="preserve">Durante mayo, la consolidación de los scripts analíticos de </w:t>
       </w:r>
       <w:r>
         <w:rPr>
           <w:rStyle w:val="CdigoHTML"/>
         </w:rPr>
-        <w:t>SUBSTR</w:t>
-      </w:r>
-      <w:r>
-        <w:rPr>
-          <w:rFonts w:ascii="Calibri" w:eastAsia="Times New Roman" w:hAnsi="Calibri" w:cs="Calibri"/>
-          <w:sz w:val="22"/>
-          <w:szCs w:val="22"/>
-        </w:rPr>
-        <w:t>/</w:t>
+        <w:t>SEP_MUSEMS_PU</w:t>
+      </w:r>
+      <w:r>
+        <w:rPr>
+          <w:rFonts w:ascii="Calibri" w:hAnsi="Calibri" w:cs="Calibri"/>
+          <w:sz w:val="22"/>
+          <w:szCs w:val="22"/>
+        </w:rPr>
+        <w:t xml:space="preserve"> condujo a la definición formal de una guía de mejores prácticas (</w:t>
       </w:r>
       <w:r>
         <w:rPr>
           <w:rStyle w:val="CdigoHTML"/>
         </w:rPr>
-        <w:t>LPAD</w:t>
-      </w:r>
-      <w:r>
-        <w:rPr>
-          <w:rFonts w:ascii="Calibri" w:eastAsia="Times New Roman" w:hAnsi="Calibri" w:cs="Calibri"/>
-          <w:sz w:val="22"/>
-          <w:szCs w:val="22"/>
-        </w:rPr>
-        <w:t>), lo cual impactó profundamente la manera en que se generaron las vistas analíticas (</w:t>
-      </w:r>
-      <w:r>
-        <w:rPr>
-          <w:rStyle w:val="CdigoHTML"/>
-        </w:rPr>
-        <w:t>VW_BI_*</w:t>
-      </w:r>
-      <w:r>
-        <w:rPr>
-          <w:rFonts w:ascii="Calibri" w:eastAsia="Times New Roman" w:hAnsi="Calibri" w:cs="Calibri"/>
-          <w:sz w:val="22"/>
-          <w:szCs w:val="22"/>
-        </w:rPr>
-        <w:t>).</w:t>
+        <w:t>BEST_PRACTICES_DB_SCRIPTS.md</w:t>
+      </w:r>
+      <w:r>
+        <w:rPr>
+          <w:rFonts w:ascii="Calibri" w:hAnsi="Calibri" w:cs="Calibri"/>
+          <w:sz w:val="22"/>
+          <w:szCs w:val="22"/>
+        </w:rPr>
+        <w:t>), que estandarizó la ejecución transaccional en ambientes IDE como DBeaver:</w:t>
       </w:r>
     </w:p>
     <w:p>
@@ -370,184 +385,8 @@
         <w:rPr>
           <w:rFonts w:ascii="Calibri" w:eastAsia="Times New Roman" w:hAnsi="Calibri" w:cs="Calibri"/>
         </w:rPr>
-        <w:t>2.2 Orden de Limpieza y Eliminación de Bloqueos (Deadlocks)</w:t>
-      </w:r>
-    </w:p>
-    <w:p>
-      <w:pPr>
-        <w:pStyle w:val="NormalWeb"/>
-        <w:rPr>
-          <w:rFonts w:ascii="Calibri" w:hAnsi="Calibri" w:cs="Calibri"/>
-          <w:sz w:val="22"/>
-          <w:szCs w:val="22"/>
-        </w:rPr>
-      </w:pPr>
-      <w:r>
-        <w:rPr>
-          <w:rFonts w:ascii="Calibri" w:hAnsi="Calibri" w:cs="Calibri"/>
-          <w:sz w:val="22"/>
-          <w:szCs w:val="22"/>
-        </w:rPr>
-        <w:t xml:space="preserve">Para la ejecución ininterrumpida de scripts transaccionales como </w:t>
-      </w:r>
-      <w:r>
-        <w:rPr>
-          <w:rStyle w:val="CdigoHTML"/>
-        </w:rPr>
-        <w:t>simulation_ultra.sql</w:t>
-      </w:r>
-      <w:r>
-        <w:rPr>
-          <w:rFonts w:ascii="Calibri" w:hAnsi="Calibri" w:cs="Calibri"/>
-          <w:sz w:val="22"/>
-          <w:szCs w:val="22"/>
-        </w:rPr>
-        <w:t xml:space="preserve">, se formalizó el árbol de dependencias, reduciendo en un 100% los bloqueos por llaves foráneas al seguir el flujo de borrado estricto: </w:t>
-      </w:r>
-      <w:r>
-        <w:rPr>
-          <w:rStyle w:val="CdigoHTML"/>
-        </w:rPr>
-        <w:t>TBAE010_ERROR</w:t>
-      </w:r>
-      <w:r>
-        <w:rPr>
-          <w:rFonts w:ascii="Calibri" w:hAnsi="Calibri" w:cs="Calibri"/>
-          <w:sz w:val="22"/>
-          <w:szCs w:val="22"/>
-        </w:rPr>
-        <w:t xml:space="preserve"> -&gt; </w:t>
-      </w:r>
-      <w:r>
-        <w:rPr>
-          <w:rStyle w:val="CdigoHTML"/>
-        </w:rPr>
-        <w:t>TBAE009_RESPUESTA</w:t>
-      </w:r>
-      <w:r>
-        <w:rPr>
-          <w:rFonts w:ascii="Calibri" w:hAnsi="Calibri" w:cs="Calibri"/>
-          <w:sz w:val="22"/>
-          <w:szCs w:val="22"/>
-        </w:rPr>
-        <w:t xml:space="preserve"> -&gt; </w:t>
-      </w:r>
-      <w:r>
-        <w:rPr>
-          <w:rStyle w:val="CdigoHTML"/>
-        </w:rPr>
-        <w:t>TBMU013_BAJAS</w:t>
-      </w:r>
-      <w:r>
-        <w:rPr>
-          <w:rFonts w:ascii="Calibri" w:hAnsi="Calibri" w:cs="Calibri"/>
-          <w:sz w:val="22"/>
-          <w:szCs w:val="22"/>
-        </w:rPr>
-        <w:t xml:space="preserve"> -&gt; </w:t>
-      </w:r>
-      <w:r>
-        <w:rPr>
-          <w:rStyle w:val="CdigoHTML"/>
-        </w:rPr>
-        <w:t>TBMU006_INSCRIPCION</w:t>
-      </w:r>
-      <w:r>
-        <w:rPr>
-          <w:rFonts w:ascii="Calibri" w:hAnsi="Calibri" w:cs="Calibri"/>
-          <w:sz w:val="22"/>
-          <w:szCs w:val="22"/>
-        </w:rPr>
-        <w:t xml:space="preserve"> -&gt; </w:t>
-      </w:r>
-      <w:r>
-        <w:rPr>
-          <w:rStyle w:val="CdigoHTML"/>
-        </w:rPr>
-        <w:t>TBAE001_INSCRIPCION</w:t>
-      </w:r>
-      <w:r>
-        <w:rPr>
-          <w:rFonts w:ascii="Calibri" w:hAnsi="Calibri" w:cs="Calibri"/>
-          <w:sz w:val="22"/>
-          <w:szCs w:val="22"/>
-        </w:rPr>
-        <w:t xml:space="preserve"> -&gt; </w:t>
-      </w:r>
-      <w:r>
-        <w:rPr>
-          <w:rStyle w:val="CdigoHTML"/>
-        </w:rPr>
-        <w:t>TBMU020_ALUMNO</w:t>
-      </w:r>
-      <w:r>
-        <w:rPr>
-          <w:rFonts w:ascii="Calibri" w:hAnsi="Calibri" w:cs="Calibri"/>
-          <w:sz w:val="22"/>
-          <w:szCs w:val="22"/>
-        </w:rPr>
-        <w:t xml:space="preserve"> -&gt; </w:t>
-      </w:r>
-      <w:r>
-        <w:rPr>
-          <w:rStyle w:val="CdigoHTML"/>
-        </w:rPr>
-        <w:t>TBMU002_PERSONA</w:t>
-      </w:r>
-      <w:r>
-        <w:rPr>
-          <w:rFonts w:ascii="Calibri" w:hAnsi="Calibri" w:cs="Calibri"/>
-          <w:sz w:val="22"/>
-          <w:szCs w:val="22"/>
-        </w:rPr>
-        <w:t>.</w:t>
-      </w:r>
-    </w:p>
-    <w:p>
-      <w:pPr>
-        <w:pStyle w:val="Ttulo2"/>
-        <w:rPr>
-          <w:rFonts w:ascii="Calibri" w:eastAsia="Times New Roman" w:hAnsi="Calibri" w:cs="Calibri"/>
-        </w:rPr>
-      </w:pPr>
-      <w:r>
-        <w:rPr>
-          <w:rFonts w:ascii="Calibri" w:eastAsia="Times New Roman" w:hAnsi="Calibri" w:cs="Calibri"/>
-        </w:rPr>
         <w:lastRenderedPageBreak/>
-        <w:t>3. Optimización Transaccional en PostgreSQL (Vida Saludable)</w:t>
-      </w:r>
-    </w:p>
-    <w:p>
-      <w:pPr>
-        <w:pStyle w:val="NormalWeb"/>
-        <w:rPr>
-          <w:rFonts w:ascii="Calibri" w:hAnsi="Calibri" w:cs="Calibri"/>
-          <w:sz w:val="22"/>
-          <w:szCs w:val="22"/>
-        </w:rPr>
-      </w:pPr>
-      <w:r>
-        <w:rPr>
-          <w:rFonts w:ascii="Calibri" w:hAnsi="Calibri" w:cs="Calibri"/>
-          <w:sz w:val="22"/>
-          <w:szCs w:val="22"/>
-        </w:rPr>
-        <w:t>De forma paralela en el proyecto Vida Saludable, se evaluó el comportamiento de la base de datos DEV frente al procesamiento concurrente masivo de archivos de layouts (más de 128 mil registros en validación).</w:t>
-      </w:r>
-    </w:p>
-    <w:p>
-      <w:pPr>
-        <w:pStyle w:val="Ttulo3"/>
-        <w:rPr>
-          <w:rFonts w:ascii="Calibri" w:eastAsia="Times New Roman" w:hAnsi="Calibri" w:cs="Calibri"/>
-        </w:rPr>
-      </w:pPr>
-      <w:r>
-        <w:rPr>
-          <w:rFonts w:ascii="Calibri" w:eastAsia="Times New Roman" w:hAnsi="Calibri" w:cs="Calibri"/>
-        </w:rPr>
-        <w:t>3.1 Diseño de Índices Compuestos</w:t>
+        <w:t>3.1 Reglas de Compatibilidad y Enmascaramiento de Datos Sensibles (PII)</w:t>
       </w:r>
     </w:p>
     <w:p>
@@ -565,62 +404,62 @@
       </w:pPr>
       <w:r>
         <w:rPr>
+          <w:rStyle w:val="Fuerte"/>
+          <w:rFonts w:ascii="Calibri" w:eastAsia="Times New Roman" w:hAnsi="Calibri" w:cs="Calibri"/>
+          <w:sz w:val="22"/>
+          <w:szCs w:val="22"/>
+        </w:rPr>
+        <w:t>Compatibilidad IDE (DBeaver):</w:t>
+      </w:r>
+      <w:r>
+        <w:rPr>
+          <w:rFonts w:ascii="Calibri" w:eastAsia="Times New Roman" w:hAnsi="Calibri" w:cs="Calibri"/>
+          <w:sz w:val="22"/>
+          <w:szCs w:val="22"/>
+        </w:rPr>
+        <w:t xml:space="preserve"> Se prohibió el uso de comandos </w:t>
+      </w:r>
+      <w:r>
+        <w:rPr>
           <w:rStyle w:val="CdigoHTML"/>
-          <w:b/>
-          <w:bCs/>
-        </w:rPr>
-        <w:t>idx_menor_evaluado_cct_curp_ciclo</w:t>
-      </w:r>
-      <w:r>
-        <w:rPr>
-          <w:rStyle w:val="Fuerte"/>
-          <w:rFonts w:ascii="Calibri" w:eastAsia="Times New Roman" w:hAnsi="Calibri" w:cs="Calibri"/>
-          <w:sz w:val="22"/>
-          <w:szCs w:val="22"/>
-        </w:rPr>
-        <w:t>:</w:t>
-      </w:r>
-      <w:r>
-        <w:rPr>
-          <w:rFonts w:ascii="Calibri" w:eastAsia="Times New Roman" w:hAnsi="Calibri" w:cs="Calibri"/>
-          <w:sz w:val="22"/>
-          <w:szCs w:val="22"/>
-        </w:rPr>
-        <w:t xml:space="preserve"> Este índice compuesto en la tabla principal redujo dramáticamente el tiempo de las consultas de extracción utilizadas por el orquestador. El tiempo promedio de extracción por bloque de 5,000 registros pasó de </w:t>
-      </w:r>
-      <w:r>
-        <w:rPr>
-          <w:rStyle w:val="Fuerte"/>
-          <w:rFonts w:ascii="Calibri" w:eastAsia="Times New Roman" w:hAnsi="Calibri" w:cs="Calibri"/>
-          <w:sz w:val="22"/>
-          <w:szCs w:val="22"/>
-        </w:rPr>
-        <w:t>3.20 segundos</w:t>
-      </w:r>
-      <w:r>
-        <w:rPr>
-          <w:rFonts w:ascii="Calibri" w:eastAsia="Times New Roman" w:hAnsi="Calibri" w:cs="Calibri"/>
-          <w:sz w:val="22"/>
-          <w:szCs w:val="22"/>
-        </w:rPr>
-        <w:t xml:space="preserve"> en abril a </w:t>
-      </w:r>
-      <w:r>
-        <w:rPr>
-          <w:rStyle w:val="Fuerte"/>
-          <w:rFonts w:ascii="Calibri" w:eastAsia="Times New Roman" w:hAnsi="Calibri" w:cs="Calibri"/>
-          <w:sz w:val="22"/>
-          <w:szCs w:val="22"/>
-        </w:rPr>
-        <w:t>0.18 segundos</w:t>
-      </w:r>
-      <w:r>
-        <w:rPr>
-          <w:rFonts w:ascii="Calibri" w:eastAsia="Times New Roman" w:hAnsi="Calibri" w:cs="Calibri"/>
-          <w:sz w:val="22"/>
-          <w:szCs w:val="22"/>
-        </w:rPr>
-        <w:t xml:space="preserve"> en mayo (una mejora del 94.3%).</w:t>
+        </w:rPr>
+        <w:t>SET SERVEROUTPUT ON</w:t>
+      </w:r>
+      <w:r>
+        <w:rPr>
+          <w:rFonts w:ascii="Calibri" w:eastAsia="Times New Roman" w:hAnsi="Calibri" w:cs="Calibri"/>
+          <w:sz w:val="22"/>
+          <w:szCs w:val="22"/>
+        </w:rPr>
+        <w:t xml:space="preserve"> y </w:t>
+      </w:r>
+      <w:r>
+        <w:rPr>
+          <w:rStyle w:val="CdigoHTML"/>
+        </w:rPr>
+        <w:t>SET DEFINE OFF</w:t>
+      </w:r>
+      <w:r>
+        <w:rPr>
+          <w:rFonts w:ascii="Calibri" w:eastAsia="Times New Roman" w:hAnsi="Calibri" w:cs="Calibri"/>
+          <w:sz w:val="22"/>
+          <w:szCs w:val="22"/>
+        </w:rPr>
+        <w:t>, los cuales interrumpían la ejecución remota de scripts prolongados. Asimismo, se estableció que los bloques PL/SQL ejecutados con *Alt+X* no deben incluir la barra diagonal (</w:t>
+      </w:r>
+      <w:r>
+        <w:rPr>
+          <w:rStyle w:val="CdigoHTML"/>
+        </w:rPr>
+        <w:t>/</w:t>
+      </w:r>
+      <w:r>
+        <w:rPr>
+          <w:rFonts w:ascii="Calibri" w:eastAsia="Times New Roman" w:hAnsi="Calibri" w:cs="Calibri"/>
+          <w:sz w:val="22"/>
+          <w:szCs w:val="22"/>
+        </w:rPr>
+        <w:t>) al final del archivo.</w:t>
       </w:r>
     </w:p>
     <w:p>
@@ -638,12 +477,77 @@
       </w:pPr>
       <w:r>
         <w:rPr>
+          <w:rStyle w:val="Fuerte"/>
+          <w:rFonts w:ascii="Calibri" w:eastAsia="Times New Roman" w:hAnsi="Calibri" w:cs="Calibri"/>
+          <w:sz w:val="22"/>
+          <w:szCs w:val="22"/>
+        </w:rPr>
+        <w:t>Integridad de Catálogos (Staging):</w:t>
+      </w:r>
+      <w:r>
+        <w:rPr>
+          <w:rFonts w:ascii="Calibri" w:eastAsia="Times New Roman" w:hAnsi="Calibri" w:cs="Calibri"/>
+          <w:sz w:val="22"/>
+          <w:szCs w:val="22"/>
+        </w:rPr>
+        <w:t xml:space="preserve"> Los scripts deben ignorar los archivos DDL estáticos y basarse en las tablas reales de </w:t>
+      </w:r>
+      <w:r>
+        <w:rPr>
           <w:rStyle w:val="CdigoHTML"/>
-          <w:b/>
-          <w:bCs/>
-        </w:rPr>
-        <w:t>idx_curp_procesada_lote_estado</w:t>
-      </w:r>
+        </w:rPr>
+        <w:t>simulation_ultra.sql</w:t>
+      </w:r>
+      <w:r>
+        <w:rPr>
+          <w:rFonts w:ascii="Calibri" w:eastAsia="Times New Roman" w:hAnsi="Calibri" w:cs="Calibri"/>
+          <w:sz w:val="22"/>
+          <w:szCs w:val="22"/>
+        </w:rPr>
+        <w:t xml:space="preserve"> y </w:t>
+      </w:r>
+      <w:r>
+        <w:rPr>
+          <w:rStyle w:val="CdigoHTML"/>
+        </w:rPr>
+        <w:t>test_diagnostico.sql</w:t>
+      </w:r>
+      <w:r>
+        <w:rPr>
+          <w:rFonts w:ascii="Calibri" w:eastAsia="Times New Roman" w:hAnsi="Calibri" w:cs="Calibri"/>
+          <w:sz w:val="22"/>
+          <w:szCs w:val="22"/>
+        </w:rPr>
+        <w:t>. Se prohibió poblar catálogos (</w:t>
+      </w:r>
+      <w:r>
+        <w:rPr>
+          <w:rStyle w:val="CdigoHTML"/>
+        </w:rPr>
+        <w:t>CTMU*</w:t>
+      </w:r>
+      <w:r>
+        <w:rPr>
+          <w:rFonts w:ascii="Calibri" w:eastAsia="Times New Roman" w:hAnsi="Calibri" w:cs="Calibri"/>
+          <w:sz w:val="22"/>
+          <w:szCs w:val="22"/>
+        </w:rPr>
+        <w:t>) o tablas maestras de programas; se deben usar los IDs reales ya existentes en la BD.</w:t>
+      </w:r>
+    </w:p>
+    <w:p>
+      <w:pPr>
+        <w:numPr>
+          <w:ilvl w:val="0"/>
+          <w:numId w:val="2"/>
+        </w:numPr>
+        <w:spacing w:before="100" w:beforeAutospacing="1" w:after="100" w:afterAutospacing="1"/>
+        <w:rPr>
+          <w:rFonts w:ascii="Calibri" w:eastAsia="Times New Roman" w:hAnsi="Calibri" w:cs="Calibri"/>
+          <w:sz w:val="22"/>
+          <w:szCs w:val="22"/>
+        </w:rPr>
+      </w:pPr>
       <w:r>
         <w:rPr>
           <w:rStyle w:val="Fuerte"/>
@@ -651,37 +555,143 @@
           <w:sz w:val="22"/>
           <w:szCs w:val="22"/>
         </w:rPr>
-        <w:t>:</w:t>
-      </w:r>
-      <w:r>
-        <w:rPr>
-          <w:rFonts w:ascii="Calibri" w:eastAsia="Times New Roman" w:hAnsi="Calibri" w:cs="Calibri"/>
-          <w:sz w:val="22"/>
-          <w:szCs w:val="22"/>
-        </w:rPr>
-        <w:t xml:space="preserve"> Generado especí</w:t>
-      </w:r>
-      <w:r>
-        <w:rPr>
-          <w:rFonts w:ascii="Calibri" w:eastAsia="Times New Roman" w:hAnsi="Calibri" w:cs="Calibri"/>
-          <w:sz w:val="22"/>
-          <w:szCs w:val="22"/>
-        </w:rPr>
-        <w:t xml:space="preserve">ficamente para solventar latencias observadas al ejecutar las consultas de contingencia mediante el script </w:t>
+        <w:t>Enmascaramiento Criptográfico (PII):</w:t>
+      </w:r>
+      <w:r>
+        <w:rPr>
+          <w:rFonts w:ascii="Calibri" w:eastAsia="Times New Roman" w:hAnsi="Calibri" w:cs="Calibri"/>
+          <w:sz w:val="22"/>
+          <w:szCs w:val="22"/>
+        </w:rPr>
+        <w:t xml:space="preserve"> Para cumplir con la LGPDPPSO en la generación de vistas analíticas (</w:t>
       </w:r>
       <w:r>
         <w:rPr>
           <w:rStyle w:val="CdigoHTML"/>
         </w:rPr>
-        <w:t>run_reproceso.py</w:t>
-      </w:r>
-      <w:r>
-        <w:rPr>
-          <w:rFonts w:ascii="Calibri" w:eastAsia="Times New Roman" w:hAnsi="Calibri" w:cs="Calibri"/>
-          <w:sz w:val="22"/>
-          <w:szCs w:val="22"/>
-        </w:rPr>
-        <w:t>.</w:t>
+        <w:t>VW_BI_*</w:t>
+      </w:r>
+      <w:r>
+        <w:rPr>
+          <w:rFonts w:ascii="Calibri" w:eastAsia="Times New Roman" w:hAnsi="Calibri" w:cs="Calibri"/>
+          <w:sz w:val="22"/>
+          <w:szCs w:val="22"/>
+        </w:rPr>
+        <w:t xml:space="preserve">), se instrumentó una regla obligatoria e irrevocable para todo campo de identidad (como CURP). Se implementó el uso del estándar </w:t>
+      </w:r>
+      <w:r>
+        <w:rPr>
+          <w:rStyle w:val="CdigoHTML"/>
+        </w:rPr>
+        <w:t>LOWER(RAWTOHEX(STANDARD_HASH(P.CURP || 'MUSEMS_SALT_2026', 'MD5')))</w:t>
+      </w:r>
+      <w:r>
+        <w:rPr>
+          <w:rFonts w:ascii="Calibri" w:eastAsia="Times New Roman" w:hAnsi="Calibri" w:cs="Calibri"/>
+          <w:sz w:val="22"/>
+          <w:szCs w:val="22"/>
+        </w:rPr>
+        <w:t xml:space="preserve"> en lugar de ofuscaciones parciales basadas en </w:t>
+      </w:r>
+      <w:r>
+        <w:rPr>
+          <w:rStyle w:val="CdigoHTML"/>
+        </w:rPr>
+        <w:t>SUBSTR</w:t>
+      </w:r>
+      <w:r>
+        <w:rPr>
+          <w:rFonts w:ascii="Calibri" w:eastAsia="Times New Roman" w:hAnsi="Calibri" w:cs="Calibri"/>
+          <w:sz w:val="22"/>
+          <w:szCs w:val="22"/>
+        </w:rPr>
+        <w:t xml:space="preserve"> o </w:t>
+      </w:r>
+      <w:r>
+        <w:rPr>
+          <w:rStyle w:val="CdigoHTML"/>
+        </w:rPr>
+        <w:t>LPAD</w:t>
+      </w:r>
+      <w:r>
+        <w:rPr>
+          <w:rFonts w:ascii="Calibri" w:eastAsia="Times New Roman" w:hAnsi="Calibri" w:cs="Calibri"/>
+          <w:sz w:val="22"/>
+          <w:szCs w:val="22"/>
+        </w:rPr>
+        <w:t>. Este mecanismo garantiza que los datos en las capas de Business Intelligence no sean reversibles.</w:t>
+      </w:r>
+    </w:p>
+    <w:p>
+      <w:pPr>
+        <w:pStyle w:val="NormalWeb"/>
+        <w:rPr>
+          <w:rFonts w:ascii="Calibri" w:hAnsi="Calibri" w:cs="Calibri"/>
+          <w:sz w:val="22"/>
+          <w:szCs w:val="22"/>
+        </w:rPr>
+      </w:pPr>
+      <w:r>
+        <w:rPr>
+          <w:rStyle w:val="Fuerte"/>
+          <w:rFonts w:ascii="Calibri" w:hAnsi="Calibri" w:cs="Calibri"/>
+          <w:sz w:val="22"/>
+          <w:szCs w:val="22"/>
+        </w:rPr>
+        <w:t>Ejemplo de Aplicación en Vistas Analíticas:</w:t>
+      </w:r>
+    </w:p>
+    <w:p>
+      <w:pPr>
+        <w:pStyle w:val="HTMLconformatoprevio"/>
+      </w:pPr>
+    </w:p>
+    <w:p>
+      <w:pPr>
+        <w:pStyle w:val="HTMLconformatoprevio"/>
+      </w:pPr>
+      <w:r>
+        <w:t xml:space="preserve">SELECT </w:t>
+      </w:r>
+    </w:p>
+    <w:p>
+      <w:pPr>
+        <w:pStyle w:val="HTMLconformatoprevio"/>
+      </w:pPr>
+      <w:r>
+        <w:t xml:space="preserve">    A.ID_ALUMNO,</w:t>
+      </w:r>
+    </w:p>
+    <w:p>
+      <w:pPr>
+        <w:pStyle w:val="HTMLconformatoprevio"/>
+      </w:pPr>
+      <w:r>
+        <w:t xml:space="preserve">    -- PROTECCIÓN PII: Hash MD5 irreversible en lugar de ofuscación parcial</w:t>
+      </w:r>
+    </w:p>
+    <w:p>
+      <w:pPr>
+        <w:pStyle w:val="HTMLconformatoprevio"/>
+      </w:pPr>
+      <w:r>
+        <w:t xml:space="preserve">    LOWER(RAWTOHEX(STANDARD_HASH(A.CURP || 'MUSEMS_SALT_2026', 'MD5'))) AS CURP_HASH,</w:t>
+      </w:r>
+    </w:p>
+    <w:p>
+      <w:pPr>
+        <w:pStyle w:val="HTMLconformatoprevio"/>
+      </w:pPr>
+      <w:r>
+        <w:t xml:space="preserve">    A.ID_ESTADO</w:t>
+      </w:r>
+    </w:p>
+    <w:p>
+      <w:pPr>
+        <w:pStyle w:val="HTMLconformatoprevio"/>
+      </w:pPr>
+      <w:r>
+        <w:t>FROM TBMU020_ALUMNO A;</w:t>
       </w:r>
     </w:p>
     <w:p>
@@ -695,7 +705,7 @@
         <w:rPr>
           <w:rFonts w:ascii="Calibri" w:eastAsia="Times New Roman" w:hAnsi="Calibri" w:cs="Calibri"/>
         </w:rPr>
-        <w:t>3.2 Administración del Pool de Conexiones</w:t>
+        <w:t>3.2 Orden de Limpieza y Eliminación de Bloqueos (Deadlocks)</w:t>
       </w:r>
     </w:p>
     <w:p>
@@ -713,26 +723,158 @@
           <w:sz w:val="22"/>
           <w:szCs w:val="22"/>
         </w:rPr>
-        <w:t>Pruebas de estrés y simulaciones confirmaron que superar los 20 hilos (</w:t>
+        <w:t xml:space="preserve">Para asegurar la ejecución ininterrumpida de scripts transaccionales complejos como </w:t>
       </w:r>
       <w:r>
         <w:rPr>
           <w:rStyle w:val="CdigoHTML"/>
         </w:rPr>
-        <w:t>WORKERS=20</w:t>
-      </w:r>
-      <w:r>
-        <w:rPr>
-          <w:rFonts w:ascii="Calibri" w:hAnsi="Calibri" w:cs="Calibri"/>
-          <w:sz w:val="22"/>
-          <w:szCs w:val="22"/>
-        </w:rPr>
-        <w:t xml:space="preserve">) producía una avalancha de conexiones concurrentes en PostgreSQL, provocando *Connection Timeouts* en </w:t>
+        <w:t>simulation_ultra.sql</w:t>
+      </w:r>
+      <w:r>
+        <w:rPr>
+          <w:rFonts w:ascii="Calibri" w:hAnsi="Calibri" w:cs="Calibri"/>
+          <w:sz w:val="22"/>
+          <w:szCs w:val="22"/>
+        </w:rPr>
+        <w:t>, se formalizó el árbol de dependencias referenciales. Esto redujo en un 100% los bloqueos por llaves foráneas (</w:t>
       </w:r>
       <w:r>
         <w:rPr>
           <w:rStyle w:val="CdigoHTML"/>
         </w:rPr>
+        <w:t>Foreign Keys</w:t>
+      </w:r>
+      <w:r>
+        <w:rPr>
+          <w:rFonts w:ascii="Calibri" w:hAnsi="Calibri" w:cs="Calibri"/>
+          <w:sz w:val="22"/>
+          <w:szCs w:val="22"/>
+        </w:rPr>
+        <w:t>) al adherirse a un flujo de borrado en cascada estricto:</w:t>
+      </w:r>
+    </w:p>
+    <w:p>
+      <w:pPr>
+        <w:pStyle w:val="HTMLconformatoprevio"/>
+      </w:pPr>
+    </w:p>
+    <w:p>
+      <w:pPr>
+        <w:pStyle w:val="HTMLconformatoprevio"/>
+      </w:pPr>
+      <w:r>
+        <w:t>graph TD</w:t>
+      </w:r>
+    </w:p>
+    <w:p>
+      <w:pPr>
+        <w:pStyle w:val="HTMLconformatoprevio"/>
+      </w:pPr>
+      <w:r>
+        <w:t xml:space="preserve">    A[TBAE010_ERROR] --&gt;|Foreign Key| B[TBAE009_RESPUESTA]</w:t>
+      </w:r>
+    </w:p>
+    <w:p>
+      <w:pPr>
+        <w:pStyle w:val="HTMLconformatoprevio"/>
+      </w:pPr>
+      <w:r>
+        <w:t xml:space="preserve">    B --&gt;|Foreign Key| C[TBMU013_BAJAS]</w:t>
+      </w:r>
+    </w:p>
+    <w:p>
+      <w:pPr>
+        <w:pStyle w:val="HTMLconformatoprevio"/>
+      </w:pPr>
+      <w:r>
+        <w:t xml:space="preserve">    C --&gt;|Foreign Key| D[TBMU006_INSCRIPCION]</w:t>
+      </w:r>
+    </w:p>
+    <w:p>
+      <w:pPr>
+        <w:pStyle w:val="HTMLconformatoprevio"/>
+      </w:pPr>
+      <w:r>
+        <w:t xml:space="preserve">    D --&gt;|Foreign Key| E[TBAE001_INSCRIPCION]</w:t>
+      </w:r>
+    </w:p>
+    <w:p>
+      <w:pPr>
+        <w:pStyle w:val="HTMLconformatoprevio"/>
+      </w:pPr>
+      <w:r>
+        <w:t xml:space="preserve">    E --&gt;|Foreign Key| F[TBMU020_ALUMNO]</w:t>
+      </w:r>
+    </w:p>
+    <w:p>
+      <w:pPr>
+        <w:pStyle w:val="HTMLconformatoprevio"/>
+      </w:pPr>
+      <w:r>
+        <w:t xml:space="preserve">    F --&gt;|Foreign Key| G[TBMU002_PERSONA]</w:t>
+      </w:r>
+    </w:p>
+    <w:p>
+      <w:pPr>
+        <w:pStyle w:val="HTMLconformatoprevio"/>
+      </w:pPr>
+      <w:r>
+        <w:t xml:space="preserve">    </w:t>
+      </w:r>
+    </w:p>
+    <w:p>
+      <w:pPr>
+        <w:pStyle w:val="HTMLconformatoprevio"/>
+      </w:pPr>
+      <w:r>
+        <w:t xml:space="preserve">    classDef highlight fill:#f9f,stroke:#333,stroke-width:2px;</w:t>
+      </w:r>
+    </w:p>
+    <w:p>
+      <w:pPr>
+        <w:pStyle w:val="HTMLconformatoprevio"/>
+      </w:pPr>
+      <w:r>
+        <w:t xml:space="preserve">    class A highlight</w:t>
+      </w:r>
+    </w:p>
+    <w:p>
+      <w:pPr>
+        <w:pStyle w:val="Ttulo2"/>
+        <w:rPr>
+          <w:rFonts w:ascii="Calibri" w:eastAsia="Times New Roman" w:hAnsi="Calibri" w:cs="Calibri"/>
+        </w:rPr>
+      </w:pPr>
+      <w:r>
+        <w:rPr>
+          <w:rFonts w:ascii="Calibri" w:eastAsia="Times New Roman" w:hAnsi="Calibri" w:cs="Calibri"/>
+        </w:rPr>
+        <w:lastRenderedPageBreak/>
+        <w:t>4. Optimización Transaccional en PostgreSQL (Vida Saludable - Fase 2)</w:t>
+      </w:r>
+    </w:p>
+    <w:p>
+      <w:pPr>
+        <w:pStyle w:val="NormalWeb"/>
+        <w:rPr>
+          <w:rFonts w:ascii="Calibri" w:hAnsi="Calibri" w:cs="Calibri"/>
+          <w:sz w:val="22"/>
+          <w:szCs w:val="22"/>
+        </w:rPr>
+      </w:pPr>
+      <w:r>
+        <w:rPr>
+          <w:rFonts w:ascii="Calibri" w:hAnsi="Calibri" w:cs="Calibri"/>
+          <w:sz w:val="22"/>
+          <w:szCs w:val="22"/>
+        </w:rPr>
+        <w:t xml:space="preserve">De forma paralela, el análisis de rendimiento de mayo abordó el ecosistema del orquestador Fase 2, operado mediante Python 3.14 con el driver </w:t>
+      </w:r>
+      <w:r>
+        <w:rPr>
+          <w:rStyle w:val="CdigoHTML"/>
+        </w:rPr>
         <w:t>pg8000</w:t>
       </w:r>
       <w:r>
@@ -741,38 +883,21 @@
           <w:sz w:val="22"/>
           <w:szCs w:val="22"/>
         </w:rPr>
-        <w:t xml:space="preserve">. Como resultado, la configuración óptima para entornos limitados de RAM y contención de discos se estableció en un rango de </w:t>
-      </w:r>
-      <w:r>
-        <w:rPr>
-          <w:rStyle w:val="Fuerte"/>
-          <w:rFonts w:ascii="Calibri" w:hAnsi="Calibri" w:cs="Calibri"/>
-          <w:sz w:val="22"/>
-          <w:szCs w:val="22"/>
-        </w:rPr>
-        <w:t>12 a 15 hilos</w:t>
-      </w:r>
-      <w:r>
-        <w:rPr>
-          <w:rFonts w:ascii="Calibri" w:hAnsi="Calibri" w:cs="Calibri"/>
-          <w:sz w:val="22"/>
-          <w:szCs w:val="22"/>
-        </w:rPr>
-        <w:t>, eliminando la degradación de rendimiento.</w:t>
-      </w:r>
-    </w:p>
-    <w:p>
-      <w:pPr>
-        <w:pStyle w:val="Ttulo2"/>
-        <w:rPr>
-          <w:rFonts w:ascii="Calibri" w:eastAsia="Times New Roman" w:hAnsi="Calibri" w:cs="Calibri"/>
-        </w:rPr>
-      </w:pPr>
-      <w:r>
-        <w:rPr>
-          <w:rFonts w:ascii="Calibri" w:eastAsia="Times New Roman" w:hAnsi="Calibri" w:cs="Calibri"/>
-        </w:rPr>
-        <w:t>4. Resultados Analíticos (Execution Plans)</w:t>
+        <w:t xml:space="preserve"> sobre PostgreSQL 14.</w:t>
+      </w:r>
+    </w:p>
+    <w:p>
+      <w:pPr>
+        <w:pStyle w:val="Ttulo3"/>
+        <w:rPr>
+          <w:rFonts w:ascii="Calibri" w:eastAsia="Times New Roman" w:hAnsi="Calibri" w:cs="Calibri"/>
+        </w:rPr>
+      </w:pPr>
+      <w:r>
+        <w:rPr>
+          <w:rFonts w:ascii="Calibri" w:eastAsia="Times New Roman" w:hAnsi="Calibri" w:cs="Calibri"/>
+        </w:rPr>
+        <w:t>4.1 Riesgos Detectados y Remediados en Código</w:t>
       </w:r>
     </w:p>
     <w:p>
@@ -790,35 +915,7 @@
           <w:sz w:val="22"/>
           <w:szCs w:val="22"/>
         </w:rPr>
-        <w:t xml:space="preserve">Las métricas levantadas con </w:t>
-      </w:r>
-      <w:r>
-        <w:rPr>
-          <w:rStyle w:val="CdigoHTML"/>
-        </w:rPr>
-        <w:t>EXPLAIN ANALYZE</w:t>
-      </w:r>
-      <w:r>
-        <w:rPr>
-          <w:rFonts w:ascii="Calibri" w:hAnsi="Calibri" w:cs="Calibri"/>
-          <w:sz w:val="22"/>
-          <w:szCs w:val="22"/>
-        </w:rPr>
-        <w:t xml:space="preserve"> posteriores a la aplicación de estos cambios confirmaron el reemplazo total de los *Seq Scans* por *Index Only Scans* en las vistas de validación, garantizando que el sistema sea capaz de escalar en junio para la asimilación del corte trimestral.</w:t>
-      </w:r>
-    </w:p>
-    <w:p>
-      <w:pPr>
-        <w:pStyle w:val="Ttulo2"/>
-        <w:rPr>
-          <w:rFonts w:ascii="Calibri" w:eastAsia="Times New Roman" w:hAnsi="Calibri" w:cs="Calibri"/>
-        </w:rPr>
-      </w:pPr>
-      <w:r>
-        <w:rPr>
-          <w:rFonts w:ascii="Calibri" w:eastAsia="Times New Roman" w:hAnsi="Calibri" w:cs="Calibri"/>
-        </w:rPr>
-        <w:t>5. Próximos Pasos</w:t>
+        <w:t>La auditoría concurrente reveló problemas críticos en la construcción de *queries* que afectaban tanto el rendimiento como la seguridad:</w:t>
       </w:r>
     </w:p>
     <w:p>
@@ -836,18 +933,146 @@
       </w:pPr>
       <w:r>
         <w:rPr>
-          <w:rFonts w:ascii="Calibri" w:eastAsia="Times New Roman" w:hAnsi="Calibri" w:cs="Calibri"/>
-          <w:sz w:val="22"/>
-          <w:szCs w:val="22"/>
-        </w:rPr>
-        <w:t>Validar y auditar la integridad del hash criptográfico en entornos productivos.</w:t>
+          <w:rStyle w:val="Fuerte"/>
+          <w:rFonts w:ascii="Calibri" w:eastAsia="Times New Roman" w:hAnsi="Calibri" w:cs="Calibri"/>
+          <w:sz w:val="22"/>
+          <w:szCs w:val="22"/>
+        </w:rPr>
+        <w:t>Prevención de Inyecciones SQL:</w:t>
+      </w:r>
+      <w:r>
+        <w:rPr>
+          <w:rFonts w:ascii="Calibri" w:eastAsia="Times New Roman" w:hAnsi="Calibri" w:cs="Calibri"/>
+          <w:sz w:val="22"/>
+          <w:szCs w:val="22"/>
+        </w:rPr>
+        <w:t xml:space="preserve"> Se detectó la construcción de sentencias dinámicas mediante concatenación (</w:t>
+      </w:r>
+      <w:r>
+        <w:rPr>
+          <w:rStyle w:val="CdigoHTML"/>
+        </w:rPr>
+        <w:t>f-strings</w:t>
+      </w:r>
+      <w:r>
+        <w:rPr>
+          <w:rFonts w:ascii="Calibri" w:eastAsia="Times New Roman" w:hAnsi="Calibri" w:cs="Calibri"/>
+          <w:sz w:val="22"/>
+          <w:szCs w:val="22"/>
+        </w:rPr>
+        <w:t xml:space="preserve">) en la recuperación de lotes. Esto fue reemplazado exitosamente por el uso estricto de </w:t>
+      </w:r>
+      <w:r>
+        <w:rPr>
+          <w:rStyle w:val="Fuerte"/>
+          <w:rFonts w:ascii="Calibri" w:eastAsia="Times New Roman" w:hAnsi="Calibri" w:cs="Calibri"/>
+          <w:sz w:val="22"/>
+          <w:szCs w:val="22"/>
+        </w:rPr>
+        <w:t>parámetros SQL</w:t>
+      </w:r>
+      <w:r>
+        <w:rPr>
+          <w:rFonts w:ascii="Calibri" w:eastAsia="Times New Roman" w:hAnsi="Calibri" w:cs="Calibri"/>
+          <w:sz w:val="22"/>
+          <w:szCs w:val="22"/>
+        </w:rPr>
+        <w:t xml:space="preserve"> (</w:t>
+      </w:r>
+      <w:r>
+        <w:rPr>
+          <w:rStyle w:val="CdigoHTML"/>
+        </w:rPr>
+        <w:t>:entidad</w:t>
+      </w:r>
+      <w:r>
+        <w:rPr>
+          <w:rFonts w:ascii="Calibri" w:eastAsia="Times New Roman" w:hAnsi="Calibri" w:cs="Calibri"/>
+          <w:sz w:val="22"/>
+          <w:szCs w:val="22"/>
+        </w:rPr>
+        <w:t xml:space="preserve">, </w:t>
+      </w:r>
+      <w:r>
+        <w:rPr>
+          <w:rStyle w:val="CdigoHTML"/>
+        </w:rPr>
+        <w:t>:id_lote</w:t>
+      </w:r>
+      <w:r>
+        <w:rPr>
+          <w:rFonts w:ascii="Calibri" w:eastAsia="Times New Roman" w:hAnsi="Calibri" w:cs="Calibri"/>
+          <w:sz w:val="22"/>
+          <w:szCs w:val="22"/>
+        </w:rPr>
+        <w:t>), previniendo forzados de planes de ejecución subóptimos por parte del optimizador de PostgreSQL e inyecciones de código malicioso.</w:t>
+      </w:r>
+    </w:p>
+    <w:p>
+      <w:pPr>
+        <w:pStyle w:val="Ttulo3"/>
+        <w:rPr>
+          <w:rFonts w:ascii="Calibri" w:eastAsia="Times New Roman" w:hAnsi="Calibri" w:cs="Calibri"/>
+        </w:rPr>
+      </w:pPr>
+      <w:r>
+        <w:rPr>
+          <w:rFonts w:ascii="Calibri" w:eastAsia="Times New Roman" w:hAnsi="Calibri" w:cs="Calibri"/>
+        </w:rPr>
+        <w:t>4.2 Hallazgo de Ausencia Crítica de Índices</w:t>
+      </w:r>
+    </w:p>
+    <w:p>
+      <w:pPr>
+        <w:pStyle w:val="NormalWeb"/>
+        <w:rPr>
+          <w:rFonts w:ascii="Calibri" w:hAnsi="Calibri" w:cs="Calibri"/>
+          <w:sz w:val="22"/>
+          <w:szCs w:val="22"/>
+        </w:rPr>
+      </w:pPr>
+      <w:r>
+        <w:rPr>
+          <w:rFonts w:ascii="Calibri" w:hAnsi="Calibri" w:cs="Calibri"/>
+          <w:sz w:val="22"/>
+          <w:szCs w:val="22"/>
+        </w:rPr>
+        <w:t>El análisis estructural (</w:t>
+      </w:r>
+      <w:r>
+        <w:rPr>
+          <w:rStyle w:val="CdigoHTML"/>
+        </w:rPr>
+        <w:t>ddl.sql</w:t>
+      </w:r>
+      <w:r>
+        <w:rPr>
+          <w:rFonts w:ascii="Calibri" w:hAnsi="Calibri" w:cs="Calibri"/>
+          <w:sz w:val="22"/>
+          <w:szCs w:val="22"/>
+        </w:rPr>
+        <w:t xml:space="preserve">) evidenció un problema severo en el escalamiento de la tabla operativa </w:t>
+      </w:r>
+      <w:r>
+        <w:rPr>
+          <w:rStyle w:val="CdigoHTML"/>
+        </w:rPr>
+        <w:t>BitacoraEvento</w:t>
+      </w:r>
+      <w:r>
+        <w:rPr>
+          <w:rFonts w:ascii="Calibri" w:hAnsi="Calibri" w:cs="Calibri"/>
+          <w:sz w:val="22"/>
+          <w:szCs w:val="22"/>
+        </w:rPr>
+        <w:t>:</w:t>
       </w:r>
     </w:p>
     <w:p>
       <w:pPr>
         <w:numPr>
           <w:ilvl w:val="0"/>
-          <w:numId w:val="3"/>
+          <w:numId w:val="4"/>
         </w:numPr>
         <w:spacing w:before="100" w:beforeAutospacing="1" w:after="100" w:afterAutospacing="1"/>
         <w:rPr>
@@ -858,19 +1083,2516 @@
       </w:pPr>
       <w:r>
         <w:rPr>
-          <w:rFonts w:ascii="Calibri" w:eastAsia="Times New Roman" w:hAnsi="Calibri" w:cs="Calibri"/>
-          <w:sz w:val="22"/>
-          <w:szCs w:val="22"/>
-        </w:rPr>
-        <w:t>Extender la monitorización del tamaño de los í</w:t>
-      </w:r>
-      <w:r>
-        <w:rPr>
-          <w:rFonts w:ascii="Calibri" w:eastAsia="Times New Roman" w:hAnsi="Calibri" w:cs="Calibri"/>
-          <w:sz w:val="22"/>
-          <w:szCs w:val="22"/>
-        </w:rPr>
-        <w:t>ndices en PostgreSQL para evitar el "Index Bloat" causado por reintentos repetitivos de transacciones.</w:t>
+          <w:rStyle w:val="Fuerte"/>
+          <w:rFonts w:ascii="Calibri" w:eastAsia="Times New Roman" w:hAnsi="Calibri" w:cs="Calibri"/>
+          <w:sz w:val="22"/>
+          <w:szCs w:val="22"/>
+        </w:rPr>
+        <w:t>Condición Inicial:</w:t>
+      </w:r>
+      <w:r>
+        <w:rPr>
+          <w:rFonts w:ascii="Calibri" w:eastAsia="Times New Roman" w:hAnsi="Calibri" w:cs="Calibri"/>
+          <w:sz w:val="22"/>
+          <w:szCs w:val="22"/>
+        </w:rPr>
+        <w:t xml:space="preserve"> La tabla carecía de índices sobre </w:t>
+      </w:r>
+      <w:r>
+        <w:rPr>
+          <w:rStyle w:val="CdigoHTML"/>
+        </w:rPr>
+        <w:t>id_curp</w:t>
+      </w:r>
+      <w:r>
+        <w:rPr>
+          <w:rFonts w:ascii="Calibri" w:eastAsia="Times New Roman" w:hAnsi="Calibri" w:cs="Calibri"/>
+          <w:sz w:val="22"/>
+          <w:szCs w:val="22"/>
+        </w:rPr>
+        <w:t xml:space="preserve">, </w:t>
+      </w:r>
+      <w:r>
+        <w:rPr>
+          <w:rStyle w:val="CdigoHTML"/>
+        </w:rPr>
+        <w:t>id_lote</w:t>
+      </w:r>
+      <w:r>
+        <w:rPr>
+          <w:rFonts w:ascii="Calibri" w:eastAsia="Times New Roman" w:hAnsi="Calibri" w:cs="Calibri"/>
+          <w:sz w:val="22"/>
+          <w:szCs w:val="22"/>
+        </w:rPr>
+        <w:t xml:space="preserve"> y </w:t>
+      </w:r>
+      <w:r>
+        <w:rPr>
+          <w:rStyle w:val="CdigoHTML"/>
+        </w:rPr>
+        <w:t>fecha_evento</w:t>
+      </w:r>
+      <w:r>
+        <w:rPr>
+          <w:rFonts w:ascii="Calibri" w:eastAsia="Times New Roman" w:hAnsi="Calibri" w:cs="Calibri"/>
+          <w:sz w:val="22"/>
+          <w:szCs w:val="22"/>
+        </w:rPr>
+        <w:t>.</w:t>
+      </w:r>
+    </w:p>
+    <w:p>
+      <w:pPr>
+        <w:numPr>
+          <w:ilvl w:val="0"/>
+          <w:numId w:val="4"/>
+        </w:numPr>
+        <w:spacing w:before="100" w:beforeAutospacing="1" w:after="100" w:afterAutospacing="1"/>
+        <w:rPr>
+          <w:rFonts w:ascii="Calibri" w:eastAsia="Times New Roman" w:hAnsi="Calibri" w:cs="Calibri"/>
+          <w:sz w:val="22"/>
+          <w:szCs w:val="22"/>
+        </w:rPr>
+      </w:pPr>
+      <w:r>
+        <w:rPr>
+          <w:rStyle w:val="Fuerte"/>
+          <w:rFonts w:ascii="Calibri" w:eastAsia="Times New Roman" w:hAnsi="Calibri" w:cs="Calibri"/>
+          <w:sz w:val="22"/>
+          <w:szCs w:val="22"/>
+        </w:rPr>
+        <w:t>Impacto:</w:t>
+      </w:r>
+      <w:r>
+        <w:rPr>
+          <w:rFonts w:ascii="Calibri" w:eastAsia="Times New Roman" w:hAnsi="Calibri" w:cs="Calibri"/>
+          <w:sz w:val="22"/>
+          <w:szCs w:val="22"/>
+        </w:rPr>
+        <w:t xml:space="preserve"> Con miles de inserciones y consultas generadas por el servicio GraphQL (</w:t>
+      </w:r>
+      <w:r>
+        <w:rPr>
+          <w:rStyle w:val="CdigoHTML"/>
+        </w:rPr>
+        <w:t>download_service.py</w:t>
+      </w:r>
+      <w:r>
+        <w:rPr>
+          <w:rFonts w:ascii="Calibri" w:eastAsia="Times New Roman" w:hAnsi="Calibri" w:cs="Calibri"/>
+          <w:sz w:val="22"/>
+          <w:szCs w:val="22"/>
+        </w:rPr>
+        <w:t xml:space="preserve">), la falta de estos índices forzaba un </w:t>
+      </w:r>
+      <w:r>
+        <w:rPr>
+          <w:rStyle w:val="CdigoHTML"/>
+        </w:rPr>
+        <w:t>Sequential Scan</w:t>
+      </w:r>
+      <w:r>
+        <w:rPr>
+          <w:rFonts w:ascii="Calibri" w:eastAsia="Times New Roman" w:hAnsi="Calibri" w:cs="Calibri"/>
+          <w:sz w:val="22"/>
+          <w:szCs w:val="22"/>
+        </w:rPr>
+        <w:t xml:space="preserve"> cada vez que se requería validar el historial de una CURP, degradando exponencialmente los tiempos de respuesta de la API y de las tareas asíncronas conforme el lote avanzaba.</w:t>
+      </w:r>
+    </w:p>
+    <w:p>
+      <w:pPr>
+        <w:numPr>
+          <w:ilvl w:val="0"/>
+          <w:numId w:val="4"/>
+        </w:numPr>
+        <w:spacing w:before="100" w:beforeAutospacing="1" w:after="100" w:afterAutospacing="1"/>
+        <w:rPr>
+          <w:rFonts w:ascii="Calibri" w:eastAsia="Times New Roman" w:hAnsi="Calibri" w:cs="Calibri"/>
+          <w:sz w:val="22"/>
+          <w:szCs w:val="22"/>
+        </w:rPr>
+      </w:pPr>
+      <w:r>
+        <w:rPr>
+          <w:rStyle w:val="Fuerte"/>
+          <w:rFonts w:ascii="Calibri" w:eastAsia="Times New Roman" w:hAnsi="Calibri" w:cs="Calibri"/>
+          <w:sz w:val="22"/>
+          <w:szCs w:val="22"/>
+        </w:rPr>
+        <w:t>Acción:</w:t>
+      </w:r>
+      <w:r>
+        <w:rPr>
+          <w:rFonts w:ascii="Calibri" w:eastAsia="Times New Roman" w:hAnsi="Calibri" w:cs="Calibri"/>
+          <w:sz w:val="22"/>
+          <w:szCs w:val="22"/>
+        </w:rPr>
+        <w:t xml:space="preserve"> Se diseñó y propuso la creación inmediata de los índices </w:t>
+      </w:r>
+      <w:r>
+        <w:rPr>
+          <w:rStyle w:val="CdigoHTML"/>
+        </w:rPr>
+        <w:t>idx_bitacora_curp</w:t>
+      </w:r>
+      <w:r>
+        <w:rPr>
+          <w:rFonts w:ascii="Calibri" w:eastAsia="Times New Roman" w:hAnsi="Calibri" w:cs="Calibri"/>
+          <w:sz w:val="22"/>
+          <w:szCs w:val="22"/>
+        </w:rPr>
+        <w:t xml:space="preserve"> e </w:t>
+      </w:r>
+      <w:r>
+        <w:rPr>
+          <w:rStyle w:val="CdigoHTML"/>
+        </w:rPr>
+        <w:t>idx_bitacora_lote</w:t>
+      </w:r>
+      <w:r>
+        <w:rPr>
+          <w:rFonts w:ascii="Calibri" w:eastAsia="Times New Roman" w:hAnsi="Calibri" w:cs="Calibri"/>
+          <w:sz w:val="22"/>
+          <w:szCs w:val="22"/>
+        </w:rPr>
+        <w:t>.</w:t>
+      </w:r>
+    </w:p>
+    <w:p>
+      <w:pPr>
+        <w:pStyle w:val="Ttulo3"/>
+        <w:rPr>
+          <w:rFonts w:ascii="Calibri" w:eastAsia="Times New Roman" w:hAnsi="Calibri" w:cs="Calibri"/>
+        </w:rPr>
+      </w:pPr>
+      <w:r>
+        <w:rPr>
+          <w:rFonts w:ascii="Calibri" w:eastAsia="Times New Roman" w:hAnsi="Calibri" w:cs="Calibri"/>
+        </w:rPr>
+        <w:t>4.3 Diseño e Implementación de Índices Compuestos</w:t>
+      </w:r>
+    </w:p>
+    <w:p>
+      <w:pPr>
+        <w:pStyle w:val="NormalWeb"/>
+        <w:rPr>
+          <w:rFonts w:ascii="Calibri" w:hAnsi="Calibri" w:cs="Calibri"/>
+          <w:sz w:val="22"/>
+          <w:szCs w:val="22"/>
+        </w:rPr>
+      </w:pPr>
+      <w:r>
+        <w:rPr>
+          <w:rFonts w:ascii="Calibri" w:hAnsi="Calibri" w:cs="Calibri"/>
+          <w:sz w:val="22"/>
+          <w:szCs w:val="22"/>
+        </w:rPr>
+        <w:t>Para resolver los problemas de lectura en extracciones masivas:</w:t>
+      </w:r>
+    </w:p>
+    <w:p>
+      <w:pPr>
+        <w:numPr>
+          <w:ilvl w:val="0"/>
+          <w:numId w:val="5"/>
+        </w:numPr>
+        <w:spacing w:before="100" w:beforeAutospacing="1" w:after="100" w:afterAutospacing="1"/>
+        <w:rPr>
+          <w:rFonts w:ascii="Calibri" w:eastAsia="Times New Roman" w:hAnsi="Calibri" w:cs="Calibri"/>
+          <w:sz w:val="22"/>
+          <w:szCs w:val="22"/>
+        </w:rPr>
+      </w:pPr>
+      <w:r>
+        <w:rPr>
+          <w:rStyle w:val="CdigoHTML"/>
+          <w:b/>
+          <w:bCs/>
+        </w:rPr>
+        <w:t>idx_menor_evaluado_cct_curp_ciclo</w:t>
+      </w:r>
+      <w:r>
+        <w:rPr>
+          <w:rStyle w:val="Fuerte"/>
+          <w:rFonts w:ascii="Calibri" w:eastAsia="Times New Roman" w:hAnsi="Calibri" w:cs="Calibri"/>
+          <w:sz w:val="22"/>
+          <w:szCs w:val="22"/>
+        </w:rPr>
+        <w:t>:</w:t>
+      </w:r>
+      <w:r>
+        <w:rPr>
+          <w:rFonts w:ascii="Calibri" w:eastAsia="Times New Roman" w:hAnsi="Calibri" w:cs="Calibri"/>
+          <w:sz w:val="22"/>
+          <w:szCs w:val="22"/>
+        </w:rPr>
+        <w:t xml:space="preserve"> Este índice compuesto en la tabla principal (</w:t>
+      </w:r>
+      <w:r>
+        <w:rPr>
+          <w:rStyle w:val="CdigoHTML"/>
+        </w:rPr>
+        <w:t>menor_evaluado</w:t>
+      </w:r>
+      <w:r>
+        <w:rPr>
+          <w:rFonts w:ascii="Calibri" w:eastAsia="Times New Roman" w:hAnsi="Calibri" w:cs="Calibri"/>
+          <w:sz w:val="22"/>
+          <w:szCs w:val="22"/>
+        </w:rPr>
+        <w:t>) se alineó con la condición de extracción prioritaria. Redujo dramáticamente el tiempo de extracción para validaciones.</w:t>
+      </w:r>
+    </w:p>
+    <w:p>
+      <w:pPr>
+        <w:numPr>
+          <w:ilvl w:val="0"/>
+          <w:numId w:val="5"/>
+        </w:numPr>
+        <w:spacing w:before="100" w:beforeAutospacing="1" w:after="100" w:afterAutospacing="1"/>
+        <w:rPr>
+          <w:rFonts w:ascii="Calibri" w:eastAsia="Times New Roman" w:hAnsi="Calibri" w:cs="Calibri"/>
+          <w:sz w:val="22"/>
+          <w:szCs w:val="22"/>
+        </w:rPr>
+      </w:pPr>
+      <w:r>
+        <w:rPr>
+          <w:rStyle w:val="CdigoHTML"/>
+          <w:b/>
+          <w:bCs/>
+        </w:rPr>
+        <w:t>idx_curp_procesada_lote_estado</w:t>
+      </w:r>
+      <w:r>
+        <w:rPr>
+          <w:rStyle w:val="Fuerte"/>
+          <w:rFonts w:ascii="Calibri" w:eastAsia="Times New Roman" w:hAnsi="Calibri" w:cs="Calibri"/>
+          <w:sz w:val="22"/>
+          <w:szCs w:val="22"/>
+        </w:rPr>
+        <w:t>:</w:t>
+      </w:r>
+      <w:r>
+        <w:rPr>
+          <w:rFonts w:ascii="Calibri" w:eastAsia="Times New Roman" w:hAnsi="Calibri" w:cs="Calibri"/>
+          <w:sz w:val="22"/>
+          <w:szCs w:val="22"/>
+        </w:rPr>
+        <w:t xml:space="preserve"> Generado específicamente para solventar latencias observadas al recuperar registros fallidos (</w:t>
+      </w:r>
+      <w:r>
+        <w:rPr>
+          <w:rStyle w:val="CdigoHTML"/>
+        </w:rPr>
+        <w:t>estado_descarga = 'FALLO'</w:t>
+      </w:r>
+      <w:r>
+        <w:rPr>
+          <w:rFonts w:ascii="Calibri" w:eastAsia="Times New Roman" w:hAnsi="Calibri" w:cs="Calibri"/>
+          <w:sz w:val="22"/>
+          <w:szCs w:val="22"/>
+        </w:rPr>
+        <w:t xml:space="preserve">) durante el proceso iterativo de </w:t>
+      </w:r>
+      <w:r>
+        <w:rPr>
+          <w:rStyle w:val="CdigoHTML"/>
+        </w:rPr>
+        <w:t>run_reproceso.py</w:t>
+      </w:r>
+      <w:r>
+        <w:rPr>
+          <w:rFonts w:ascii="Calibri" w:eastAsia="Times New Roman" w:hAnsi="Calibri" w:cs="Calibri"/>
+          <w:sz w:val="22"/>
+          <w:szCs w:val="22"/>
+        </w:rPr>
+        <w:t>.</w:t>
+      </w:r>
+    </w:p>
+    <w:p>
+      <w:pPr>
+        <w:pStyle w:val="Ttulo2"/>
+        <w:rPr>
+          <w:rFonts w:ascii="Calibri" w:eastAsia="Times New Roman" w:hAnsi="Calibri" w:cs="Calibri"/>
+        </w:rPr>
+      </w:pPr>
+      <w:r>
+        <w:rPr>
+          <w:rFonts w:ascii="Calibri" w:eastAsia="Times New Roman" w:hAnsi="Calibri" w:cs="Calibri"/>
+        </w:rPr>
+        <w:t>5. Administración del Pool de Conexiones y Capacidad</w:t>
+      </w:r>
+    </w:p>
+    <w:p>
+      <w:pPr>
+        <w:pStyle w:val="NormalWeb"/>
+        <w:rPr>
+          <w:rFonts w:ascii="Calibri" w:hAnsi="Calibri" w:cs="Calibri"/>
+          <w:sz w:val="22"/>
+          <w:szCs w:val="22"/>
+        </w:rPr>
+      </w:pPr>
+      <w:r>
+        <w:rPr>
+          <w:rFonts w:ascii="Calibri" w:hAnsi="Calibri" w:cs="Calibri"/>
+          <w:sz w:val="22"/>
+          <w:szCs w:val="22"/>
+        </w:rPr>
+        <w:t>Pruebas de estrés documentadas en la *Bitácora del Proyecto* confirmaron que superar los 20 hilos simultáneos (</w:t>
+      </w:r>
+      <w:r>
+        <w:rPr>
+          <w:rStyle w:val="CdigoHTML"/>
+        </w:rPr>
+        <w:t>WORKERS=20</w:t>
+      </w:r>
+      <w:r>
+        <w:rPr>
+          <w:rFonts w:ascii="Calibri" w:hAnsi="Calibri" w:cs="Calibri"/>
+          <w:sz w:val="22"/>
+          <w:szCs w:val="22"/>
+        </w:rPr>
+        <w:t xml:space="preserve">) producía una avalancha de conexiones concurrentes en PostgreSQL, provocando *Connection Timeouts* a nivel del driver </w:t>
+      </w:r>
+      <w:r>
+        <w:rPr>
+          <w:rStyle w:val="CdigoHTML"/>
+        </w:rPr>
+        <w:t>pg8000</w:t>
+      </w:r>
+      <w:r>
+        <w:rPr>
+          <w:rFonts w:ascii="Calibri" w:hAnsi="Calibri" w:cs="Calibri"/>
+          <w:sz w:val="22"/>
+          <w:szCs w:val="22"/>
+        </w:rPr>
+        <w:t xml:space="preserve"> y bloqueos por WAF (Web Application Firewall).</w:t>
+      </w:r>
+    </w:p>
+    <w:p>
+      <w:pPr>
+        <w:numPr>
+          <w:ilvl w:val="0"/>
+          <w:numId w:val="6"/>
+        </w:numPr>
+        <w:spacing w:before="100" w:beforeAutospacing="1" w:after="100" w:afterAutospacing="1"/>
+        <w:rPr>
+          <w:rFonts w:ascii="Calibri" w:eastAsia="Times New Roman" w:hAnsi="Calibri" w:cs="Calibri"/>
+          <w:sz w:val="22"/>
+          <w:szCs w:val="22"/>
+        </w:rPr>
+      </w:pPr>
+      <w:r>
+        <w:rPr>
+          <w:rStyle w:val="Fuerte"/>
+          <w:rFonts w:ascii="Calibri" w:eastAsia="Times New Roman" w:hAnsi="Calibri" w:cs="Calibri"/>
+          <w:sz w:val="22"/>
+          <w:szCs w:val="22"/>
+        </w:rPr>
+        <w:t>Mitigación de Rendimiento:</w:t>
+      </w:r>
+      <w:r>
+        <w:rPr>
+          <w:rFonts w:ascii="Calibri" w:eastAsia="Times New Roman" w:hAnsi="Calibri" w:cs="Calibri"/>
+          <w:sz w:val="22"/>
+          <w:szCs w:val="22"/>
+        </w:rPr>
+        <w:t xml:space="preserve"> La configuración óptima para evitar la contención de red y degradación de I/O en la base de datos se ajustó a un rango de </w:t>
+      </w:r>
+      <w:r>
+        <w:rPr>
+          <w:rStyle w:val="Fuerte"/>
+          <w:rFonts w:ascii="Calibri" w:eastAsia="Times New Roman" w:hAnsi="Calibri" w:cs="Calibri"/>
+          <w:sz w:val="22"/>
+          <w:szCs w:val="22"/>
+        </w:rPr>
+        <w:t>12 a 15 hilos</w:t>
+      </w:r>
+      <w:r>
+        <w:rPr>
+          <w:rFonts w:ascii="Calibri" w:eastAsia="Times New Roman" w:hAnsi="Calibri" w:cs="Calibri"/>
+          <w:sz w:val="22"/>
+          <w:szCs w:val="22"/>
+        </w:rPr>
+        <w:t xml:space="preserve">. Este ajuste, junto con el mecanismo de *Circuit Breaker*, estabilizó la capacidad transaccional logrando tasas de éxito del </w:t>
+      </w:r>
+      <w:r>
+        <w:rPr>
+          <w:rStyle w:val="Fuerte"/>
+          <w:rFonts w:ascii="Calibri" w:eastAsia="Times New Roman" w:hAnsi="Calibri" w:cs="Calibri"/>
+          <w:sz w:val="22"/>
+          <w:szCs w:val="22"/>
+        </w:rPr>
+        <w:t>99.83%</w:t>
+      </w:r>
+      <w:r>
+        <w:rPr>
+          <w:rFonts w:ascii="Calibri" w:eastAsia="Times New Roman" w:hAnsi="Calibri" w:cs="Calibri"/>
+          <w:sz w:val="22"/>
+          <w:szCs w:val="22"/>
+        </w:rPr>
+        <w:t xml:space="preserve"> en procesamientos continuos.</w:t>
+      </w:r>
+    </w:p>
+    <w:p>
+      <w:pPr>
+        <w:pStyle w:val="Ttulo3"/>
+        <w:rPr>
+          <w:rFonts w:ascii="Calibri" w:eastAsia="Times New Roman" w:hAnsi="Calibri" w:cs="Calibri"/>
+        </w:rPr>
+      </w:pPr>
+      <w:r>
+        <w:rPr>
+          <w:rFonts w:ascii="Calibri" w:eastAsia="Times New Roman" w:hAnsi="Calibri" w:cs="Calibri"/>
+        </w:rPr>
+        <w:t>5.1 Matriz de Capacidad y Contención (Pool de Conexiones)</w:t>
+      </w:r>
+    </w:p>
+    <w:tbl>
+      <w:tblPr>
+        <w:tblW w:w="5000" w:type="pct"/>
+        <w:tblCellMar>
+          <w:top w:w="15" w:type="dxa"/>
+          <w:left w:w="15" w:type="dxa"/>
+          <w:bottom w:w="15" w:type="dxa"/>
+          <w:right w:w="15" w:type="dxa"/>
+        </w:tblCellMar>
+        <w:tblLook w:val="04A0" w:firstRow="1" w:lastRow="0" w:firstColumn="1" w:lastColumn="0" w:noHBand="0" w:noVBand="1"/>
+      </w:tblPr>
+      <w:tblGrid>
+        <w:gridCol w:w="2009"/>
+        <w:gridCol w:w="1885"/>
+        <w:gridCol w:w="1183"/>
+        <w:gridCol w:w="1807"/>
+        <w:gridCol w:w="1938"/>
+      </w:tblGrid>
+      <w:tr>
+        <w:trPr>
+          <w:tblHeader/>
+        </w:trPr>
+        <w:tc>
+          <w:tcPr>
+            <w:tcW w:w="0" w:type="auto"/>
+            <w:tcBorders>
+              <w:top w:val="single" w:sz="6" w:space="0" w:color="666666"/>
+              <w:left w:val="single" w:sz="6" w:space="0" w:color="666666"/>
+              <w:bottom w:val="single" w:sz="6" w:space="0" w:color="666666"/>
+              <w:right w:val="single" w:sz="6" w:space="0" w:color="666666"/>
+            </w:tcBorders>
+            <w:tcMar>
+              <w:top w:w="90" w:type="dxa"/>
+              <w:left w:w="90" w:type="dxa"/>
+              <w:bottom w:w="90" w:type="dxa"/>
+              <w:right w:w="90" w:type="dxa"/>
+            </w:tcMar>
+            <w:hideMark/>
+          </w:tcPr>
+          <w:p>
+            <w:pPr>
+              <w:spacing w:before="180" w:after="180"/>
+              <w:rPr>
+                <w:rFonts w:ascii="Calibri" w:eastAsia="Times New Roman" w:hAnsi="Calibri" w:cs="Calibri"/>
+                <w:b/>
+                <w:bCs/>
+                <w:sz w:val="22"/>
+                <w:szCs w:val="22"/>
+              </w:rPr>
+            </w:pPr>
+            <w:r>
+              <w:rPr>
+                <w:rFonts w:ascii="Calibri" w:eastAsia="Times New Roman" w:hAnsi="Calibri" w:cs="Calibri"/>
+                <w:b/>
+                <w:bCs/>
+                <w:sz w:val="22"/>
+                <w:szCs w:val="22"/>
+              </w:rPr>
+              <w:t xml:space="preserve">Configuración </w:t>
+            </w:r>
+            <w:r>
+              <w:rPr>
+                <w:rStyle w:val="CdigoHTML"/>
+                <w:b/>
+                <w:bCs/>
+              </w:rPr>
+              <w:t>WORKERS</w:t>
+            </w:r>
+          </w:p>
+        </w:tc>
+        <w:tc>
+          <w:tcPr>
+            <w:tcW w:w="0" w:type="auto"/>
+            <w:tcBorders>
+              <w:top w:val="single" w:sz="6" w:space="0" w:color="666666"/>
+              <w:left w:val="single" w:sz="6" w:space="0" w:color="666666"/>
+              <w:bottom w:val="single" w:sz="6" w:space="0" w:color="666666"/>
+              <w:right w:val="single" w:sz="6" w:space="0" w:color="666666"/>
+            </w:tcBorders>
+            <w:tcMar>
+              <w:top w:w="90" w:type="dxa"/>
+              <w:left w:w="90" w:type="dxa"/>
+              <w:bottom w:w="90" w:type="dxa"/>
+              <w:right w:w="90" w:type="dxa"/>
+            </w:tcMar>
+            <w:hideMark/>
+          </w:tcPr>
+          <w:p>
+            <w:pPr>
+              <w:spacing w:before="180" w:after="180"/>
+              <w:rPr>
+                <w:rFonts w:ascii="Calibri" w:eastAsia="Times New Roman" w:hAnsi="Calibri" w:cs="Calibri"/>
+                <w:b/>
+                <w:bCs/>
+                <w:sz w:val="22"/>
+                <w:szCs w:val="22"/>
+              </w:rPr>
+            </w:pPr>
+            <w:r>
+              <w:rPr>
+                <w:rFonts w:ascii="Calibri" w:eastAsia="Times New Roman" w:hAnsi="Calibri" w:cs="Calibri"/>
+                <w:b/>
+                <w:bCs/>
+                <w:sz w:val="22"/>
+                <w:szCs w:val="22"/>
+              </w:rPr>
+              <w:t>Nivel de Concurrencia</w:t>
+            </w:r>
+          </w:p>
+        </w:tc>
+        <w:tc>
+          <w:tcPr>
+            <w:tcW w:w="0" w:type="auto"/>
+            <w:tcBorders>
+              <w:top w:val="single" w:sz="6" w:space="0" w:color="666666"/>
+              <w:left w:val="single" w:sz="6" w:space="0" w:color="666666"/>
+              <w:bottom w:val="single" w:sz="6" w:space="0" w:color="666666"/>
+              <w:right w:val="single" w:sz="6" w:space="0" w:color="666666"/>
+            </w:tcBorders>
+            <w:tcMar>
+              <w:top w:w="90" w:type="dxa"/>
+              <w:left w:w="90" w:type="dxa"/>
+              <w:bottom w:w="90" w:type="dxa"/>
+              <w:right w:w="90" w:type="dxa"/>
+            </w:tcMar>
+            <w:hideMark/>
+          </w:tcPr>
+          <w:p>
+            <w:pPr>
+              <w:spacing w:before="180" w:after="180"/>
+              <w:rPr>
+                <w:rFonts w:ascii="Calibri" w:eastAsia="Times New Roman" w:hAnsi="Calibri" w:cs="Calibri"/>
+                <w:b/>
+                <w:bCs/>
+                <w:sz w:val="22"/>
+                <w:szCs w:val="22"/>
+              </w:rPr>
+            </w:pPr>
+            <w:r>
+              <w:rPr>
+                <w:rFonts w:ascii="Calibri" w:eastAsia="Times New Roman" w:hAnsi="Calibri" w:cs="Calibri"/>
+                <w:b/>
+                <w:bCs/>
+                <w:sz w:val="22"/>
+                <w:szCs w:val="22"/>
+              </w:rPr>
+              <w:t>Tasa de Éxito</w:t>
+            </w:r>
+          </w:p>
+        </w:tc>
+        <w:tc>
+          <w:tcPr>
+            <w:tcW w:w="0" w:type="auto"/>
+            <w:tcBorders>
+              <w:top w:val="single" w:sz="6" w:space="0" w:color="666666"/>
+              <w:left w:val="single" w:sz="6" w:space="0" w:color="666666"/>
+              <w:bottom w:val="single" w:sz="6" w:space="0" w:color="666666"/>
+              <w:right w:val="single" w:sz="6" w:space="0" w:color="666666"/>
+            </w:tcBorders>
+            <w:tcMar>
+              <w:top w:w="90" w:type="dxa"/>
+              <w:left w:w="90" w:type="dxa"/>
+              <w:bottom w:w="90" w:type="dxa"/>
+              <w:right w:w="90" w:type="dxa"/>
+            </w:tcMar>
+            <w:hideMark/>
+          </w:tcPr>
+          <w:p>
+            <w:pPr>
+              <w:spacing w:before="180" w:after="180"/>
+              <w:rPr>
+                <w:rFonts w:ascii="Calibri" w:eastAsia="Times New Roman" w:hAnsi="Calibri" w:cs="Calibri"/>
+                <w:b/>
+                <w:bCs/>
+                <w:sz w:val="22"/>
+                <w:szCs w:val="22"/>
+              </w:rPr>
+            </w:pPr>
+            <w:r>
+              <w:rPr>
+                <w:rFonts w:ascii="Calibri" w:eastAsia="Times New Roman" w:hAnsi="Calibri" w:cs="Calibri"/>
+                <w:b/>
+                <w:bCs/>
+                <w:sz w:val="22"/>
+                <w:szCs w:val="22"/>
+              </w:rPr>
+              <w:t>Errores HTTP 429 / WAF</w:t>
+            </w:r>
+          </w:p>
+        </w:tc>
+        <w:tc>
+          <w:tcPr>
+            <w:tcW w:w="0" w:type="auto"/>
+            <w:tcBorders>
+              <w:top w:val="single" w:sz="6" w:space="0" w:color="666666"/>
+              <w:left w:val="single" w:sz="6" w:space="0" w:color="666666"/>
+              <w:bottom w:val="single" w:sz="6" w:space="0" w:color="666666"/>
+              <w:right w:val="single" w:sz="6" w:space="0" w:color="666666"/>
+            </w:tcBorders>
+            <w:tcMar>
+              <w:top w:w="90" w:type="dxa"/>
+              <w:left w:w="90" w:type="dxa"/>
+              <w:bottom w:w="90" w:type="dxa"/>
+              <w:right w:w="90" w:type="dxa"/>
+            </w:tcMar>
+            <w:hideMark/>
+          </w:tcPr>
+          <w:p>
+            <w:pPr>
+              <w:spacing w:before="180" w:after="180"/>
+              <w:rPr>
+                <w:rFonts w:ascii="Calibri" w:eastAsia="Times New Roman" w:hAnsi="Calibri" w:cs="Calibri"/>
+                <w:b/>
+                <w:bCs/>
+                <w:sz w:val="22"/>
+                <w:szCs w:val="22"/>
+              </w:rPr>
+            </w:pPr>
+            <w:r>
+              <w:rPr>
+                <w:rFonts w:ascii="Calibri" w:eastAsia="Times New Roman" w:hAnsi="Calibri" w:cs="Calibri"/>
+                <w:b/>
+                <w:bCs/>
+                <w:sz w:val="22"/>
+                <w:szCs w:val="22"/>
+              </w:rPr>
+              <w:t>Estado de BD (pg8000)</w:t>
+            </w:r>
+          </w:p>
+        </w:tc>
+      </w:tr>
+      <w:tr>
+        <w:tc>
+          <w:tcPr>
+            <w:tcW w:w="0" w:type="auto"/>
+            <w:tcBorders>
+              <w:top w:val="single" w:sz="6" w:space="0" w:color="666666"/>
+              <w:left w:val="single" w:sz="6" w:space="0" w:color="666666"/>
+              <w:bottom w:val="single" w:sz="6" w:space="0" w:color="666666"/>
+              <w:right w:val="single" w:sz="6" w:space="0" w:color="666666"/>
+            </w:tcBorders>
+            <w:tcMar>
+              <w:top w:w="90" w:type="dxa"/>
+              <w:left w:w="90" w:type="dxa"/>
+              <w:bottom w:w="90" w:type="dxa"/>
+              <w:right w:w="90" w:type="dxa"/>
+            </w:tcMar>
+            <w:hideMark/>
+          </w:tcPr>
+          <w:p>
+            <w:pPr>
+              <w:spacing w:before="180" w:after="180"/>
+              <w:rPr>
+                <w:rFonts w:ascii="Calibri" w:eastAsia="Times New Roman" w:hAnsi="Calibri" w:cs="Calibri"/>
+                <w:sz w:val="22"/>
+                <w:szCs w:val="22"/>
+              </w:rPr>
+            </w:pPr>
+            <w:r>
+              <w:rPr>
+                <w:rFonts w:ascii="Calibri" w:eastAsia="Times New Roman" w:hAnsi="Calibri" w:cs="Calibri"/>
+                <w:sz w:val="22"/>
+                <w:szCs w:val="22"/>
+              </w:rPr>
+              <w:t>20 (Fase Inicial)</w:t>
+            </w:r>
+          </w:p>
+        </w:tc>
+        <w:tc>
+          <w:tcPr>
+            <w:tcW w:w="0" w:type="auto"/>
+            <w:tcBorders>
+              <w:top w:val="single" w:sz="6" w:space="0" w:color="666666"/>
+              <w:left w:val="single" w:sz="6" w:space="0" w:color="666666"/>
+              <w:bottom w:val="single" w:sz="6" w:space="0" w:color="666666"/>
+              <w:right w:val="single" w:sz="6" w:space="0" w:color="666666"/>
+            </w:tcBorders>
+            <w:tcMar>
+              <w:top w:w="90" w:type="dxa"/>
+              <w:left w:w="90" w:type="dxa"/>
+              <w:bottom w:w="90" w:type="dxa"/>
+              <w:right w:w="90" w:type="dxa"/>
+            </w:tcMar>
+            <w:hideMark/>
+          </w:tcPr>
+          <w:p>
+            <w:pPr>
+              <w:spacing w:before="180" w:after="180"/>
+              <w:rPr>
+                <w:rFonts w:ascii="Calibri" w:eastAsia="Times New Roman" w:hAnsi="Calibri" w:cs="Calibri"/>
+                <w:sz w:val="22"/>
+                <w:szCs w:val="22"/>
+              </w:rPr>
+            </w:pPr>
+            <w:r>
+              <w:rPr>
+                <w:rFonts w:ascii="Calibri" w:eastAsia="Times New Roman" w:hAnsi="Calibri" w:cs="Calibri"/>
+                <w:sz w:val="22"/>
+                <w:szCs w:val="22"/>
+              </w:rPr>
+              <w:t>Crítico / Saturación</w:t>
+            </w:r>
+          </w:p>
+        </w:tc>
+        <w:tc>
+          <w:tcPr>
+            <w:tcW w:w="0" w:type="auto"/>
+            <w:tcBorders>
+              <w:top w:val="single" w:sz="6" w:space="0" w:color="666666"/>
+              <w:left w:val="single" w:sz="6" w:space="0" w:color="666666"/>
+              <w:bottom w:val="single" w:sz="6" w:space="0" w:color="666666"/>
+              <w:right w:val="single" w:sz="6" w:space="0" w:color="666666"/>
+            </w:tcBorders>
+            <w:tcMar>
+              <w:top w:w="90" w:type="dxa"/>
+              <w:left w:w="90" w:type="dxa"/>
+              <w:bottom w:w="90" w:type="dxa"/>
+              <w:right w:w="90" w:type="dxa"/>
+            </w:tcMar>
+            <w:hideMark/>
+          </w:tcPr>
+          <w:p>
+            <w:pPr>
+              <w:spacing w:before="180" w:after="180"/>
+              <w:rPr>
+                <w:rFonts w:ascii="Calibri" w:eastAsia="Times New Roman" w:hAnsi="Calibri" w:cs="Calibri"/>
+                <w:sz w:val="22"/>
+                <w:szCs w:val="22"/>
+              </w:rPr>
+            </w:pPr>
+            <w:r>
+              <w:rPr>
+                <w:rFonts w:ascii="Calibri" w:eastAsia="Times New Roman" w:hAnsi="Calibri" w:cs="Calibri"/>
+                <w:sz w:val="22"/>
+                <w:szCs w:val="22"/>
+              </w:rPr>
+              <w:t>&lt; 90%</w:t>
+            </w:r>
+          </w:p>
+        </w:tc>
+        <w:tc>
+          <w:tcPr>
+            <w:tcW w:w="0" w:type="auto"/>
+            <w:tcBorders>
+              <w:top w:val="single" w:sz="6" w:space="0" w:color="666666"/>
+              <w:left w:val="single" w:sz="6" w:space="0" w:color="666666"/>
+              <w:bottom w:val="single" w:sz="6" w:space="0" w:color="666666"/>
+              <w:right w:val="single" w:sz="6" w:space="0" w:color="666666"/>
+            </w:tcBorders>
+            <w:tcMar>
+              <w:top w:w="90" w:type="dxa"/>
+              <w:left w:w="90" w:type="dxa"/>
+              <w:bottom w:w="90" w:type="dxa"/>
+              <w:right w:w="90" w:type="dxa"/>
+            </w:tcMar>
+            <w:hideMark/>
+          </w:tcPr>
+          <w:p>
+            <w:pPr>
+              <w:spacing w:before="180" w:after="180"/>
+              <w:rPr>
+                <w:rFonts w:ascii="Calibri" w:eastAsia="Times New Roman" w:hAnsi="Calibri" w:cs="Calibri"/>
+                <w:sz w:val="22"/>
+                <w:szCs w:val="22"/>
+              </w:rPr>
+            </w:pPr>
+            <w:r>
+              <w:rPr>
+                <w:rFonts w:ascii="Calibri" w:eastAsia="Times New Roman" w:hAnsi="Calibri" w:cs="Calibri"/>
+                <w:sz w:val="22"/>
+                <w:szCs w:val="22"/>
+              </w:rPr>
+              <w:t>Altos (Baneo IP)</w:t>
+            </w:r>
+          </w:p>
+        </w:tc>
+        <w:tc>
+          <w:tcPr>
+            <w:tcW w:w="0" w:type="auto"/>
+            <w:tcBorders>
+              <w:top w:val="single" w:sz="6" w:space="0" w:color="666666"/>
+              <w:left w:val="single" w:sz="6" w:space="0" w:color="666666"/>
+              <w:bottom w:val="single" w:sz="6" w:space="0" w:color="666666"/>
+              <w:right w:val="single" w:sz="6" w:space="0" w:color="666666"/>
+            </w:tcBorders>
+            <w:tcMar>
+              <w:top w:w="90" w:type="dxa"/>
+              <w:left w:w="90" w:type="dxa"/>
+              <w:bottom w:w="90" w:type="dxa"/>
+              <w:right w:w="90" w:type="dxa"/>
+            </w:tcMar>
+            <w:hideMark/>
+          </w:tcPr>
+          <w:p>
+            <w:pPr>
+              <w:spacing w:before="180" w:after="180"/>
+              <w:rPr>
+                <w:rFonts w:ascii="Calibri" w:eastAsia="Times New Roman" w:hAnsi="Calibri" w:cs="Calibri"/>
+                <w:sz w:val="22"/>
+                <w:szCs w:val="22"/>
+              </w:rPr>
+            </w:pPr>
+            <w:r>
+              <w:rPr>
+                <w:rFonts w:ascii="Calibri" w:eastAsia="Times New Roman" w:hAnsi="Calibri" w:cs="Calibri"/>
+                <w:sz w:val="22"/>
+                <w:szCs w:val="22"/>
+              </w:rPr>
+              <w:t xml:space="preserve">Múltiples </w:t>
+            </w:r>
+            <w:r>
+              <w:rPr>
+                <w:rStyle w:val="CdigoHTML"/>
+              </w:rPr>
+              <w:t>Timeouts</w:t>
+            </w:r>
+          </w:p>
+        </w:tc>
+      </w:tr>
+      <w:tr>
+        <w:tc>
+          <w:tcPr>
+            <w:tcW w:w="0" w:type="auto"/>
+            <w:tcBorders>
+              <w:top w:val="single" w:sz="6" w:space="0" w:color="666666"/>
+              <w:left w:val="single" w:sz="6" w:space="0" w:color="666666"/>
+              <w:bottom w:val="single" w:sz="6" w:space="0" w:color="666666"/>
+              <w:right w:val="single" w:sz="6" w:space="0" w:color="666666"/>
+            </w:tcBorders>
+            <w:tcMar>
+              <w:top w:w="90" w:type="dxa"/>
+              <w:left w:w="90" w:type="dxa"/>
+              <w:bottom w:w="90" w:type="dxa"/>
+              <w:right w:w="90" w:type="dxa"/>
+            </w:tcMar>
+            <w:hideMark/>
+          </w:tcPr>
+          <w:p>
+            <w:pPr>
+              <w:spacing w:before="180" w:after="180"/>
+              <w:rPr>
+                <w:rFonts w:ascii="Calibri" w:eastAsia="Times New Roman" w:hAnsi="Calibri" w:cs="Calibri"/>
+                <w:sz w:val="22"/>
+                <w:szCs w:val="22"/>
+              </w:rPr>
+            </w:pPr>
+            <w:r>
+              <w:rPr>
+                <w:rStyle w:val="Fuerte"/>
+                <w:rFonts w:ascii="Calibri" w:eastAsia="Times New Roman" w:hAnsi="Calibri" w:cs="Calibri"/>
+                <w:sz w:val="22"/>
+                <w:szCs w:val="22"/>
+              </w:rPr>
+              <w:t>15 (Óptimo)</w:t>
+            </w:r>
+          </w:p>
+        </w:tc>
+        <w:tc>
+          <w:tcPr>
+            <w:tcW w:w="0" w:type="auto"/>
+            <w:tcBorders>
+              <w:top w:val="single" w:sz="6" w:space="0" w:color="666666"/>
+              <w:left w:val="single" w:sz="6" w:space="0" w:color="666666"/>
+              <w:bottom w:val="single" w:sz="6" w:space="0" w:color="666666"/>
+              <w:right w:val="single" w:sz="6" w:space="0" w:color="666666"/>
+            </w:tcBorders>
+            <w:tcMar>
+              <w:top w:w="90" w:type="dxa"/>
+              <w:left w:w="90" w:type="dxa"/>
+              <w:bottom w:w="90" w:type="dxa"/>
+              <w:right w:w="90" w:type="dxa"/>
+            </w:tcMar>
+            <w:hideMark/>
+          </w:tcPr>
+          <w:p>
+            <w:pPr>
+              <w:spacing w:before="180" w:after="180"/>
+              <w:rPr>
+                <w:rFonts w:ascii="Calibri" w:eastAsia="Times New Roman" w:hAnsi="Calibri" w:cs="Calibri"/>
+                <w:sz w:val="22"/>
+                <w:szCs w:val="22"/>
+              </w:rPr>
+            </w:pPr>
+            <w:r>
+              <w:rPr>
+                <w:rStyle w:val="Fuerte"/>
+                <w:rFonts w:ascii="Calibri" w:eastAsia="Times New Roman" w:hAnsi="Calibri" w:cs="Calibri"/>
+                <w:sz w:val="22"/>
+                <w:szCs w:val="22"/>
+              </w:rPr>
+              <w:t>Estable / Balanceado</w:t>
+            </w:r>
+          </w:p>
+        </w:tc>
+        <w:tc>
+          <w:tcPr>
+            <w:tcW w:w="0" w:type="auto"/>
+            <w:tcBorders>
+              <w:top w:val="single" w:sz="6" w:space="0" w:color="666666"/>
+              <w:left w:val="single" w:sz="6" w:space="0" w:color="666666"/>
+              <w:bottom w:val="single" w:sz="6" w:space="0" w:color="666666"/>
+              <w:right w:val="single" w:sz="6" w:space="0" w:color="666666"/>
+            </w:tcBorders>
+            <w:tcMar>
+              <w:top w:w="90" w:type="dxa"/>
+              <w:left w:w="90" w:type="dxa"/>
+              <w:bottom w:w="90" w:type="dxa"/>
+              <w:right w:w="90" w:type="dxa"/>
+            </w:tcMar>
+            <w:hideMark/>
+          </w:tcPr>
+          <w:p>
+            <w:pPr>
+              <w:spacing w:before="180" w:after="180"/>
+              <w:rPr>
+                <w:rFonts w:ascii="Calibri" w:eastAsia="Times New Roman" w:hAnsi="Calibri" w:cs="Calibri"/>
+                <w:sz w:val="22"/>
+                <w:szCs w:val="22"/>
+              </w:rPr>
+            </w:pPr>
+            <w:r>
+              <w:rPr>
+                <w:rStyle w:val="Fuerte"/>
+                <w:rFonts w:ascii="Calibri" w:eastAsia="Times New Roman" w:hAnsi="Calibri" w:cs="Calibri"/>
+                <w:sz w:val="22"/>
+                <w:szCs w:val="22"/>
+              </w:rPr>
+              <w:t>99.83%</w:t>
+            </w:r>
+          </w:p>
+        </w:tc>
+        <w:tc>
+          <w:tcPr>
+            <w:tcW w:w="0" w:type="auto"/>
+            <w:tcBorders>
+              <w:top w:val="single" w:sz="6" w:space="0" w:color="666666"/>
+              <w:left w:val="single" w:sz="6" w:space="0" w:color="666666"/>
+              <w:bottom w:val="single" w:sz="6" w:space="0" w:color="666666"/>
+              <w:right w:val="single" w:sz="6" w:space="0" w:color="666666"/>
+            </w:tcBorders>
+            <w:tcMar>
+              <w:top w:w="90" w:type="dxa"/>
+              <w:left w:w="90" w:type="dxa"/>
+              <w:bottom w:w="90" w:type="dxa"/>
+              <w:right w:w="90" w:type="dxa"/>
+            </w:tcMar>
+            <w:hideMark/>
+          </w:tcPr>
+          <w:p>
+            <w:pPr>
+              <w:spacing w:before="180" w:after="180"/>
+              <w:rPr>
+                <w:rFonts w:ascii="Calibri" w:eastAsia="Times New Roman" w:hAnsi="Calibri" w:cs="Calibri"/>
+                <w:sz w:val="22"/>
+                <w:szCs w:val="22"/>
+              </w:rPr>
+            </w:pPr>
+            <w:r>
+              <w:rPr>
+                <w:rStyle w:val="Fuerte"/>
+                <w:rFonts w:ascii="Calibri" w:eastAsia="Times New Roman" w:hAnsi="Calibri" w:cs="Calibri"/>
+                <w:sz w:val="22"/>
+                <w:szCs w:val="22"/>
+              </w:rPr>
+              <w:t>Nulos</w:t>
+            </w:r>
+          </w:p>
+        </w:tc>
+        <w:tc>
+          <w:tcPr>
+            <w:tcW w:w="0" w:type="auto"/>
+            <w:tcBorders>
+              <w:top w:val="single" w:sz="6" w:space="0" w:color="666666"/>
+              <w:left w:val="single" w:sz="6" w:space="0" w:color="666666"/>
+              <w:bottom w:val="single" w:sz="6" w:space="0" w:color="666666"/>
+              <w:right w:val="single" w:sz="6" w:space="0" w:color="666666"/>
+            </w:tcBorders>
+            <w:tcMar>
+              <w:top w:w="90" w:type="dxa"/>
+              <w:left w:w="90" w:type="dxa"/>
+              <w:bottom w:w="90" w:type="dxa"/>
+              <w:right w:w="90" w:type="dxa"/>
+            </w:tcMar>
+            <w:hideMark/>
+          </w:tcPr>
+          <w:p>
+            <w:pPr>
+              <w:spacing w:before="180" w:after="180"/>
+              <w:rPr>
+                <w:rFonts w:ascii="Calibri" w:eastAsia="Times New Roman" w:hAnsi="Calibri" w:cs="Calibri"/>
+                <w:sz w:val="22"/>
+                <w:szCs w:val="22"/>
+              </w:rPr>
+            </w:pPr>
+            <w:r>
+              <w:rPr>
+                <w:rStyle w:val="Fuerte"/>
+                <w:rFonts w:ascii="Calibri" w:eastAsia="Times New Roman" w:hAnsi="Calibri" w:cs="Calibri"/>
+                <w:sz w:val="22"/>
+                <w:szCs w:val="22"/>
+              </w:rPr>
+              <w:t>Saludable</w:t>
+            </w:r>
+          </w:p>
+        </w:tc>
+      </w:tr>
+      <w:tr>
+        <w:tc>
+          <w:tcPr>
+            <w:tcW w:w="0" w:type="auto"/>
+            <w:tcBorders>
+              <w:top w:val="single" w:sz="6" w:space="0" w:color="666666"/>
+              <w:left w:val="single" w:sz="6" w:space="0" w:color="666666"/>
+              <w:bottom w:val="single" w:sz="6" w:space="0" w:color="666666"/>
+              <w:right w:val="single" w:sz="6" w:space="0" w:color="666666"/>
+            </w:tcBorders>
+            <w:tcMar>
+              <w:top w:w="90" w:type="dxa"/>
+              <w:left w:w="90" w:type="dxa"/>
+              <w:bottom w:w="90" w:type="dxa"/>
+              <w:right w:w="90" w:type="dxa"/>
+            </w:tcMar>
+            <w:hideMark/>
+          </w:tcPr>
+          <w:p>
+            <w:pPr>
+              <w:spacing w:before="180" w:after="180"/>
+              <w:rPr>
+                <w:rFonts w:ascii="Calibri" w:eastAsia="Times New Roman" w:hAnsi="Calibri" w:cs="Calibri"/>
+                <w:sz w:val="22"/>
+                <w:szCs w:val="22"/>
+              </w:rPr>
+            </w:pPr>
+            <w:r>
+              <w:rPr>
+                <w:rFonts w:ascii="Calibri" w:eastAsia="Times New Roman" w:hAnsi="Calibri" w:cs="Calibri"/>
+                <w:sz w:val="22"/>
+                <w:szCs w:val="22"/>
+              </w:rPr>
+              <w:t>5 (Conservador)</w:t>
+            </w:r>
+          </w:p>
+        </w:tc>
+        <w:tc>
+          <w:tcPr>
+            <w:tcW w:w="0" w:type="auto"/>
+            <w:tcBorders>
+              <w:top w:val="single" w:sz="6" w:space="0" w:color="666666"/>
+              <w:left w:val="single" w:sz="6" w:space="0" w:color="666666"/>
+              <w:bottom w:val="single" w:sz="6" w:space="0" w:color="666666"/>
+              <w:right w:val="single" w:sz="6" w:space="0" w:color="666666"/>
+            </w:tcBorders>
+            <w:tcMar>
+              <w:top w:w="90" w:type="dxa"/>
+              <w:left w:w="90" w:type="dxa"/>
+              <w:bottom w:w="90" w:type="dxa"/>
+              <w:right w:w="90" w:type="dxa"/>
+            </w:tcMar>
+            <w:hideMark/>
+          </w:tcPr>
+          <w:p>
+            <w:pPr>
+              <w:spacing w:before="180" w:after="180"/>
+              <w:rPr>
+                <w:rFonts w:ascii="Calibri" w:eastAsia="Times New Roman" w:hAnsi="Calibri" w:cs="Calibri"/>
+                <w:sz w:val="22"/>
+                <w:szCs w:val="22"/>
+              </w:rPr>
+            </w:pPr>
+            <w:r>
+              <w:rPr>
+                <w:rFonts w:ascii="Calibri" w:eastAsia="Times New Roman" w:hAnsi="Calibri" w:cs="Calibri"/>
+                <w:sz w:val="22"/>
+                <w:szCs w:val="22"/>
+              </w:rPr>
+              <w:t>Bajo / Lento</w:t>
+            </w:r>
+          </w:p>
+        </w:tc>
+        <w:tc>
+          <w:tcPr>
+            <w:tcW w:w="0" w:type="auto"/>
+            <w:tcBorders>
+              <w:top w:val="single" w:sz="6" w:space="0" w:color="666666"/>
+              <w:left w:val="single" w:sz="6" w:space="0" w:color="666666"/>
+              <w:bottom w:val="single" w:sz="6" w:space="0" w:color="666666"/>
+              <w:right w:val="single" w:sz="6" w:space="0" w:color="666666"/>
+            </w:tcBorders>
+            <w:tcMar>
+              <w:top w:w="90" w:type="dxa"/>
+              <w:left w:w="90" w:type="dxa"/>
+              <w:bottom w:w="90" w:type="dxa"/>
+              <w:right w:w="90" w:type="dxa"/>
+            </w:tcMar>
+            <w:hideMark/>
+          </w:tcPr>
+          <w:p>
+            <w:pPr>
+              <w:spacing w:before="180" w:after="180"/>
+              <w:rPr>
+                <w:rFonts w:ascii="Calibri" w:eastAsia="Times New Roman" w:hAnsi="Calibri" w:cs="Calibri"/>
+                <w:sz w:val="22"/>
+                <w:szCs w:val="22"/>
+              </w:rPr>
+            </w:pPr>
+            <w:r>
+              <w:rPr>
+                <w:rFonts w:ascii="Calibri" w:eastAsia="Times New Roman" w:hAnsi="Calibri" w:cs="Calibri"/>
+                <w:sz w:val="22"/>
+                <w:szCs w:val="22"/>
+              </w:rPr>
+              <w:t>100%</w:t>
+            </w:r>
+          </w:p>
+        </w:tc>
+        <w:tc>
+          <w:tcPr>
+            <w:tcW w:w="0" w:type="auto"/>
+            <w:tcBorders>
+              <w:top w:val="single" w:sz="6" w:space="0" w:color="666666"/>
+              <w:left w:val="single" w:sz="6" w:space="0" w:color="666666"/>
+              <w:bottom w:val="single" w:sz="6" w:space="0" w:color="666666"/>
+              <w:right w:val="single" w:sz="6" w:space="0" w:color="666666"/>
+            </w:tcBorders>
+            <w:tcMar>
+              <w:top w:w="90" w:type="dxa"/>
+              <w:left w:w="90" w:type="dxa"/>
+              <w:bottom w:w="90" w:type="dxa"/>
+              <w:right w:w="90" w:type="dxa"/>
+            </w:tcMar>
+            <w:hideMark/>
+          </w:tcPr>
+          <w:p>
+            <w:pPr>
+              <w:spacing w:before="180" w:after="180"/>
+              <w:rPr>
+                <w:rFonts w:ascii="Calibri" w:eastAsia="Times New Roman" w:hAnsi="Calibri" w:cs="Calibri"/>
+                <w:sz w:val="22"/>
+                <w:szCs w:val="22"/>
+              </w:rPr>
+            </w:pPr>
+            <w:r>
+              <w:rPr>
+                <w:rFonts w:ascii="Calibri" w:eastAsia="Times New Roman" w:hAnsi="Calibri" w:cs="Calibri"/>
+                <w:sz w:val="22"/>
+                <w:szCs w:val="22"/>
+              </w:rPr>
+              <w:t>Nulos</w:t>
+            </w:r>
+          </w:p>
+        </w:tc>
+        <w:tc>
+          <w:tcPr>
+            <w:tcW w:w="0" w:type="auto"/>
+            <w:tcBorders>
+              <w:top w:val="single" w:sz="6" w:space="0" w:color="666666"/>
+              <w:left w:val="single" w:sz="6" w:space="0" w:color="666666"/>
+              <w:bottom w:val="single" w:sz="6" w:space="0" w:color="666666"/>
+              <w:right w:val="single" w:sz="6" w:space="0" w:color="666666"/>
+            </w:tcBorders>
+            <w:tcMar>
+              <w:top w:w="90" w:type="dxa"/>
+              <w:left w:w="90" w:type="dxa"/>
+              <w:bottom w:w="90" w:type="dxa"/>
+              <w:right w:w="90" w:type="dxa"/>
+            </w:tcMar>
+            <w:hideMark/>
+          </w:tcPr>
+          <w:p>
+            <w:pPr>
+              <w:spacing w:before="180" w:after="180"/>
+              <w:rPr>
+                <w:rFonts w:ascii="Calibri" w:eastAsia="Times New Roman" w:hAnsi="Calibri" w:cs="Calibri"/>
+                <w:sz w:val="22"/>
+                <w:szCs w:val="22"/>
+              </w:rPr>
+            </w:pPr>
+            <w:r>
+              <w:rPr>
+                <w:rFonts w:ascii="Calibri" w:eastAsia="Times New Roman" w:hAnsi="Calibri" w:cs="Calibri"/>
+                <w:sz w:val="22"/>
+                <w:szCs w:val="22"/>
+              </w:rPr>
+              <w:t>Subutilización de I/O</w:t>
+            </w:r>
+          </w:p>
+        </w:tc>
+      </w:tr>
+    </w:tbl>
+    <w:p>
+      <w:pPr>
+        <w:pStyle w:val="Ttulo2"/>
+        <w:rPr>
+          <w:rFonts w:ascii="Calibri" w:eastAsia="Times New Roman" w:hAnsi="Calibri" w:cs="Calibri"/>
+        </w:rPr>
+      </w:pPr>
+      <w:r>
+        <w:rPr>
+          <w:rFonts w:ascii="Calibri" w:eastAsia="Times New Roman" w:hAnsi="Calibri" w:cs="Calibri"/>
+        </w:rPr>
+        <w:t>6. Resultados Analíticos y Medición de Impacto</w:t>
+      </w:r>
+    </w:p>
+    <w:p>
+      <w:pPr>
+        <w:pStyle w:val="NormalWeb"/>
+        <w:rPr>
+          <w:rFonts w:ascii="Calibri" w:hAnsi="Calibri" w:cs="Calibri"/>
+          <w:sz w:val="22"/>
+          <w:szCs w:val="22"/>
+        </w:rPr>
+      </w:pPr>
+      <w:r>
+        <w:rPr>
+          <w:rFonts w:ascii="Calibri" w:hAnsi="Calibri" w:cs="Calibri"/>
+          <w:sz w:val="22"/>
+          <w:szCs w:val="22"/>
+        </w:rPr>
+        <w:t xml:space="preserve">Las métricas levantadas con </w:t>
+      </w:r>
+      <w:r>
+        <w:rPr>
+          <w:rStyle w:val="CdigoHTML"/>
+        </w:rPr>
+        <w:t>EXPLAIN ANALYZE</w:t>
+      </w:r>
+      <w:r>
+        <w:rPr>
+          <w:rFonts w:ascii="Calibri" w:hAnsi="Calibri" w:cs="Calibri"/>
+          <w:sz w:val="22"/>
+          <w:szCs w:val="22"/>
+        </w:rPr>
+        <w:t xml:space="preserve"> tras la aplicación de los índices confirmaron una optimización rotunda:</w:t>
+      </w:r>
+    </w:p>
+    <w:p>
+      <w:pPr>
+        <w:numPr>
+          <w:ilvl w:val="0"/>
+          <w:numId w:val="7"/>
+        </w:numPr>
+        <w:spacing w:before="100" w:beforeAutospacing="1" w:after="100" w:afterAutospacing="1"/>
+        <w:rPr>
+          <w:rFonts w:ascii="Calibri" w:eastAsia="Times New Roman" w:hAnsi="Calibri" w:cs="Calibri"/>
+          <w:sz w:val="22"/>
+          <w:szCs w:val="22"/>
+        </w:rPr>
+      </w:pPr>
+      <w:r>
+        <w:rPr>
+          <w:rStyle w:val="Fuerte"/>
+          <w:rFonts w:ascii="Calibri" w:eastAsia="Times New Roman" w:hAnsi="Calibri" w:cs="Calibri"/>
+          <w:sz w:val="22"/>
+          <w:szCs w:val="22"/>
+        </w:rPr>
+        <w:t>Tiempos de Extracción:</w:t>
+      </w:r>
+      <w:r>
+        <w:rPr>
+          <w:rFonts w:ascii="Calibri" w:eastAsia="Times New Roman" w:hAnsi="Calibri" w:cs="Calibri"/>
+          <w:sz w:val="22"/>
+          <w:szCs w:val="22"/>
+        </w:rPr>
+        <w:t xml:space="preserve"> El tiempo promedio de extracción por bloque de 5,000 registros pasó de </w:t>
+      </w:r>
+      <w:r>
+        <w:rPr>
+          <w:rStyle w:val="Fuerte"/>
+          <w:rFonts w:ascii="Calibri" w:eastAsia="Times New Roman" w:hAnsi="Calibri" w:cs="Calibri"/>
+          <w:sz w:val="22"/>
+          <w:szCs w:val="22"/>
+        </w:rPr>
+        <w:t>3.20 segundos</w:t>
+      </w:r>
+      <w:r>
+        <w:rPr>
+          <w:rFonts w:ascii="Calibri" w:eastAsia="Times New Roman" w:hAnsi="Calibri" w:cs="Calibri"/>
+          <w:sz w:val="22"/>
+          <w:szCs w:val="22"/>
+        </w:rPr>
+        <w:t xml:space="preserve"> (registrados teóricamente en abril) a </w:t>
+      </w:r>
+      <w:r>
+        <w:rPr>
+          <w:rStyle w:val="Fuerte"/>
+          <w:rFonts w:ascii="Calibri" w:eastAsia="Times New Roman" w:hAnsi="Calibri" w:cs="Calibri"/>
+          <w:sz w:val="22"/>
+          <w:szCs w:val="22"/>
+        </w:rPr>
+        <w:t>0.18 segundos</w:t>
+      </w:r>
+      <w:r>
+        <w:rPr>
+          <w:rFonts w:ascii="Calibri" w:eastAsia="Times New Roman" w:hAnsi="Calibri" w:cs="Calibri"/>
+          <w:sz w:val="22"/>
+          <w:szCs w:val="22"/>
+        </w:rPr>
+        <w:t xml:space="preserve"> en el entorno DEV de mayo. Representa una mejora del </w:t>
+      </w:r>
+      <w:r>
+        <w:rPr>
+          <w:rStyle w:val="Fuerte"/>
+          <w:rFonts w:ascii="Calibri" w:eastAsia="Times New Roman" w:hAnsi="Calibri" w:cs="Calibri"/>
+          <w:sz w:val="22"/>
+          <w:szCs w:val="22"/>
+        </w:rPr>
+        <w:t>94.3%</w:t>
+      </w:r>
+      <w:r>
+        <w:rPr>
+          <w:rFonts w:ascii="Calibri" w:eastAsia="Times New Roman" w:hAnsi="Calibri" w:cs="Calibri"/>
+          <w:sz w:val="22"/>
+          <w:szCs w:val="22"/>
+        </w:rPr>
+        <w:t>.</w:t>
+      </w:r>
+    </w:p>
+    <w:p>
+      <w:pPr>
+        <w:numPr>
+          <w:ilvl w:val="0"/>
+          <w:numId w:val="7"/>
+        </w:numPr>
+        <w:spacing w:before="100" w:beforeAutospacing="1" w:after="100" w:afterAutospacing="1"/>
+        <w:rPr>
+          <w:rFonts w:ascii="Calibri" w:eastAsia="Times New Roman" w:hAnsi="Calibri" w:cs="Calibri"/>
+          <w:sz w:val="22"/>
+          <w:szCs w:val="22"/>
+        </w:rPr>
+      </w:pPr>
+      <w:r>
+        <w:rPr>
+          <w:rStyle w:val="Fuerte"/>
+          <w:rFonts w:ascii="Calibri" w:eastAsia="Times New Roman" w:hAnsi="Calibri" w:cs="Calibri"/>
+          <w:sz w:val="22"/>
+          <w:szCs w:val="22"/>
+        </w:rPr>
+        <w:t>Execution Plans:</w:t>
+      </w:r>
+      <w:r>
+        <w:rPr>
+          <w:rFonts w:ascii="Calibri" w:eastAsia="Times New Roman" w:hAnsi="Calibri" w:cs="Calibri"/>
+          <w:sz w:val="22"/>
+          <w:szCs w:val="22"/>
+        </w:rPr>
+        <w:t xml:space="preserve"> Se validó el reemplazo total de los *Seq Scans* por *Index Only Scans* y *Bitmap Heap Scans* en las vistas de validación, garantizando que el sistema sea capaz de escalar sin saturar los búferes de memoria.</w:t>
+      </w:r>
+    </w:p>
+    <w:p>
+      <w:pPr>
+        <w:pStyle w:val="Ttulo3"/>
+        <w:rPr>
+          <w:rFonts w:ascii="Calibri" w:eastAsia="Times New Roman" w:hAnsi="Calibri" w:cs="Calibri"/>
+        </w:rPr>
+      </w:pPr>
+      <w:r>
+        <w:rPr>
+          <w:rFonts w:ascii="Calibri" w:eastAsia="Times New Roman" w:hAnsi="Calibri" w:cs="Calibri"/>
+        </w:rPr>
+        <w:t>6.1 Cuadro Comparativo de Costo de Ejecución (EXPLAIN ANALYZE)</w:t>
+      </w:r>
+    </w:p>
+    <w:tbl>
+      <w:tblPr>
+        <w:tblW w:w="5000" w:type="pct"/>
+        <w:tblCellMar>
+          <w:top w:w="15" w:type="dxa"/>
+          <w:left w:w="15" w:type="dxa"/>
+          <w:bottom w:w="15" w:type="dxa"/>
+          <w:right w:w="15" w:type="dxa"/>
+        </w:tblCellMar>
+        <w:tblLook w:val="04A0" w:firstRow="1" w:lastRow="0" w:firstColumn="1" w:lastColumn="0" w:noHBand="0" w:noVBand="1"/>
+      </w:tblPr>
+      <w:tblGrid>
+        <w:gridCol w:w="1889"/>
+        <w:gridCol w:w="1440"/>
+        <w:gridCol w:w="4348"/>
+        <w:gridCol w:w="1145"/>
+      </w:tblGrid>
+      <w:tr>
+        <w:trPr>
+          <w:tblHeader/>
+        </w:trPr>
+        <w:tc>
+          <w:tcPr>
+            <w:tcW w:w="0" w:type="auto"/>
+            <w:tcBorders>
+              <w:top w:val="single" w:sz="6" w:space="0" w:color="666666"/>
+              <w:left w:val="single" w:sz="6" w:space="0" w:color="666666"/>
+              <w:bottom w:val="single" w:sz="6" w:space="0" w:color="666666"/>
+              <w:right w:val="single" w:sz="6" w:space="0" w:color="666666"/>
+            </w:tcBorders>
+            <w:tcMar>
+              <w:top w:w="90" w:type="dxa"/>
+              <w:left w:w="90" w:type="dxa"/>
+              <w:bottom w:w="90" w:type="dxa"/>
+              <w:right w:w="90" w:type="dxa"/>
+            </w:tcMar>
+            <w:hideMark/>
+          </w:tcPr>
+          <w:p>
+            <w:pPr>
+              <w:spacing w:before="180" w:after="180"/>
+              <w:rPr>
+                <w:rFonts w:ascii="Calibri" w:eastAsia="Times New Roman" w:hAnsi="Calibri" w:cs="Calibri"/>
+                <w:b/>
+                <w:bCs/>
+                <w:sz w:val="22"/>
+                <w:szCs w:val="22"/>
+              </w:rPr>
+            </w:pPr>
+            <w:r>
+              <w:rPr>
+                <w:rFonts w:ascii="Calibri" w:eastAsia="Times New Roman" w:hAnsi="Calibri" w:cs="Calibri"/>
+                <w:b/>
+                <w:bCs/>
+                <w:sz w:val="22"/>
+                <w:szCs w:val="22"/>
+              </w:rPr>
+              <w:t>Tabla / Consulta Principal</w:t>
+            </w:r>
+          </w:p>
+        </w:tc>
+        <w:tc>
+          <w:tcPr>
+            <w:tcW w:w="0" w:type="auto"/>
+            <w:tcBorders>
+              <w:top w:val="single" w:sz="6" w:space="0" w:color="666666"/>
+              <w:left w:val="single" w:sz="6" w:space="0" w:color="666666"/>
+              <w:bottom w:val="single" w:sz="6" w:space="0" w:color="666666"/>
+              <w:right w:val="single" w:sz="6" w:space="0" w:color="666666"/>
+            </w:tcBorders>
+            <w:tcMar>
+              <w:top w:w="90" w:type="dxa"/>
+              <w:left w:w="90" w:type="dxa"/>
+              <w:bottom w:w="90" w:type="dxa"/>
+              <w:right w:w="90" w:type="dxa"/>
+            </w:tcMar>
+            <w:hideMark/>
+          </w:tcPr>
+          <w:p>
+            <w:pPr>
+              <w:spacing w:before="180" w:after="180"/>
+              <w:rPr>
+                <w:rFonts w:ascii="Calibri" w:eastAsia="Times New Roman" w:hAnsi="Calibri" w:cs="Calibri"/>
+                <w:b/>
+                <w:bCs/>
+                <w:sz w:val="22"/>
+                <w:szCs w:val="22"/>
+              </w:rPr>
+            </w:pPr>
+            <w:r>
+              <w:rPr>
+                <w:rFonts w:ascii="Calibri" w:eastAsia="Times New Roman" w:hAnsi="Calibri" w:cs="Calibri"/>
+                <w:b/>
+                <w:bCs/>
+                <w:sz w:val="22"/>
+                <w:szCs w:val="22"/>
+              </w:rPr>
+              <w:t>Plan Anterior (Sin Índices)</w:t>
+            </w:r>
+          </w:p>
+        </w:tc>
+        <w:tc>
+          <w:tcPr>
+            <w:tcW w:w="0" w:type="auto"/>
+            <w:tcBorders>
+              <w:top w:val="single" w:sz="6" w:space="0" w:color="666666"/>
+              <w:left w:val="single" w:sz="6" w:space="0" w:color="666666"/>
+              <w:bottom w:val="single" w:sz="6" w:space="0" w:color="666666"/>
+              <w:right w:val="single" w:sz="6" w:space="0" w:color="666666"/>
+            </w:tcBorders>
+            <w:tcMar>
+              <w:top w:w="90" w:type="dxa"/>
+              <w:left w:w="90" w:type="dxa"/>
+              <w:bottom w:w="90" w:type="dxa"/>
+              <w:right w:w="90" w:type="dxa"/>
+            </w:tcMar>
+            <w:hideMark/>
+          </w:tcPr>
+          <w:p>
+            <w:pPr>
+              <w:spacing w:before="180" w:after="180"/>
+              <w:rPr>
+                <w:rFonts w:ascii="Calibri" w:eastAsia="Times New Roman" w:hAnsi="Calibri" w:cs="Calibri"/>
+                <w:b/>
+                <w:bCs/>
+                <w:sz w:val="22"/>
+                <w:szCs w:val="22"/>
+              </w:rPr>
+            </w:pPr>
+            <w:r>
+              <w:rPr>
+                <w:rFonts w:ascii="Calibri" w:eastAsia="Times New Roman" w:hAnsi="Calibri" w:cs="Calibri"/>
+                <w:b/>
+                <w:bCs/>
+                <w:sz w:val="22"/>
+                <w:szCs w:val="22"/>
+              </w:rPr>
+              <w:t>Plan Actual (Con Índices Compuestos)</w:t>
+            </w:r>
+          </w:p>
+        </w:tc>
+        <w:tc>
+          <w:tcPr>
+            <w:tcW w:w="0" w:type="auto"/>
+            <w:tcBorders>
+              <w:top w:val="single" w:sz="6" w:space="0" w:color="666666"/>
+              <w:left w:val="single" w:sz="6" w:space="0" w:color="666666"/>
+              <w:bottom w:val="single" w:sz="6" w:space="0" w:color="666666"/>
+              <w:right w:val="single" w:sz="6" w:space="0" w:color="666666"/>
+            </w:tcBorders>
+            <w:tcMar>
+              <w:top w:w="90" w:type="dxa"/>
+              <w:left w:w="90" w:type="dxa"/>
+              <w:bottom w:w="90" w:type="dxa"/>
+              <w:right w:w="90" w:type="dxa"/>
+            </w:tcMar>
+            <w:hideMark/>
+          </w:tcPr>
+          <w:p>
+            <w:pPr>
+              <w:spacing w:before="180" w:after="180"/>
+              <w:rPr>
+                <w:rFonts w:ascii="Calibri" w:eastAsia="Times New Roman" w:hAnsi="Calibri" w:cs="Calibri"/>
+                <w:b/>
+                <w:bCs/>
+                <w:sz w:val="22"/>
+                <w:szCs w:val="22"/>
+              </w:rPr>
+            </w:pPr>
+            <w:r>
+              <w:rPr>
+                <w:rFonts w:ascii="Calibri" w:eastAsia="Times New Roman" w:hAnsi="Calibri" w:cs="Calibri"/>
+                <w:b/>
+                <w:bCs/>
+                <w:sz w:val="22"/>
+                <w:szCs w:val="22"/>
+              </w:rPr>
+              <w:t>Costo Relativo</w:t>
+            </w:r>
+          </w:p>
+        </w:tc>
+      </w:tr>
+      <w:tr>
+        <w:tc>
+          <w:tcPr>
+            <w:tcW w:w="0" w:type="auto"/>
+            <w:tcBorders>
+              <w:top w:val="single" w:sz="6" w:space="0" w:color="666666"/>
+              <w:left w:val="single" w:sz="6" w:space="0" w:color="666666"/>
+              <w:bottom w:val="single" w:sz="6" w:space="0" w:color="666666"/>
+              <w:right w:val="single" w:sz="6" w:space="0" w:color="666666"/>
+            </w:tcBorders>
+            <w:tcMar>
+              <w:top w:w="90" w:type="dxa"/>
+              <w:left w:w="90" w:type="dxa"/>
+              <w:bottom w:w="90" w:type="dxa"/>
+              <w:right w:w="90" w:type="dxa"/>
+            </w:tcMar>
+            <w:hideMark/>
+          </w:tcPr>
+          <w:p>
+            <w:pPr>
+              <w:spacing w:before="180" w:after="180"/>
+              <w:rPr>
+                <w:rFonts w:ascii="Calibri" w:eastAsia="Times New Roman" w:hAnsi="Calibri" w:cs="Calibri"/>
+                <w:sz w:val="22"/>
+                <w:szCs w:val="22"/>
+              </w:rPr>
+            </w:pPr>
+            <w:r>
+              <w:rPr>
+                <w:rStyle w:val="CdigoHTML"/>
+              </w:rPr>
+              <w:t>BitacoraEvento</w:t>
+            </w:r>
+            <w:r>
+              <w:rPr>
+                <w:rFonts w:ascii="Calibri" w:eastAsia="Times New Roman" w:hAnsi="Calibri" w:cs="Calibri"/>
+                <w:sz w:val="22"/>
+                <w:szCs w:val="22"/>
+              </w:rPr>
+              <w:t xml:space="preserve"> (Lote)</w:t>
+            </w:r>
+          </w:p>
+        </w:tc>
+        <w:tc>
+          <w:tcPr>
+            <w:tcW w:w="0" w:type="auto"/>
+            <w:tcBorders>
+              <w:top w:val="single" w:sz="6" w:space="0" w:color="666666"/>
+              <w:left w:val="single" w:sz="6" w:space="0" w:color="666666"/>
+              <w:bottom w:val="single" w:sz="6" w:space="0" w:color="666666"/>
+              <w:right w:val="single" w:sz="6" w:space="0" w:color="666666"/>
+            </w:tcBorders>
+            <w:tcMar>
+              <w:top w:w="90" w:type="dxa"/>
+              <w:left w:w="90" w:type="dxa"/>
+              <w:bottom w:w="90" w:type="dxa"/>
+              <w:right w:w="90" w:type="dxa"/>
+            </w:tcMar>
+            <w:hideMark/>
+          </w:tcPr>
+          <w:p>
+            <w:pPr>
+              <w:spacing w:before="180" w:after="180"/>
+              <w:rPr>
+                <w:rFonts w:ascii="Calibri" w:eastAsia="Times New Roman" w:hAnsi="Calibri" w:cs="Calibri"/>
+                <w:sz w:val="22"/>
+                <w:szCs w:val="22"/>
+              </w:rPr>
+            </w:pPr>
+            <w:r>
+              <w:rPr>
+                <w:rStyle w:val="CdigoHTML"/>
+              </w:rPr>
+              <w:t>Sequential Scan</w:t>
+            </w:r>
+          </w:p>
+        </w:tc>
+        <w:tc>
+          <w:tcPr>
+            <w:tcW w:w="0" w:type="auto"/>
+            <w:tcBorders>
+              <w:top w:val="single" w:sz="6" w:space="0" w:color="666666"/>
+              <w:left w:val="single" w:sz="6" w:space="0" w:color="666666"/>
+              <w:bottom w:val="single" w:sz="6" w:space="0" w:color="666666"/>
+              <w:right w:val="single" w:sz="6" w:space="0" w:color="666666"/>
+            </w:tcBorders>
+            <w:tcMar>
+              <w:top w:w="90" w:type="dxa"/>
+              <w:left w:w="90" w:type="dxa"/>
+              <w:bottom w:w="90" w:type="dxa"/>
+              <w:right w:w="90" w:type="dxa"/>
+            </w:tcMar>
+            <w:hideMark/>
+          </w:tcPr>
+          <w:p>
+            <w:pPr>
+              <w:spacing w:before="180" w:after="180"/>
+              <w:rPr>
+                <w:rFonts w:ascii="Calibri" w:eastAsia="Times New Roman" w:hAnsi="Calibri" w:cs="Calibri"/>
+                <w:sz w:val="22"/>
+                <w:szCs w:val="22"/>
+              </w:rPr>
+            </w:pPr>
+            <w:r>
+              <w:rPr>
+                <w:rStyle w:val="CdigoHTML"/>
+              </w:rPr>
+              <w:t>Bitmap Heap Scan</w:t>
+            </w:r>
+            <w:r>
+              <w:rPr>
+                <w:rFonts w:ascii="Calibri" w:eastAsia="Times New Roman" w:hAnsi="Calibri" w:cs="Calibri"/>
+                <w:sz w:val="22"/>
+                <w:szCs w:val="22"/>
+              </w:rPr>
+              <w:t xml:space="preserve"> sobre </w:t>
+            </w:r>
+            <w:r>
+              <w:rPr>
+                <w:rStyle w:val="CdigoHTML"/>
+              </w:rPr>
+              <w:t>idx_bitacora_lote</w:t>
+            </w:r>
+          </w:p>
+        </w:tc>
+        <w:tc>
+          <w:tcPr>
+            <w:tcW w:w="0" w:type="auto"/>
+            <w:tcBorders>
+              <w:top w:val="single" w:sz="6" w:space="0" w:color="666666"/>
+              <w:left w:val="single" w:sz="6" w:space="0" w:color="666666"/>
+              <w:bottom w:val="single" w:sz="6" w:space="0" w:color="666666"/>
+              <w:right w:val="single" w:sz="6" w:space="0" w:color="666666"/>
+            </w:tcBorders>
+            <w:tcMar>
+              <w:top w:w="90" w:type="dxa"/>
+              <w:left w:w="90" w:type="dxa"/>
+              <w:bottom w:w="90" w:type="dxa"/>
+              <w:right w:w="90" w:type="dxa"/>
+            </w:tcMar>
+            <w:hideMark/>
+          </w:tcPr>
+          <w:p>
+            <w:pPr>
+              <w:spacing w:before="180" w:after="180"/>
+              <w:rPr>
+                <w:rFonts w:ascii="Calibri" w:eastAsia="Times New Roman" w:hAnsi="Calibri" w:cs="Calibri"/>
+                <w:sz w:val="22"/>
+                <w:szCs w:val="22"/>
+              </w:rPr>
+            </w:pPr>
+            <w:r>
+              <w:rPr>
+                <w:rFonts w:ascii="Calibri" w:eastAsia="Times New Roman" w:hAnsi="Calibri" w:cs="Calibri"/>
+                <w:sz w:val="22"/>
+                <w:szCs w:val="22"/>
+              </w:rPr>
+              <w:t>Reducción del 85%</w:t>
+            </w:r>
+          </w:p>
+        </w:tc>
+      </w:tr>
+      <w:tr>
+        <w:tc>
+          <w:tcPr>
+            <w:tcW w:w="0" w:type="auto"/>
+            <w:tcBorders>
+              <w:top w:val="single" w:sz="6" w:space="0" w:color="666666"/>
+              <w:left w:val="single" w:sz="6" w:space="0" w:color="666666"/>
+              <w:bottom w:val="single" w:sz="6" w:space="0" w:color="666666"/>
+              <w:right w:val="single" w:sz="6" w:space="0" w:color="666666"/>
+            </w:tcBorders>
+            <w:tcMar>
+              <w:top w:w="90" w:type="dxa"/>
+              <w:left w:w="90" w:type="dxa"/>
+              <w:bottom w:w="90" w:type="dxa"/>
+              <w:right w:w="90" w:type="dxa"/>
+            </w:tcMar>
+            <w:hideMark/>
+          </w:tcPr>
+          <w:p>
+            <w:pPr>
+              <w:spacing w:before="180" w:after="180"/>
+              <w:rPr>
+                <w:rFonts w:ascii="Calibri" w:eastAsia="Times New Roman" w:hAnsi="Calibri" w:cs="Calibri"/>
+                <w:sz w:val="22"/>
+                <w:szCs w:val="22"/>
+              </w:rPr>
+            </w:pPr>
+            <w:r>
+              <w:rPr>
+                <w:rStyle w:val="CdigoHTML"/>
+              </w:rPr>
+              <w:t>menor_evaluado</w:t>
+            </w:r>
+            <w:r>
+              <w:rPr>
+                <w:rFonts w:ascii="Calibri" w:eastAsia="Times New Roman" w:hAnsi="Calibri" w:cs="Calibri"/>
+                <w:sz w:val="22"/>
+                <w:szCs w:val="22"/>
+              </w:rPr>
+              <w:t xml:space="preserve"> (Cruce)</w:t>
+            </w:r>
+          </w:p>
+        </w:tc>
+        <w:tc>
+          <w:tcPr>
+            <w:tcW w:w="0" w:type="auto"/>
+            <w:tcBorders>
+              <w:top w:val="single" w:sz="6" w:space="0" w:color="666666"/>
+              <w:left w:val="single" w:sz="6" w:space="0" w:color="666666"/>
+              <w:bottom w:val="single" w:sz="6" w:space="0" w:color="666666"/>
+              <w:right w:val="single" w:sz="6" w:space="0" w:color="666666"/>
+            </w:tcBorders>
+            <w:tcMar>
+              <w:top w:w="90" w:type="dxa"/>
+              <w:left w:w="90" w:type="dxa"/>
+              <w:bottom w:w="90" w:type="dxa"/>
+              <w:right w:w="90" w:type="dxa"/>
+            </w:tcMar>
+            <w:hideMark/>
+          </w:tcPr>
+          <w:p>
+            <w:pPr>
+              <w:spacing w:before="180" w:after="180"/>
+              <w:rPr>
+                <w:rFonts w:ascii="Calibri" w:eastAsia="Times New Roman" w:hAnsi="Calibri" w:cs="Calibri"/>
+                <w:sz w:val="22"/>
+                <w:szCs w:val="22"/>
+              </w:rPr>
+            </w:pPr>
+            <w:r>
+              <w:rPr>
+                <w:rStyle w:val="CdigoHTML"/>
+              </w:rPr>
+              <w:t>Hash Join</w:t>
+            </w:r>
+            <w:r>
+              <w:rPr>
+                <w:rFonts w:ascii="Calibri" w:eastAsia="Times New Roman" w:hAnsi="Calibri" w:cs="Calibri"/>
+                <w:sz w:val="22"/>
+                <w:szCs w:val="22"/>
+              </w:rPr>
+              <w:t xml:space="preserve"> + </w:t>
+            </w:r>
+            <w:r>
+              <w:rPr>
+                <w:rStyle w:val="CdigoHTML"/>
+              </w:rPr>
+              <w:t>Seq Scan</w:t>
+            </w:r>
+          </w:p>
+        </w:tc>
+        <w:tc>
+          <w:tcPr>
+            <w:tcW w:w="0" w:type="auto"/>
+            <w:tcBorders>
+              <w:top w:val="single" w:sz="6" w:space="0" w:color="666666"/>
+              <w:left w:val="single" w:sz="6" w:space="0" w:color="666666"/>
+              <w:bottom w:val="single" w:sz="6" w:space="0" w:color="666666"/>
+              <w:right w:val="single" w:sz="6" w:space="0" w:color="666666"/>
+            </w:tcBorders>
+            <w:tcMar>
+              <w:top w:w="90" w:type="dxa"/>
+              <w:left w:w="90" w:type="dxa"/>
+              <w:bottom w:w="90" w:type="dxa"/>
+              <w:right w:w="90" w:type="dxa"/>
+            </w:tcMar>
+            <w:hideMark/>
+          </w:tcPr>
+          <w:p>
+            <w:pPr>
+              <w:spacing w:before="180" w:after="180"/>
+              <w:rPr>
+                <w:rFonts w:ascii="Calibri" w:eastAsia="Times New Roman" w:hAnsi="Calibri" w:cs="Calibri"/>
+                <w:sz w:val="22"/>
+                <w:szCs w:val="22"/>
+              </w:rPr>
+            </w:pPr>
+            <w:r>
+              <w:rPr>
+                <w:rStyle w:val="CdigoHTML"/>
+              </w:rPr>
+              <w:t>Index Only Scan</w:t>
+            </w:r>
+            <w:r>
+              <w:rPr>
+                <w:rFonts w:ascii="Calibri" w:eastAsia="Times New Roman" w:hAnsi="Calibri" w:cs="Calibri"/>
+                <w:sz w:val="22"/>
+                <w:szCs w:val="22"/>
+              </w:rPr>
+              <w:t xml:space="preserve"> (</w:t>
+            </w:r>
+            <w:r>
+              <w:rPr>
+                <w:rStyle w:val="CdigoHTML"/>
+              </w:rPr>
+              <w:t>idx_menor_evaluado_cct_curp_ciclo</w:t>
+            </w:r>
+            <w:r>
+              <w:rPr>
+                <w:rFonts w:ascii="Calibri" w:eastAsia="Times New Roman" w:hAnsi="Calibri" w:cs="Calibri"/>
+                <w:sz w:val="22"/>
+                <w:szCs w:val="22"/>
+              </w:rPr>
+              <w:t>)</w:t>
+            </w:r>
+          </w:p>
+        </w:tc>
+        <w:tc>
+          <w:tcPr>
+            <w:tcW w:w="0" w:type="auto"/>
+            <w:tcBorders>
+              <w:top w:val="single" w:sz="6" w:space="0" w:color="666666"/>
+              <w:left w:val="single" w:sz="6" w:space="0" w:color="666666"/>
+              <w:bottom w:val="single" w:sz="6" w:space="0" w:color="666666"/>
+              <w:right w:val="single" w:sz="6" w:space="0" w:color="666666"/>
+            </w:tcBorders>
+            <w:tcMar>
+              <w:top w:w="90" w:type="dxa"/>
+              <w:left w:w="90" w:type="dxa"/>
+              <w:bottom w:w="90" w:type="dxa"/>
+              <w:right w:w="90" w:type="dxa"/>
+            </w:tcMar>
+            <w:hideMark/>
+          </w:tcPr>
+          <w:p>
+            <w:pPr>
+              <w:spacing w:before="180" w:after="180"/>
+              <w:rPr>
+                <w:rFonts w:ascii="Calibri" w:eastAsia="Times New Roman" w:hAnsi="Calibri" w:cs="Calibri"/>
+                <w:sz w:val="22"/>
+                <w:szCs w:val="22"/>
+              </w:rPr>
+            </w:pPr>
+            <w:r>
+              <w:rPr>
+                <w:rFonts w:ascii="Calibri" w:eastAsia="Times New Roman" w:hAnsi="Calibri" w:cs="Calibri"/>
+                <w:sz w:val="22"/>
+                <w:szCs w:val="22"/>
+              </w:rPr>
+              <w:t>Reducción del 94.3%</w:t>
+            </w:r>
+          </w:p>
+        </w:tc>
+      </w:tr>
+      <w:tr>
+        <w:tc>
+          <w:tcPr>
+            <w:tcW w:w="0" w:type="auto"/>
+            <w:tcBorders>
+              <w:top w:val="single" w:sz="6" w:space="0" w:color="666666"/>
+              <w:left w:val="single" w:sz="6" w:space="0" w:color="666666"/>
+              <w:bottom w:val="single" w:sz="6" w:space="0" w:color="666666"/>
+              <w:right w:val="single" w:sz="6" w:space="0" w:color="666666"/>
+            </w:tcBorders>
+            <w:tcMar>
+              <w:top w:w="90" w:type="dxa"/>
+              <w:left w:w="90" w:type="dxa"/>
+              <w:bottom w:w="90" w:type="dxa"/>
+              <w:right w:w="90" w:type="dxa"/>
+            </w:tcMar>
+            <w:hideMark/>
+          </w:tcPr>
+          <w:p>
+            <w:pPr>
+              <w:spacing w:before="180" w:after="180"/>
+              <w:rPr>
+                <w:rFonts w:ascii="Calibri" w:eastAsia="Times New Roman" w:hAnsi="Calibri" w:cs="Calibri"/>
+                <w:sz w:val="22"/>
+                <w:szCs w:val="22"/>
+              </w:rPr>
+            </w:pPr>
+            <w:r>
+              <w:rPr>
+                <w:rStyle w:val="CdigoHTML"/>
+              </w:rPr>
+              <w:t>CurpProcesada</w:t>
+            </w:r>
+            <w:r>
+              <w:rPr>
+                <w:rFonts w:ascii="Calibri" w:eastAsia="Times New Roman" w:hAnsi="Calibri" w:cs="Calibri"/>
+                <w:sz w:val="22"/>
+                <w:szCs w:val="22"/>
+              </w:rPr>
+              <w:t xml:space="preserve"> (Fallos)</w:t>
+            </w:r>
+          </w:p>
+        </w:tc>
+        <w:tc>
+          <w:tcPr>
+            <w:tcW w:w="0" w:type="auto"/>
+            <w:tcBorders>
+              <w:top w:val="single" w:sz="6" w:space="0" w:color="666666"/>
+              <w:left w:val="single" w:sz="6" w:space="0" w:color="666666"/>
+              <w:bottom w:val="single" w:sz="6" w:space="0" w:color="666666"/>
+              <w:right w:val="single" w:sz="6" w:space="0" w:color="666666"/>
+            </w:tcBorders>
+            <w:tcMar>
+              <w:top w:w="90" w:type="dxa"/>
+              <w:left w:w="90" w:type="dxa"/>
+              <w:bottom w:w="90" w:type="dxa"/>
+              <w:right w:w="90" w:type="dxa"/>
+            </w:tcMar>
+            <w:hideMark/>
+          </w:tcPr>
+          <w:p>
+            <w:pPr>
+              <w:spacing w:before="180" w:after="180"/>
+              <w:rPr>
+                <w:rFonts w:ascii="Calibri" w:eastAsia="Times New Roman" w:hAnsi="Calibri" w:cs="Calibri"/>
+                <w:sz w:val="22"/>
+                <w:szCs w:val="22"/>
+              </w:rPr>
+            </w:pPr>
+            <w:r>
+              <w:rPr>
+                <w:rStyle w:val="CdigoHTML"/>
+              </w:rPr>
+              <w:t>Sequential Scan</w:t>
+            </w:r>
+            <w:r>
+              <w:rPr>
+                <w:rFonts w:ascii="Calibri" w:eastAsia="Times New Roman" w:hAnsi="Calibri" w:cs="Calibri"/>
+                <w:sz w:val="22"/>
+                <w:szCs w:val="22"/>
+              </w:rPr>
+              <w:t xml:space="preserve"> con Filtro</w:t>
+            </w:r>
+          </w:p>
+        </w:tc>
+        <w:tc>
+          <w:tcPr>
+            <w:tcW w:w="0" w:type="auto"/>
+            <w:tcBorders>
+              <w:top w:val="single" w:sz="6" w:space="0" w:color="666666"/>
+              <w:left w:val="single" w:sz="6" w:space="0" w:color="666666"/>
+              <w:bottom w:val="single" w:sz="6" w:space="0" w:color="666666"/>
+              <w:right w:val="single" w:sz="6" w:space="0" w:color="666666"/>
+            </w:tcBorders>
+            <w:tcMar>
+              <w:top w:w="90" w:type="dxa"/>
+              <w:left w:w="90" w:type="dxa"/>
+              <w:bottom w:w="90" w:type="dxa"/>
+              <w:right w:w="90" w:type="dxa"/>
+            </w:tcMar>
+            <w:hideMark/>
+          </w:tcPr>
+          <w:p>
+            <w:pPr>
+              <w:spacing w:before="180" w:after="180"/>
+              <w:rPr>
+                <w:rFonts w:ascii="Calibri" w:eastAsia="Times New Roman" w:hAnsi="Calibri" w:cs="Calibri"/>
+                <w:sz w:val="22"/>
+                <w:szCs w:val="22"/>
+              </w:rPr>
+            </w:pPr>
+            <w:r>
+              <w:rPr>
+                <w:rStyle w:val="CdigoHTML"/>
+              </w:rPr>
+              <w:t>Index Scan</w:t>
+            </w:r>
+            <w:r>
+              <w:rPr>
+                <w:rFonts w:ascii="Calibri" w:eastAsia="Times New Roman" w:hAnsi="Calibri" w:cs="Calibri"/>
+                <w:sz w:val="22"/>
+                <w:szCs w:val="22"/>
+              </w:rPr>
+              <w:t xml:space="preserve"> (</w:t>
+            </w:r>
+            <w:r>
+              <w:rPr>
+                <w:rStyle w:val="CdigoHTML"/>
+              </w:rPr>
+              <w:t>idx_curp_procesada_lote_estado</w:t>
+            </w:r>
+            <w:r>
+              <w:rPr>
+                <w:rFonts w:ascii="Calibri" w:eastAsia="Times New Roman" w:hAnsi="Calibri" w:cs="Calibri"/>
+                <w:sz w:val="22"/>
+                <w:szCs w:val="22"/>
+              </w:rPr>
+              <w:t>)</w:t>
+            </w:r>
+          </w:p>
+        </w:tc>
+        <w:tc>
+          <w:tcPr>
+            <w:tcW w:w="0" w:type="auto"/>
+            <w:tcBorders>
+              <w:top w:val="single" w:sz="6" w:space="0" w:color="666666"/>
+              <w:left w:val="single" w:sz="6" w:space="0" w:color="666666"/>
+              <w:bottom w:val="single" w:sz="6" w:space="0" w:color="666666"/>
+              <w:right w:val="single" w:sz="6" w:space="0" w:color="666666"/>
+            </w:tcBorders>
+            <w:tcMar>
+              <w:top w:w="90" w:type="dxa"/>
+              <w:left w:w="90" w:type="dxa"/>
+              <w:bottom w:w="90" w:type="dxa"/>
+              <w:right w:w="90" w:type="dxa"/>
+            </w:tcMar>
+            <w:hideMark/>
+          </w:tcPr>
+          <w:p>
+            <w:pPr>
+              <w:spacing w:before="180" w:after="180"/>
+              <w:rPr>
+                <w:rFonts w:ascii="Calibri" w:eastAsia="Times New Roman" w:hAnsi="Calibri" w:cs="Calibri"/>
+                <w:sz w:val="22"/>
+                <w:szCs w:val="22"/>
+              </w:rPr>
+            </w:pPr>
+            <w:r>
+              <w:rPr>
+                <w:rFonts w:ascii="Calibri" w:eastAsia="Times New Roman" w:hAnsi="Calibri" w:cs="Calibri"/>
+                <w:sz w:val="22"/>
+                <w:szCs w:val="22"/>
+              </w:rPr>
+              <w:t>Reducción del 92%</w:t>
+            </w:r>
+          </w:p>
+        </w:tc>
+      </w:tr>
+    </w:tbl>
+    <w:p>
+      <w:pPr>
+        <w:pStyle w:val="Ttulo2"/>
+        <w:rPr>
+          <w:rFonts w:ascii="Calibri" w:eastAsia="Times New Roman" w:hAnsi="Calibri" w:cs="Calibri"/>
+        </w:rPr>
+      </w:pPr>
+      <w:r>
+        <w:rPr>
+          <w:rFonts w:ascii="Calibri" w:eastAsia="Times New Roman" w:hAnsi="Calibri" w:cs="Calibri"/>
+        </w:rPr>
+        <w:t>7. Recomendaciones de Capacity Planning (Siguiente Semestre)</w:t>
+      </w:r>
+    </w:p>
+    <w:p>
+      <w:pPr>
+        <w:pStyle w:val="NormalWeb"/>
+        <w:rPr>
+          <w:rFonts w:ascii="Calibri" w:hAnsi="Calibri" w:cs="Calibri"/>
+          <w:sz w:val="22"/>
+          <w:szCs w:val="22"/>
+        </w:rPr>
+      </w:pPr>
+      <w:r>
+        <w:rPr>
+          <w:rFonts w:ascii="Calibri" w:hAnsi="Calibri" w:cs="Calibri"/>
+          <w:sz w:val="22"/>
+          <w:szCs w:val="22"/>
+        </w:rPr>
+        <w:t xml:space="preserve">1. </w:t>
+      </w:r>
+      <w:r>
+        <w:rPr>
+          <w:rStyle w:val="Fuerte"/>
+          <w:rFonts w:ascii="Calibri" w:hAnsi="Calibri" w:cs="Calibri"/>
+          <w:sz w:val="22"/>
+          <w:szCs w:val="22"/>
+        </w:rPr>
+        <w:t>Paginación Fuerte en la API GraphQL:</w:t>
+      </w:r>
+      <w:r>
+        <w:rPr>
+          <w:rFonts w:ascii="Calibri" w:hAnsi="Calibri" w:cs="Calibri"/>
+          <w:sz w:val="22"/>
+          <w:szCs w:val="22"/>
+        </w:rPr>
+        <w:t xml:space="preserve"> El análisis demostró </w:t>
+      </w:r>
+      <w:r>
+        <w:rPr>
+          <w:rFonts w:ascii="Calibri" w:hAnsi="Calibri" w:cs="Calibri"/>
+          <w:sz w:val="22"/>
+          <w:szCs w:val="22"/>
+        </w:rPr>
+        <w:t>que las consultas a la base de datos sin límite de tasa (</w:t>
+      </w:r>
+      <w:r>
+        <w:rPr>
+          <w:rStyle w:val="CdigoHTML"/>
+        </w:rPr>
+        <w:t>rate limiting</w:t>
+      </w:r>
+      <w:r>
+        <w:rPr>
+          <w:rFonts w:ascii="Calibri" w:hAnsi="Calibri" w:cs="Calibri"/>
+          <w:sz w:val="22"/>
+          <w:szCs w:val="22"/>
+        </w:rPr>
+        <w:t>) y límites muy altos (</w:t>
+      </w:r>
+      <w:r>
+        <w:rPr>
+          <w:rStyle w:val="CdigoHTML"/>
+        </w:rPr>
+        <w:t>limit: 1000</w:t>
+      </w:r>
+      <w:r>
+        <w:rPr>
+          <w:rFonts w:ascii="Calibri" w:hAnsi="Calibri" w:cs="Calibri"/>
+          <w:sz w:val="22"/>
+          <w:szCs w:val="22"/>
+        </w:rPr>
+        <w:t>) pueden colapsar el servicio. Es vital forzar reglas estrictas de paginación a nivel de base de datos (</w:t>
+      </w:r>
+      <w:r>
+        <w:rPr>
+          <w:rStyle w:val="CdigoHTML"/>
+        </w:rPr>
+        <w:t>LIMIT / OFFSET</w:t>
+      </w:r>
+      <w:r>
+        <w:rPr>
+          <w:rFonts w:ascii="Calibri" w:hAnsi="Calibri" w:cs="Calibri"/>
+          <w:sz w:val="22"/>
+          <w:szCs w:val="22"/>
+        </w:rPr>
+        <w:t xml:space="preserve"> parametrizados) para mitigar el riesgo de denegación de servicio (DoS).</w:t>
+      </w:r>
+    </w:p>
+    <w:p>
+      <w:pPr>
+        <w:pStyle w:val="NormalWeb"/>
+        <w:rPr>
+          <w:rFonts w:ascii="Calibri" w:hAnsi="Calibri" w:cs="Calibri"/>
+          <w:sz w:val="22"/>
+          <w:szCs w:val="22"/>
+        </w:rPr>
+      </w:pPr>
+      <w:r>
+        <w:rPr>
+          <w:rFonts w:ascii="Calibri" w:hAnsi="Calibri" w:cs="Calibri"/>
+          <w:sz w:val="22"/>
+          <w:szCs w:val="22"/>
+        </w:rPr>
+        <w:t xml:space="preserve">2. </w:t>
+      </w:r>
+      <w:r>
+        <w:rPr>
+          <w:rStyle w:val="Fuerte"/>
+          <w:rFonts w:ascii="Calibri" w:hAnsi="Calibri" w:cs="Calibri"/>
+          <w:sz w:val="22"/>
+          <w:szCs w:val="22"/>
+        </w:rPr>
+        <w:t>Monitoreo de *Index Bloat*:</w:t>
+      </w:r>
+      <w:r>
+        <w:rPr>
+          <w:rFonts w:ascii="Calibri" w:hAnsi="Calibri" w:cs="Calibri"/>
+          <w:sz w:val="22"/>
+          <w:szCs w:val="22"/>
+        </w:rPr>
+        <w:t xml:space="preserve"> Dado el gran volumen de </w:t>
+      </w:r>
+      <w:r>
+        <w:rPr>
+          <w:rStyle w:val="CdigoHTML"/>
+        </w:rPr>
+        <w:t>UPDATE</w:t>
+      </w:r>
+      <w:r>
+        <w:rPr>
+          <w:rFonts w:ascii="Calibri" w:hAnsi="Calibri" w:cs="Calibri"/>
+          <w:sz w:val="22"/>
+          <w:szCs w:val="22"/>
+        </w:rPr>
+        <w:t xml:space="preserve"> sobre la tabla </w:t>
+      </w:r>
+      <w:r>
+        <w:rPr>
+          <w:rStyle w:val="CdigoHTML"/>
+        </w:rPr>
+        <w:t>CurpProcesada</w:t>
+      </w:r>
+      <w:r>
+        <w:rPr>
+          <w:rFonts w:ascii="Calibri" w:hAnsi="Calibri" w:cs="Calibri"/>
+          <w:sz w:val="22"/>
+          <w:szCs w:val="22"/>
+        </w:rPr>
+        <w:t xml:space="preserve"> (actualizando estados y rutas de PDF), es altamente probable que PostgreSQL sufra de hinchamiento de índices. Se recomienda calendarizar mantenimientos con </w:t>
+      </w:r>
+      <w:r>
+        <w:rPr>
+          <w:rStyle w:val="CdigoHTML"/>
+        </w:rPr>
+        <w:t>VACUUM ANALYZE</w:t>
+      </w:r>
+      <w:r>
+        <w:rPr>
+          <w:rFonts w:ascii="Calibri" w:hAnsi="Calibri" w:cs="Calibri"/>
+          <w:sz w:val="22"/>
+          <w:szCs w:val="22"/>
+        </w:rPr>
+        <w:t>.</w:t>
+      </w:r>
+    </w:p>
+    <w:p>
+      <w:pPr>
+        <w:pStyle w:val="Ttulo2"/>
+        <w:rPr>
+          <w:rFonts w:ascii="Calibri" w:eastAsia="Times New Roman" w:hAnsi="Calibri" w:cs="Calibri"/>
+        </w:rPr>
+      </w:pPr>
+      <w:r>
+        <w:rPr>
+          <w:rFonts w:ascii="Calibri" w:eastAsia="Times New Roman" w:hAnsi="Calibri" w:cs="Calibri"/>
+        </w:rPr>
+        <w:t>8. Próximos Pasos (Junio 2026)</w:t>
+      </w:r>
+    </w:p>
+    <w:p>
+      <w:pPr>
+        <w:numPr>
+          <w:ilvl w:val="0"/>
+          <w:numId w:val="8"/>
+        </w:numPr>
+        <w:spacing w:before="100" w:beforeAutospacing="1" w:after="100" w:afterAutospacing="1"/>
+        <w:rPr>
+          <w:rFonts w:ascii="Calibri" w:eastAsia="Times New Roman" w:hAnsi="Calibri" w:cs="Calibri"/>
+          <w:sz w:val="22"/>
+          <w:szCs w:val="22"/>
+        </w:rPr>
+      </w:pPr>
+      <w:r>
+        <w:rPr>
+          <w:rFonts w:ascii="Calibri" w:eastAsia="Times New Roman" w:hAnsi="Calibri" w:cs="Calibri"/>
+          <w:sz w:val="22"/>
+          <w:szCs w:val="22"/>
+        </w:rPr>
+        <w:t xml:space="preserve">Aplicar los índices faltantes en la tabla </w:t>
+      </w:r>
+      <w:r>
+        <w:rPr>
+          <w:rStyle w:val="CdigoHTML"/>
+        </w:rPr>
+        <w:t>BitacoraEvento</w:t>
+      </w:r>
+      <w:r>
+        <w:rPr>
+          <w:rFonts w:ascii="Calibri" w:eastAsia="Times New Roman" w:hAnsi="Calibri" w:cs="Calibri"/>
+          <w:sz w:val="22"/>
+          <w:szCs w:val="22"/>
+        </w:rPr>
+        <w:t xml:space="preserve"> en todos los ambientes.</w:t>
+      </w:r>
+    </w:p>
+    <w:p>
+      <w:pPr>
+        <w:numPr>
+          <w:ilvl w:val="0"/>
+          <w:numId w:val="8"/>
+        </w:numPr>
+        <w:spacing w:before="100" w:beforeAutospacing="1" w:after="100" w:afterAutospacing="1"/>
+        <w:rPr>
+          <w:rFonts w:ascii="Calibri" w:eastAsia="Times New Roman" w:hAnsi="Calibri" w:cs="Calibri"/>
+          <w:sz w:val="22"/>
+          <w:szCs w:val="22"/>
+        </w:rPr>
+      </w:pPr>
+      <w:r>
+        <w:rPr>
+          <w:rFonts w:ascii="Calibri" w:eastAsia="Times New Roman" w:hAnsi="Calibri" w:cs="Calibri"/>
+          <w:sz w:val="22"/>
+          <w:szCs w:val="22"/>
+        </w:rPr>
+        <w:t>Validar y auditar la integridad del hash criptográfico (</w:t>
+      </w:r>
+      <w:r>
+        <w:rPr>
+          <w:rStyle w:val="CdigoHTML"/>
+        </w:rPr>
+        <w:t>STANDARD_HASH</w:t>
+      </w:r>
+      <w:r>
+        <w:rPr>
+          <w:rFonts w:ascii="Calibri" w:eastAsia="Times New Roman" w:hAnsi="Calibri" w:cs="Calibri"/>
+          <w:sz w:val="22"/>
+          <w:szCs w:val="22"/>
+        </w:rPr>
+        <w:t>) de las vistas de MUSEMS-PU frente a escenarios productivos con PII real.</w:t>
+      </w:r>
+    </w:p>
+    <w:p>
+      <w:pPr>
+        <w:numPr>
+          <w:ilvl w:val="0"/>
+          <w:numId w:val="8"/>
+        </w:numPr>
+        <w:spacing w:before="100" w:beforeAutospacing="1" w:after="100" w:afterAutospacing="1"/>
+        <w:rPr>
+          <w:rFonts w:ascii="Calibri" w:eastAsia="Times New Roman" w:hAnsi="Calibri" w:cs="Calibri"/>
+          <w:sz w:val="22"/>
+          <w:szCs w:val="22"/>
+        </w:rPr>
+      </w:pPr>
+      <w:r>
+        <w:rPr>
+          <w:rFonts w:ascii="Calibri" w:eastAsia="Times New Roman" w:hAnsi="Calibri" w:cs="Calibri"/>
+          <w:sz w:val="22"/>
+          <w:szCs w:val="22"/>
+        </w:rPr>
+        <w:t>Integrar reportes automatizados de planes de ejecución (</w:t>
+      </w:r>
+      <w:r>
+        <w:rPr>
+          <w:rStyle w:val="CdigoHTML"/>
+        </w:rPr>
+        <w:t>EXPLAIN</w:t>
+      </w:r>
+      <w:r>
+        <w:rPr>
+          <w:rFonts w:ascii="Calibri" w:eastAsia="Times New Roman" w:hAnsi="Calibri" w:cs="Calibri"/>
+          <w:sz w:val="22"/>
+          <w:szCs w:val="22"/>
+        </w:rPr>
+        <w:t>) en los pipelines de CI/CD para detectar degradación temprana.</w:t>
+      </w:r>
+    </w:p>
+    <w:p>
+      <w:pPr>
+        <w:numPr>
+          <w:ilvl w:val="0"/>
+          <w:numId w:val="8"/>
+        </w:numPr>
+        <w:spacing w:before="100" w:beforeAutospacing="1" w:after="100" w:afterAutospacing="1"/>
+        <w:rPr>
+          <w:rFonts w:ascii="Calibri" w:eastAsia="Times New Roman" w:hAnsi="Calibri" w:cs="Calibri"/>
+          <w:sz w:val="22"/>
+          <w:szCs w:val="22"/>
+        </w:rPr>
+      </w:pPr>
+      <w:r>
+        <w:rPr>
+          <w:rFonts w:ascii="Calibri" w:eastAsia="Times New Roman" w:hAnsi="Calibri" w:cs="Calibri"/>
+          <w:sz w:val="22"/>
+          <w:szCs w:val="22"/>
+        </w:rPr>
+        <w:t>Preparar el informe de cierre trimestral con el consolidado de rendimiento frente a la carga real de producción.</w:t>
+      </w:r>
+    </w:p>
+    <w:p>
+      <w:pPr>
+        <w:rPr>
+          <w:rFonts w:ascii="Calibri" w:eastAsia="Times New Roman" w:hAnsi="Calibri" w:cs="Calibri"/>
+          <w:sz w:val="22"/>
+          <w:szCs w:val="22"/>
+        </w:rPr>
+      </w:pPr>
+      <w:r>
+        <w:rPr>
+          <w:rFonts w:ascii="Calibri" w:eastAsia="Times New Roman" w:hAnsi="Calibri" w:cs="Calibri"/>
+          <w:sz w:val="22"/>
+          <w:szCs w:val="22"/>
+        </w:rPr>
+        <w:pict w14:anchorId="25380418">
+          <v:rect id="_x0000_i1026" style="width:0;height:1.5pt" o:hralign="center" o:hrstd="t" o:hr="t" fillcolor="#a0a0a0" stroked="f"/>
+        </w:pict>
+      </w:r>
+    </w:p>
+    <w:p>
+      <w:pPr>
+        <w:pStyle w:val="NormalWeb"/>
+        <w:rPr>
+          <w:rFonts w:ascii="Calibri" w:hAnsi="Calibri" w:cs="Calibri"/>
+          <w:sz w:val="22"/>
+          <w:szCs w:val="22"/>
+        </w:rPr>
+      </w:pPr>
+      <w:r>
+        <w:rPr>
+          <w:rStyle w:val="Fuerte"/>
+          <w:rFonts w:ascii="Calibri" w:hAnsi="Calibri" w:cs="Calibri"/>
+          <w:sz w:val="22"/>
+          <w:szCs w:val="22"/>
+        </w:rPr>
+        <w:t>Comentarios adicionales:</w:t>
+      </w:r>
+    </w:p>
+    <w:p>
+      <w:pPr>
+        <w:pStyle w:val="NormalWeb"/>
+        <w:rPr>
+          <w:rFonts w:ascii="Calibri" w:hAnsi="Calibri" w:cs="Calibri"/>
+          <w:sz w:val="22"/>
+          <w:szCs w:val="22"/>
+        </w:rPr>
+      </w:pPr>
+      <w:r>
+        <w:rPr>
+          <w:rFonts w:ascii="Calibri" w:hAnsi="Calibri" w:cs="Calibri"/>
+          <w:sz w:val="22"/>
+          <w:szCs w:val="22"/>
+        </w:rPr>
+        <w:t>Este entregable corresponde al avance de mayo de 2026 y demuestra el paso de una estrategia teórica (abril) a una resolución técnica proactiva (mayo). La estandarización de borrado y cifrado en Oracle, junto con la optimización dramática (94.3%) de tiempos de lectura en PostgreSQL mediante la corrección de consultas y agregación de índices clave, dotan al ecosistema SEP de un piso sólido y resiliente para el próximo ciclo.</w:t>
       </w:r>
     </w:p>
     <w:sectPr>
@@ -886,9 +3608,9 @@
 <file path=word/numbering.xml><?xml version="1.0" encoding="utf-8"?>
 <w:numbering xmlns:wpc="http://schemas.microsoft.com/office/word/2010/wordprocessingCanvas" xmlns:cx="http://schemas.microsoft.com/office/drawing/2014/chartex" xmlns:cx1="http://schemas.microsoft.com/office/drawing/2015/9/8/chartex" xmlns:cx2="http://schemas.microsoft.com/office/drawing/2015/10/21/chartex" xmlns:cx3="http://schemas.microsoft.com/office/drawing/2016/5/9/chartex" xmlns:cx4="http://schemas.microsoft.com/office/drawing/2016/5/10/chartex" xmlns:cx5="http://schemas.microsoft.com/office/drawing/2016/5/11/chartex" xmlns:cx6="http://schemas.microsoft.com/office/drawing/2016/5/12/chartex" xmlns:cx7="http://schemas.microsoft.com/office/drawing/2016/5/13/chartex" xmlns:cx8="http://schemas.microsoft.com/office/drawing/2016/5/14/chartex" xmlns:mc="http://schemas.openxmlformats.org/markup-compatibility/2006" xmlns:aink="http://schemas.microsoft.com/office/drawing/2016/ink" xmlns:am3d="http://schemas.microsoft.com/office/drawing/2017/model3d" xmlns:o="urn:schemas-microsoft-com:office:office" xmlns:oel="http://schemas.microsoft.com/office/2019/extlst" xmlns:r="http://schemas.openxmlformats.org/officeDocument/2006/relationships" xmlns:m="http://schemas.openxmlformats.org/officeDocument/2006/math" xmlns:v="urn:schemas-microsoft-com:vml" xmlns:wp14="http://schemas.microsoft.com/office/word/2010/wordprocessingDrawing" xmlns:wp="http://schemas.openxmlformats.org/drawingml/2006/wordprocessingDrawing" xmlns:w10="urn:schemas-microsoft-com:office:word" xmlns:w="http://schemas.openxmlformats.org/wordprocessingml/2006/main" xmlns:w14="http://schemas.microsoft.com/office/word/2010/wordml" xmlns:w15="http://schemas.microsoft.com/office/word/2012/wordml" xmlns:w16cex="http://schemas.microsoft.com/office/word/2018/wordml/cex" xmlns:w16cid="http://schemas.microsoft.com/office/word/2016/wordml/cid" xmlns:w16="http://schemas.microsoft.com/office/word/2018/wordml" xmlns:w16du="http://schemas.microsoft.com/office/word/2023/wordml/word16du" xmlns:w16sdtdh="http://schemas.microsoft.com/office/word/2020/wordml/sdtdatahash" xmlns:w16sdtfl="http://schemas.microsoft.com/office/word/2024/wordml/sdtformatlock" xmlns:w16se="http://schemas.microsoft.com/office/word/2015/wordml/symex" xmlns:wpg="http://schemas.microsoft.com/office/word/2010/wordprocessingGroup" xmlns:wpi="http://schemas.microsoft.com/office/word/2010/wordprocessingInk" xmlns:wne="http://schemas.microsoft.com/office/word/2006/wordml" xmlns:wps="http://schemas.microsoft.com/office/word/2010/wordprocessingShape" mc:Ignorable="w14 w15 w16se w16cid w16 w16cex w16sdtdh w16sdtfl w16du wp14">
   <w:abstractNum w:abstractNumId="0" w15:restartNumberingAfterBreak="0">
-    <w:nsid w:val="275477B5"/>
+    <w:nsid w:val="1C923BB3"/>
     <w:multiLevelType w:val="multilevel"/>
-    <w:tmpl w:val="46687B76"/>
+    <w:tmpl w:val="EA960160"/>
     <w:lvl w:ilvl="0">
       <w:start w:val="1"/>
       <w:numFmt w:val="bullet"/>
@@ -1035,9 +3757,9 @@
     </w:lvl>
   </w:abstractNum>
   <w:abstractNum w:abstractNumId="1" w15:restartNumberingAfterBreak="0">
-    <w:nsid w:val="36BD25A6"/>
+    <w:nsid w:val="2D7B1150"/>
     <w:multiLevelType w:val="multilevel"/>
-    <w:tmpl w:val="93661D2A"/>
+    <w:tmpl w:val="C868B2DA"/>
     <w:lvl w:ilvl="0">
       <w:start w:val="1"/>
       <w:numFmt w:val="bullet"/>
@@ -1184,9 +3906,9 @@
     </w:lvl>
   </w:abstractNum>
   <w:abstractNum w:abstractNumId="2" w15:restartNumberingAfterBreak="0">
-    <w:nsid w:val="7D6C6568"/>
+    <w:nsid w:val="2E790B0E"/>
     <w:multiLevelType w:val="multilevel"/>
-    <w:tmpl w:val="2F10DB24"/>
+    <w:tmpl w:val="9FFACCF0"/>
     <w:lvl w:ilvl="0">
       <w:start w:val="1"/>
       <w:numFmt w:val="bullet"/>
@@ -1332,14 +4054,774 @@
       </w:rPr>
     </w:lvl>
   </w:abstractNum>
-  <w:num w:numId="1" w16cid:durableId="164981233">
+  <w:abstractNum w:abstractNumId="3" w15:restartNumberingAfterBreak="0">
+    <w:nsid w:val="362D192F"/>
+    <w:multiLevelType w:val="multilevel"/>
+    <w:tmpl w:val="A16A1156"/>
+    <w:lvl w:ilvl="0">
+      <w:start w:val="1"/>
+      <w:numFmt w:val="bullet"/>
+      <w:lvlText w:val=""/>
+      <w:lvlJc w:val="left"/>
+      <w:pPr>
+        <w:tabs>
+          <w:tab w:val="num" w:pos="720"/>
+        </w:tabs>
+        <w:ind w:left="720" w:hanging="360"/>
+      </w:pPr>
+      <w:rPr>
+        <w:rFonts w:ascii="Symbol" w:hAnsi="Symbol" w:hint="default"/>
+        <w:sz w:val="20"/>
+      </w:rPr>
+    </w:lvl>
+    <w:lvl w:ilvl="1" w:tentative="1">
+      <w:start w:val="1"/>
+      <w:numFmt w:val="bullet"/>
+      <w:lvlText w:val="o"/>
+      <w:lvlJc w:val="left"/>
+      <w:pPr>
+        <w:tabs>
+          <w:tab w:val="num" w:pos="1440"/>
+        </w:tabs>
+        <w:ind w:left="1440" w:hanging="360"/>
+      </w:pPr>
+      <w:rPr>
+        <w:rFonts w:ascii="Courier New" w:hAnsi="Courier New" w:hint="default"/>
+        <w:sz w:val="20"/>
+      </w:rPr>
+    </w:lvl>
+    <w:lvl w:ilvl="2" w:tentative="1">
+      <w:start w:val="1"/>
+      <w:numFmt w:val="bullet"/>
+      <w:lvlText w:val=""/>
+      <w:lvlJc w:val="left"/>
+      <w:pPr>
+        <w:tabs>
+          <w:tab w:val="num" w:pos="2160"/>
+        </w:tabs>
+        <w:ind w:left="2160" w:hanging="360"/>
+      </w:pPr>
+      <w:rPr>
+        <w:rFonts w:ascii="Wingdings" w:hAnsi="Wingdings" w:hint="default"/>
+        <w:sz w:val="20"/>
+      </w:rPr>
+    </w:lvl>
+    <w:lvl w:ilvl="3" w:tentative="1">
+      <w:start w:val="1"/>
+      <w:numFmt w:val="bullet"/>
+      <w:lvlText w:val=""/>
+      <w:lvlJc w:val="left"/>
+      <w:pPr>
+        <w:tabs>
+          <w:tab w:val="num" w:pos="2880"/>
+        </w:tabs>
+        <w:ind w:left="2880" w:hanging="360"/>
+      </w:pPr>
+      <w:rPr>
+        <w:rFonts w:ascii="Wingdings" w:hAnsi="Wingdings" w:hint="default"/>
+        <w:sz w:val="20"/>
+      </w:rPr>
+    </w:lvl>
+    <w:lvl w:ilvl="4" w:tentative="1">
+      <w:start w:val="1"/>
+      <w:numFmt w:val="bullet"/>
+      <w:lvlText w:val=""/>
+      <w:lvlJc w:val="left"/>
+      <w:pPr>
+        <w:tabs>
+          <w:tab w:val="num" w:pos="3600"/>
+        </w:tabs>
+        <w:ind w:left="3600" w:hanging="360"/>
+      </w:pPr>
+      <w:rPr>
+        <w:rFonts w:ascii="Wingdings" w:hAnsi="Wingdings" w:hint="default"/>
+        <w:sz w:val="20"/>
+      </w:rPr>
+    </w:lvl>
+    <w:lvl w:ilvl="5" w:tentative="1">
+      <w:start w:val="1"/>
+      <w:numFmt w:val="bullet"/>
+      <w:lvlText w:val=""/>
+      <w:lvlJc w:val="left"/>
+      <w:pPr>
+        <w:tabs>
+          <w:tab w:val="num" w:pos="4320"/>
+        </w:tabs>
+        <w:ind w:left="4320" w:hanging="360"/>
+      </w:pPr>
+      <w:rPr>
+        <w:rFonts w:ascii="Wingdings" w:hAnsi="Wingdings" w:hint="default"/>
+        <w:sz w:val="20"/>
+      </w:rPr>
+    </w:lvl>
+    <w:lvl w:ilvl="6" w:tentative="1">
+      <w:start w:val="1"/>
+      <w:numFmt w:val="bullet"/>
+      <w:lvlText w:val=""/>
+      <w:lvlJc w:val="left"/>
+      <w:pPr>
+        <w:tabs>
+          <w:tab w:val="num" w:pos="5040"/>
+        </w:tabs>
+        <w:ind w:left="5040" w:hanging="360"/>
+      </w:pPr>
+      <w:rPr>
+        <w:rFonts w:ascii="Wingdings" w:hAnsi="Wingdings" w:hint="default"/>
+        <w:sz w:val="20"/>
+      </w:rPr>
+    </w:lvl>
+    <w:lvl w:ilvl="7" w:tentative="1">
+      <w:start w:val="1"/>
+      <w:numFmt w:val="bullet"/>
+      <w:lvlText w:val=""/>
+      <w:lvlJc w:val="left"/>
+      <w:pPr>
+        <w:tabs>
+          <w:tab w:val="num" w:pos="5760"/>
+        </w:tabs>
+        <w:ind w:left="5760" w:hanging="360"/>
+      </w:pPr>
+      <w:rPr>
+        <w:rFonts w:ascii="Wingdings" w:hAnsi="Wingdings" w:hint="default"/>
+        <w:sz w:val="20"/>
+      </w:rPr>
+    </w:lvl>
+    <w:lvl w:ilvl="8" w:tentative="1">
+      <w:start w:val="1"/>
+      <w:numFmt w:val="bullet"/>
+      <w:lvlText w:val=""/>
+      <w:lvlJc w:val="left"/>
+      <w:pPr>
+        <w:tabs>
+          <w:tab w:val="num" w:pos="6480"/>
+        </w:tabs>
+        <w:ind w:left="6480" w:hanging="360"/>
+      </w:pPr>
+      <w:rPr>
+        <w:rFonts w:ascii="Wingdings" w:hAnsi="Wingdings" w:hint="default"/>
+        <w:sz w:val="20"/>
+      </w:rPr>
+    </w:lvl>
+  </w:abstractNum>
+  <w:abstractNum w:abstractNumId="4" w15:restartNumberingAfterBreak="0">
+    <w:nsid w:val="3EEC1582"/>
+    <w:multiLevelType w:val="multilevel"/>
+    <w:tmpl w:val="AF40E048"/>
+    <w:lvl w:ilvl="0">
+      <w:start w:val="1"/>
+      <w:numFmt w:val="bullet"/>
+      <w:lvlText w:val=""/>
+      <w:lvlJc w:val="left"/>
+      <w:pPr>
+        <w:tabs>
+          <w:tab w:val="num" w:pos="720"/>
+        </w:tabs>
+        <w:ind w:left="720" w:hanging="360"/>
+      </w:pPr>
+      <w:rPr>
+        <w:rFonts w:ascii="Symbol" w:hAnsi="Symbol" w:hint="default"/>
+        <w:sz w:val="20"/>
+      </w:rPr>
+    </w:lvl>
+    <w:lvl w:ilvl="1" w:tentative="1">
+      <w:start w:val="1"/>
+      <w:numFmt w:val="bullet"/>
+      <w:lvlText w:val="o"/>
+      <w:lvlJc w:val="left"/>
+      <w:pPr>
+        <w:tabs>
+          <w:tab w:val="num" w:pos="1440"/>
+        </w:tabs>
+        <w:ind w:left="1440" w:hanging="360"/>
+      </w:pPr>
+      <w:rPr>
+        <w:rFonts w:ascii="Courier New" w:hAnsi="Courier New" w:hint="default"/>
+        <w:sz w:val="20"/>
+      </w:rPr>
+    </w:lvl>
+    <w:lvl w:ilvl="2" w:tentative="1">
+      <w:start w:val="1"/>
+      <w:numFmt w:val="bullet"/>
+      <w:lvlText w:val=""/>
+      <w:lvlJc w:val="left"/>
+      <w:pPr>
+        <w:tabs>
+          <w:tab w:val="num" w:pos="2160"/>
+        </w:tabs>
+        <w:ind w:left="2160" w:hanging="360"/>
+      </w:pPr>
+      <w:rPr>
+        <w:rFonts w:ascii="Wingdings" w:hAnsi="Wingdings" w:hint="default"/>
+        <w:sz w:val="20"/>
+      </w:rPr>
+    </w:lvl>
+    <w:lvl w:ilvl="3" w:tentative="1">
+      <w:start w:val="1"/>
+      <w:numFmt w:val="bullet"/>
+      <w:lvlText w:val=""/>
+      <w:lvlJc w:val="left"/>
+      <w:pPr>
+        <w:tabs>
+          <w:tab w:val="num" w:pos="2880"/>
+        </w:tabs>
+        <w:ind w:left="2880" w:hanging="360"/>
+      </w:pPr>
+      <w:rPr>
+        <w:rFonts w:ascii="Wingdings" w:hAnsi="Wingdings" w:hint="default"/>
+        <w:sz w:val="20"/>
+      </w:rPr>
+    </w:lvl>
+    <w:lvl w:ilvl="4" w:tentative="1">
+      <w:start w:val="1"/>
+      <w:numFmt w:val="bullet"/>
+      <w:lvlText w:val=""/>
+      <w:lvlJc w:val="left"/>
+      <w:pPr>
+        <w:tabs>
+          <w:tab w:val="num" w:pos="3600"/>
+        </w:tabs>
+        <w:ind w:left="3600" w:hanging="360"/>
+      </w:pPr>
+      <w:rPr>
+        <w:rFonts w:ascii="Wingdings" w:hAnsi="Wingdings" w:hint="default"/>
+        <w:sz w:val="20"/>
+      </w:rPr>
+    </w:lvl>
+    <w:lvl w:ilvl="5" w:tentative="1">
+      <w:start w:val="1"/>
+      <w:numFmt w:val="bullet"/>
+      <w:lvlText w:val=""/>
+      <w:lvlJc w:val="left"/>
+      <w:pPr>
+        <w:tabs>
+          <w:tab w:val="num" w:pos="4320"/>
+        </w:tabs>
+        <w:ind w:left="4320" w:hanging="360"/>
+      </w:pPr>
+      <w:rPr>
+        <w:rFonts w:ascii="Wingdings" w:hAnsi="Wingdings" w:hint="default"/>
+        <w:sz w:val="20"/>
+      </w:rPr>
+    </w:lvl>
+    <w:lvl w:ilvl="6" w:tentative="1">
+      <w:start w:val="1"/>
+      <w:numFmt w:val="bullet"/>
+      <w:lvlText w:val=""/>
+      <w:lvlJc w:val="left"/>
+      <w:pPr>
+        <w:tabs>
+          <w:tab w:val="num" w:pos="5040"/>
+        </w:tabs>
+        <w:ind w:left="5040" w:hanging="360"/>
+      </w:pPr>
+      <w:rPr>
+        <w:rFonts w:ascii="Wingdings" w:hAnsi="Wingdings" w:hint="default"/>
+        <w:sz w:val="20"/>
+      </w:rPr>
+    </w:lvl>
+    <w:lvl w:ilvl="7" w:tentative="1">
+      <w:start w:val="1"/>
+      <w:numFmt w:val="bullet"/>
+      <w:lvlText w:val=""/>
+      <w:lvlJc w:val="left"/>
+      <w:pPr>
+        <w:tabs>
+          <w:tab w:val="num" w:pos="5760"/>
+        </w:tabs>
+        <w:ind w:left="5760" w:hanging="360"/>
+      </w:pPr>
+      <w:rPr>
+        <w:rFonts w:ascii="Wingdings" w:hAnsi="Wingdings" w:hint="default"/>
+        <w:sz w:val="20"/>
+      </w:rPr>
+    </w:lvl>
+    <w:lvl w:ilvl="8" w:tentative="1">
+      <w:start w:val="1"/>
+      <w:numFmt w:val="bullet"/>
+      <w:lvlText w:val=""/>
+      <w:lvlJc w:val="left"/>
+      <w:pPr>
+        <w:tabs>
+          <w:tab w:val="num" w:pos="6480"/>
+        </w:tabs>
+        <w:ind w:left="6480" w:hanging="360"/>
+      </w:pPr>
+      <w:rPr>
+        <w:rFonts w:ascii="Wingdings" w:hAnsi="Wingdings" w:hint="default"/>
+        <w:sz w:val="20"/>
+      </w:rPr>
+    </w:lvl>
+  </w:abstractNum>
+  <w:abstractNum w:abstractNumId="5" w15:restartNumberingAfterBreak="0">
+    <w:nsid w:val="47490381"/>
+    <w:multiLevelType w:val="multilevel"/>
+    <w:tmpl w:val="1494E810"/>
+    <w:lvl w:ilvl="0">
+      <w:start w:val="1"/>
+      <w:numFmt w:val="bullet"/>
+      <w:lvlText w:val=""/>
+      <w:lvlJc w:val="left"/>
+      <w:pPr>
+        <w:tabs>
+          <w:tab w:val="num" w:pos="720"/>
+        </w:tabs>
+        <w:ind w:left="720" w:hanging="360"/>
+      </w:pPr>
+      <w:rPr>
+        <w:rFonts w:ascii="Symbol" w:hAnsi="Symbol" w:hint="default"/>
+        <w:sz w:val="20"/>
+      </w:rPr>
+    </w:lvl>
+    <w:lvl w:ilvl="1" w:tentative="1">
+      <w:start w:val="1"/>
+      <w:numFmt w:val="bullet"/>
+      <w:lvlText w:val="o"/>
+      <w:lvlJc w:val="left"/>
+      <w:pPr>
+        <w:tabs>
+          <w:tab w:val="num" w:pos="1440"/>
+        </w:tabs>
+        <w:ind w:left="1440" w:hanging="360"/>
+      </w:pPr>
+      <w:rPr>
+        <w:rFonts w:ascii="Courier New" w:hAnsi="Courier New" w:hint="default"/>
+        <w:sz w:val="20"/>
+      </w:rPr>
+    </w:lvl>
+    <w:lvl w:ilvl="2" w:tentative="1">
+      <w:start w:val="1"/>
+      <w:numFmt w:val="bullet"/>
+      <w:lvlText w:val=""/>
+      <w:lvlJc w:val="left"/>
+      <w:pPr>
+        <w:tabs>
+          <w:tab w:val="num" w:pos="2160"/>
+        </w:tabs>
+        <w:ind w:left="2160" w:hanging="360"/>
+      </w:pPr>
+      <w:rPr>
+        <w:rFonts w:ascii="Wingdings" w:hAnsi="Wingdings" w:hint="default"/>
+        <w:sz w:val="20"/>
+      </w:rPr>
+    </w:lvl>
+    <w:lvl w:ilvl="3" w:tentative="1">
+      <w:start w:val="1"/>
+      <w:numFmt w:val="bullet"/>
+      <w:lvlText w:val=""/>
+      <w:lvlJc w:val="left"/>
+      <w:pPr>
+        <w:tabs>
+          <w:tab w:val="num" w:pos="2880"/>
+        </w:tabs>
+        <w:ind w:left="2880" w:hanging="360"/>
+      </w:pPr>
+      <w:rPr>
+        <w:rFonts w:ascii="Wingdings" w:hAnsi="Wingdings" w:hint="default"/>
+        <w:sz w:val="20"/>
+      </w:rPr>
+    </w:lvl>
+    <w:lvl w:ilvl="4" w:tentative="1">
+      <w:start w:val="1"/>
+      <w:numFmt w:val="bullet"/>
+      <w:lvlText w:val=""/>
+      <w:lvlJc w:val="left"/>
+      <w:pPr>
+        <w:tabs>
+          <w:tab w:val="num" w:pos="3600"/>
+        </w:tabs>
+        <w:ind w:left="3600" w:hanging="360"/>
+      </w:pPr>
+      <w:rPr>
+        <w:rFonts w:ascii="Wingdings" w:hAnsi="Wingdings" w:hint="default"/>
+        <w:sz w:val="20"/>
+      </w:rPr>
+    </w:lvl>
+    <w:lvl w:ilvl="5" w:tentative="1">
+      <w:start w:val="1"/>
+      <w:numFmt w:val="bullet"/>
+      <w:lvlText w:val=""/>
+      <w:lvlJc w:val="left"/>
+      <w:pPr>
+        <w:tabs>
+          <w:tab w:val="num" w:pos="4320"/>
+        </w:tabs>
+        <w:ind w:left="4320" w:hanging="360"/>
+      </w:pPr>
+      <w:rPr>
+        <w:rFonts w:ascii="Wingdings" w:hAnsi="Wingdings" w:hint="default"/>
+        <w:sz w:val="20"/>
+      </w:rPr>
+    </w:lvl>
+    <w:lvl w:ilvl="6" w:tentative="1">
+      <w:start w:val="1"/>
+      <w:numFmt w:val="bullet"/>
+      <w:lvlText w:val=""/>
+      <w:lvlJc w:val="left"/>
+      <w:pPr>
+        <w:tabs>
+          <w:tab w:val="num" w:pos="5040"/>
+        </w:tabs>
+        <w:ind w:left="5040" w:hanging="360"/>
+      </w:pPr>
+      <w:rPr>
+        <w:rFonts w:ascii="Wingdings" w:hAnsi="Wingdings" w:hint="default"/>
+        <w:sz w:val="20"/>
+      </w:rPr>
+    </w:lvl>
+    <w:lvl w:ilvl="7" w:tentative="1">
+      <w:start w:val="1"/>
+      <w:numFmt w:val="bullet"/>
+      <w:lvlText w:val=""/>
+      <w:lvlJc w:val="left"/>
+      <w:pPr>
+        <w:tabs>
+          <w:tab w:val="num" w:pos="5760"/>
+        </w:tabs>
+        <w:ind w:left="5760" w:hanging="360"/>
+      </w:pPr>
+      <w:rPr>
+        <w:rFonts w:ascii="Wingdings" w:hAnsi="Wingdings" w:hint="default"/>
+        <w:sz w:val="20"/>
+      </w:rPr>
+    </w:lvl>
+    <w:lvl w:ilvl="8" w:tentative="1">
+      <w:start w:val="1"/>
+      <w:numFmt w:val="bullet"/>
+      <w:lvlText w:val=""/>
+      <w:lvlJc w:val="left"/>
+      <w:pPr>
+        <w:tabs>
+          <w:tab w:val="num" w:pos="6480"/>
+        </w:tabs>
+        <w:ind w:left="6480" w:hanging="360"/>
+      </w:pPr>
+      <w:rPr>
+        <w:rFonts w:ascii="Wingdings" w:hAnsi="Wingdings" w:hint="default"/>
+        <w:sz w:val="20"/>
+      </w:rPr>
+    </w:lvl>
+  </w:abstractNum>
+  <w:abstractNum w:abstractNumId="6" w15:restartNumberingAfterBreak="0">
+    <w:nsid w:val="6CDA2679"/>
+    <w:multiLevelType w:val="multilevel"/>
+    <w:tmpl w:val="581A4CC4"/>
+    <w:lvl w:ilvl="0">
+      <w:start w:val="1"/>
+      <w:numFmt w:val="bullet"/>
+      <w:lvlText w:val=""/>
+      <w:lvlJc w:val="left"/>
+      <w:pPr>
+        <w:tabs>
+          <w:tab w:val="num" w:pos="720"/>
+        </w:tabs>
+        <w:ind w:left="720" w:hanging="360"/>
+      </w:pPr>
+      <w:rPr>
+        <w:rFonts w:ascii="Symbol" w:hAnsi="Symbol" w:hint="default"/>
+        <w:sz w:val="20"/>
+      </w:rPr>
+    </w:lvl>
+    <w:lvl w:ilvl="1" w:tentative="1">
+      <w:start w:val="1"/>
+      <w:numFmt w:val="bullet"/>
+      <w:lvlText w:val="o"/>
+      <w:lvlJc w:val="left"/>
+      <w:pPr>
+        <w:tabs>
+          <w:tab w:val="num" w:pos="1440"/>
+        </w:tabs>
+        <w:ind w:left="1440" w:hanging="360"/>
+      </w:pPr>
+      <w:rPr>
+        <w:rFonts w:ascii="Courier New" w:hAnsi="Courier New" w:hint="default"/>
+        <w:sz w:val="20"/>
+      </w:rPr>
+    </w:lvl>
+    <w:lvl w:ilvl="2" w:tentative="1">
+      <w:start w:val="1"/>
+      <w:numFmt w:val="bullet"/>
+      <w:lvlText w:val=""/>
+      <w:lvlJc w:val="left"/>
+      <w:pPr>
+        <w:tabs>
+          <w:tab w:val="num" w:pos="2160"/>
+        </w:tabs>
+        <w:ind w:left="2160" w:hanging="360"/>
+      </w:pPr>
+      <w:rPr>
+        <w:rFonts w:ascii="Wingdings" w:hAnsi="Wingdings" w:hint="default"/>
+        <w:sz w:val="20"/>
+      </w:rPr>
+    </w:lvl>
+    <w:lvl w:ilvl="3" w:tentative="1">
+      <w:start w:val="1"/>
+      <w:numFmt w:val="bullet"/>
+      <w:lvlText w:val=""/>
+      <w:lvlJc w:val="left"/>
+      <w:pPr>
+        <w:tabs>
+          <w:tab w:val="num" w:pos="2880"/>
+        </w:tabs>
+        <w:ind w:left="2880" w:hanging="360"/>
+      </w:pPr>
+      <w:rPr>
+        <w:rFonts w:ascii="Wingdings" w:hAnsi="Wingdings" w:hint="default"/>
+        <w:sz w:val="20"/>
+      </w:rPr>
+    </w:lvl>
+    <w:lvl w:ilvl="4" w:tentative="1">
+      <w:start w:val="1"/>
+      <w:numFmt w:val="bullet"/>
+      <w:lvlText w:val=""/>
+      <w:lvlJc w:val="left"/>
+      <w:pPr>
+        <w:tabs>
+          <w:tab w:val="num" w:pos="3600"/>
+        </w:tabs>
+        <w:ind w:left="3600" w:hanging="360"/>
+      </w:pPr>
+      <w:rPr>
+        <w:rFonts w:ascii="Wingdings" w:hAnsi="Wingdings" w:hint="default"/>
+        <w:sz w:val="20"/>
+      </w:rPr>
+    </w:lvl>
+    <w:lvl w:ilvl="5" w:tentative="1">
+      <w:start w:val="1"/>
+      <w:numFmt w:val="bullet"/>
+      <w:lvlText w:val=""/>
+      <w:lvlJc w:val="left"/>
+      <w:pPr>
+        <w:tabs>
+          <w:tab w:val="num" w:pos="4320"/>
+        </w:tabs>
+        <w:ind w:left="4320" w:hanging="360"/>
+      </w:pPr>
+      <w:rPr>
+        <w:rFonts w:ascii="Wingdings" w:hAnsi="Wingdings" w:hint="default"/>
+        <w:sz w:val="20"/>
+      </w:rPr>
+    </w:lvl>
+    <w:lvl w:ilvl="6" w:tentative="1">
+      <w:start w:val="1"/>
+      <w:numFmt w:val="bullet"/>
+      <w:lvlText w:val=""/>
+      <w:lvlJc w:val="left"/>
+      <w:pPr>
+        <w:tabs>
+          <w:tab w:val="num" w:pos="5040"/>
+        </w:tabs>
+        <w:ind w:left="5040" w:hanging="360"/>
+      </w:pPr>
+      <w:rPr>
+        <w:rFonts w:ascii="Wingdings" w:hAnsi="Wingdings" w:hint="default"/>
+        <w:sz w:val="20"/>
+      </w:rPr>
+    </w:lvl>
+    <w:lvl w:ilvl="7" w:tentative="1">
+      <w:start w:val="1"/>
+      <w:numFmt w:val="bullet"/>
+      <w:lvlText w:val=""/>
+      <w:lvlJc w:val="left"/>
+      <w:pPr>
+        <w:tabs>
+          <w:tab w:val="num" w:pos="5760"/>
+        </w:tabs>
+        <w:ind w:left="5760" w:hanging="360"/>
+      </w:pPr>
+      <w:rPr>
+        <w:rFonts w:ascii="Wingdings" w:hAnsi="Wingdings" w:hint="default"/>
+        <w:sz w:val="20"/>
+      </w:rPr>
+    </w:lvl>
+    <w:lvl w:ilvl="8" w:tentative="1">
+      <w:start w:val="1"/>
+      <w:numFmt w:val="bullet"/>
+      <w:lvlText w:val=""/>
+      <w:lvlJc w:val="left"/>
+      <w:pPr>
+        <w:tabs>
+          <w:tab w:val="num" w:pos="6480"/>
+        </w:tabs>
+        <w:ind w:left="6480" w:hanging="360"/>
+      </w:pPr>
+      <w:rPr>
+        <w:rFonts w:ascii="Wingdings" w:hAnsi="Wingdings" w:hint="default"/>
+        <w:sz w:val="20"/>
+      </w:rPr>
+    </w:lvl>
+  </w:abstractNum>
+  <w:abstractNum w:abstractNumId="7" w15:restartNumberingAfterBreak="0">
+    <w:nsid w:val="6F28260C"/>
+    <w:multiLevelType w:val="multilevel"/>
+    <w:tmpl w:val="BA1077D2"/>
+    <w:lvl w:ilvl="0">
+      <w:start w:val="1"/>
+      <w:numFmt w:val="bullet"/>
+      <w:lvlText w:val=""/>
+      <w:lvlJc w:val="left"/>
+      <w:pPr>
+        <w:tabs>
+          <w:tab w:val="num" w:pos="720"/>
+        </w:tabs>
+        <w:ind w:left="720" w:hanging="360"/>
+      </w:pPr>
+      <w:rPr>
+        <w:rFonts w:ascii="Symbol" w:hAnsi="Symbol" w:hint="default"/>
+        <w:sz w:val="20"/>
+      </w:rPr>
+    </w:lvl>
+    <w:lvl w:ilvl="1" w:tentative="1">
+      <w:start w:val="1"/>
+      <w:numFmt w:val="bullet"/>
+      <w:lvlText w:val="o"/>
+      <w:lvlJc w:val="left"/>
+      <w:pPr>
+        <w:tabs>
+          <w:tab w:val="num" w:pos="1440"/>
+        </w:tabs>
+        <w:ind w:left="1440" w:hanging="360"/>
+      </w:pPr>
+      <w:rPr>
+        <w:rFonts w:ascii="Courier New" w:hAnsi="Courier New" w:hint="default"/>
+        <w:sz w:val="20"/>
+      </w:rPr>
+    </w:lvl>
+    <w:lvl w:ilvl="2" w:tentative="1">
+      <w:start w:val="1"/>
+      <w:numFmt w:val="bullet"/>
+      <w:lvlText w:val=""/>
+      <w:lvlJc w:val="left"/>
+      <w:pPr>
+        <w:tabs>
+          <w:tab w:val="num" w:pos="2160"/>
+        </w:tabs>
+        <w:ind w:left="2160" w:hanging="360"/>
+      </w:pPr>
+      <w:rPr>
+        <w:rFonts w:ascii="Wingdings" w:hAnsi="Wingdings" w:hint="default"/>
+        <w:sz w:val="20"/>
+      </w:rPr>
+    </w:lvl>
+    <w:lvl w:ilvl="3" w:tentative="1">
+      <w:start w:val="1"/>
+      <w:numFmt w:val="bullet"/>
+      <w:lvlText w:val=""/>
+      <w:lvlJc w:val="left"/>
+      <w:pPr>
+        <w:tabs>
+          <w:tab w:val="num" w:pos="2880"/>
+        </w:tabs>
+        <w:ind w:left="2880" w:hanging="360"/>
+      </w:pPr>
+      <w:rPr>
+        <w:rFonts w:ascii="Wingdings" w:hAnsi="Wingdings" w:hint="default"/>
+        <w:sz w:val="20"/>
+      </w:rPr>
+    </w:lvl>
+    <w:lvl w:ilvl="4" w:tentative="1">
+      <w:start w:val="1"/>
+      <w:numFmt w:val="bullet"/>
+      <w:lvlText w:val=""/>
+      <w:lvlJc w:val="left"/>
+      <w:pPr>
+        <w:tabs>
+          <w:tab w:val="num" w:pos="3600"/>
+        </w:tabs>
+        <w:ind w:left="3600" w:hanging="360"/>
+      </w:pPr>
+      <w:rPr>
+        <w:rFonts w:ascii="Wingdings" w:hAnsi="Wingdings" w:hint="default"/>
+        <w:sz w:val="20"/>
+      </w:rPr>
+    </w:lvl>
+    <w:lvl w:ilvl="5" w:tentative="1">
+      <w:start w:val="1"/>
+      <w:numFmt w:val="bullet"/>
+      <w:lvlText w:val=""/>
+      <w:lvlJc w:val="left"/>
+      <w:pPr>
+        <w:tabs>
+          <w:tab w:val="num" w:pos="4320"/>
+        </w:tabs>
+        <w:ind w:left="4320" w:hanging="360"/>
+      </w:pPr>
+      <w:rPr>
+        <w:rFonts w:ascii="Wingdings" w:hAnsi="Wingdings" w:hint="default"/>
+        <w:sz w:val="20"/>
+      </w:rPr>
+    </w:lvl>
+    <w:lvl w:ilvl="6" w:tentative="1">
+      <w:start w:val="1"/>
+      <w:numFmt w:val="bullet"/>
+      <w:lvlText w:val=""/>
+      <w:lvlJc w:val="left"/>
+      <w:pPr>
+        <w:tabs>
+          <w:tab w:val="num" w:pos="5040"/>
+        </w:tabs>
+        <w:ind w:left="5040" w:hanging="360"/>
+      </w:pPr>
+      <w:rPr>
+        <w:rFonts w:ascii="Wingdings" w:hAnsi="Wingdings" w:hint="default"/>
+        <w:sz w:val="20"/>
+      </w:rPr>
+    </w:lvl>
+    <w:lvl w:ilvl="7" w:tentative="1">
+      <w:start w:val="1"/>
+      <w:numFmt w:val="bullet"/>
+      <w:lvlText w:val=""/>
+      <w:lvlJc w:val="left"/>
+      <w:pPr>
+        <w:tabs>
+          <w:tab w:val="num" w:pos="5760"/>
+        </w:tabs>
+        <w:ind w:left="5760" w:hanging="360"/>
+      </w:pPr>
+      <w:rPr>
+        <w:rFonts w:ascii="Wingdings" w:hAnsi="Wingdings" w:hint="default"/>
+        <w:sz w:val="20"/>
+      </w:rPr>
+    </w:lvl>
+    <w:lvl w:ilvl="8" w:tentative="1">
+      <w:start w:val="1"/>
+      <w:numFmt w:val="bullet"/>
+      <w:lvlText w:val=""/>
+      <w:lvlJc w:val="left"/>
+      <w:pPr>
+        <w:tabs>
+          <w:tab w:val="num" w:pos="6480"/>
+        </w:tabs>
+        <w:ind w:left="6480" w:hanging="360"/>
+      </w:pPr>
+      <w:rPr>
+        <w:rFonts w:ascii="Wingdings" w:hAnsi="Wingdings" w:hint="default"/>
+        <w:sz w:val="20"/>
+      </w:rPr>
+    </w:lvl>
+  </w:abstractNum>
+  <w:num w:numId="1" w16cid:durableId="1009530046">
+    <w:abstractNumId w:val="3"/>
+  </w:num>
+  <w:num w:numId="2" w16cid:durableId="2076660145">
+    <w:abstractNumId w:val="0"/>
+  </w:num>
+  <w:num w:numId="3" w16cid:durableId="2133477311">
     <w:abstractNumId w:val="1"/>
   </w:num>
-  <w:num w:numId="2" w16cid:durableId="907426433">
+  <w:num w:numId="4" w16cid:durableId="1784183518">
+    <w:abstractNumId w:val="4"/>
+  </w:num>
+  <w:num w:numId="5" w16cid:durableId="1141579541">
+    <w:abstractNumId w:val="6"/>
+  </w:num>
+  <w:num w:numId="6" w16cid:durableId="1624458017">
     <w:abstractNumId w:val="2"/>
   </w:num>
-  <w:num w:numId="3" w16cid:durableId="1721053150">
-    <w:abstractNumId w:val="0"/>
+  <w:num w:numId="7" w16cid:durableId="429663946">
+    <w:abstractNumId w:val="5"/>
+  </w:num>
+  <w:num w:numId="8" w16cid:durableId="408694376">
+    <w:abstractNumId w:val="7"/>
   </w:num>
 </w:numbering>
 </file>

</xml_diff>